<commit_message>
CP0529-384 reportextension 6299 Sales - Invoice Standard ESG Sales Invoice (Word) CP0529-385 reportextension 6299 Sales - Invoice Standard ESG Sales Invoice - Blue (Word)
</commit_message>
<xml_diff>
--- a/src/Apps/W1/Sustainability/app/src/Reports/StandardESGSalesInvoiceBlueSimpleBody.docx
+++ b/src/Apps/W1/Sustainability/app/src/Reports/StandardESGSalesInvoiceBlueSimpleBody.docx
@@ -1,33 +1,29 @@
 
 <file path=word/document.xml><?xml version="1.0" encoding="utf-8"?>
-<w:document xmlns:wpc="http://schemas.microsoft.com/office/word/2010/wordprocessingCanvas" xmlns:cx="http://schemas.microsoft.com/office/drawing/2014/chartex" xmlns:cx1="http://schemas.microsoft.com/office/drawing/2015/9/8/chartex" xmlns:cx2="http://schemas.microsoft.com/office/drawing/2015/10/21/chartex" xmlns:cx3="http://schemas.microsoft.com/office/drawing/2016/5/9/chartex" xmlns:cx4="http://schemas.microsoft.com/office/drawing/2016/5/10/chartex" xmlns:cx5="http://schemas.microsoft.com/office/drawing/2016/5/11/chartex" xmlns:cx6="http://schemas.microsoft.com/office/drawing/2016/5/12/chartex" xmlns:cx7="http://schemas.microsoft.com/office/drawing/2016/5/13/chartex" xmlns:cx8="http://schemas.microsoft.com/office/drawing/2016/5/14/chartex" xmlns:mc="http://schemas.openxmlformats.org/markup-compatibility/2006" xmlns:aink="http://schemas.microsoft.com/office/drawing/2016/ink" xmlns:am3d="http://schemas.microsoft.com/office/drawing/2017/model3d" xmlns:o="urn:schemas-microsoft-com:office:office" xmlns:oel="http://schemas.microsoft.com/office/2019/extlst" xmlns:r="http://schemas.openxmlformats.org/officeDocument/2006/relationships" xmlns:m="http://schemas.openxmlformats.org/officeDocument/2006/math" xmlns:v="urn:schemas-microsoft-com:vml" xmlns:wp14="http://schemas.microsoft.com/office/word/2010/wordprocessingDrawing" xmlns:wp="http://schemas.openxmlformats.org/drawingml/2006/wordprocessingDrawing" xmlns:w10="urn:schemas-microsoft-com:office:word" xmlns:w="http://schemas.openxmlformats.org/wordprocessingml/2006/main" xmlns:w14="http://schemas.microsoft.com/office/word/2010/wordml" xmlns:w15="http://schemas.microsoft.com/office/word/2012/wordml" xmlns:w16cex="http://schemas.microsoft.com/office/word/2018/wordml/cex" xmlns:w16cid="http://schemas.microsoft.com/office/word/2016/wordml/cid" xmlns:w16="http://schemas.microsoft.com/office/word/2018/wordml" xmlns:w16du="http://schemas.microsoft.com/office/word/2023/wordml/word16du" xmlns:w16sdtdh="http://schemas.microsoft.com/office/word/2020/wordml/sdtdatahash" xmlns:w16sdtfl="http://schemas.microsoft.com/office/word/2024/wordml/sdtformatlock" xmlns:w16se="http://schemas.microsoft.com/office/word/2015/wordml/symex" xmlns:wpg="http://schemas.microsoft.com/office/word/2010/wordprocessingGroup" xmlns:wpi="http://schemas.microsoft.com/office/word/2010/wordprocessingInk" xmlns:wne="http://schemas.microsoft.com/office/word/2006/wordml" xmlns:wps="http://schemas.microsoft.com/office/word/2010/wordprocessingShape" mc:Ignorable="w14 w15 w16se w16cid w16 w16cex w16sdtdh w16sdtfl w16du wp14">
+<w:document xmlns:wpc="http://schemas.microsoft.com/office/word/2010/wordprocessingCanvas" xmlns:cx="http://schemas.microsoft.com/office/drawing/2014/chartex" xmlns:cx1="http://schemas.microsoft.com/office/drawing/2015/9/8/chartex" xmlns:cx2="http://schemas.microsoft.com/office/drawing/2015/10/21/chartex" xmlns:cx3="http://schemas.microsoft.com/office/drawing/2016/5/9/chartex" xmlns:cx4="http://schemas.microsoft.com/office/drawing/2016/5/10/chartex" xmlns:cx5="http://schemas.microsoft.com/office/drawing/2016/5/11/chartex" xmlns:cx6="http://schemas.microsoft.com/office/drawing/2016/5/12/chartex" xmlns:cx7="http://schemas.microsoft.com/office/drawing/2016/5/13/chartex" xmlns:cx8="http://schemas.microsoft.com/office/drawing/2016/5/14/chartex" xmlns:mc="http://schemas.openxmlformats.org/markup-compatibility/2006" xmlns:aink="http://schemas.microsoft.com/office/drawing/2016/ink" xmlns:am3d="http://schemas.microsoft.com/office/drawing/2017/model3d" xmlns:o="urn:schemas-microsoft-com:office:office" xmlns:oel="http://schemas.microsoft.com/office/2019/extlst" xmlns:r="http://schemas.openxmlformats.org/officeDocument/2006/relationships" xmlns:m="http://schemas.openxmlformats.org/officeDocument/2006/math" xmlns:v="urn:schemas-microsoft-com:vml" xmlns:wp14="http://schemas.microsoft.com/office/word/2010/wordprocessingDrawing" xmlns:wp="http://schemas.openxmlformats.org/drawingml/2006/wordprocessingDrawing" xmlns:w10="urn:schemas-microsoft-com:office:word" xmlns:w="http://schemas.openxmlformats.org/wordprocessingml/2006/main" xmlns:w14="http://schemas.microsoft.com/office/word/2010/wordml" xmlns:w15="http://schemas.microsoft.com/office/word/2012/wordml" xmlns:w16cei="http://schemas.microsoft.com/office/word/2026/wordml/cei" xmlns:w16cex="http://schemas.microsoft.com/office/word/2018/wordml/cex" xmlns:w16cid="http://schemas.microsoft.com/office/word/2016/wordml/cid" xmlns:w16="http://schemas.microsoft.com/office/word/2018/wordml" xmlns:w16du="http://schemas.microsoft.com/office/word/2023/wordml/word16du" xmlns:w16sdtdh="http://schemas.microsoft.com/office/word/2020/wordml/sdtdatahash" xmlns:w16sdtfl="http://schemas.microsoft.com/office/word/2024/wordml/sdtformatlock" xmlns:w16se="http://schemas.microsoft.com/office/word/2015/wordml/symex" xmlns:wpg="http://schemas.microsoft.com/office/word/2010/wordprocessingGroup" xmlns:wpi="http://schemas.microsoft.com/office/word/2010/wordprocessingInk" xmlns:wne="http://schemas.microsoft.com/office/word/2006/wordml" xmlns:wps="http://schemas.microsoft.com/office/word/2010/wordprocessingShape" mc:Ignorable="w14 w15 w16se w16cid w16 w16cex w16sdtdh w16sdtfl w16du wp14">
   <w:body>
     <w:tbl>
       <w:tblPr>
-        <w:tblW w:w="15422" w:type="dxa"/>
-        <w:tblCellMar>
-          <w:left w:w="0" w:type="dxa"/>
-          <w:right w:w="0" w:type="dxa"/>
-        </w:tblCellMar>
-        <w:tblLook w:val="04A0" w:firstRow="1" w:lastRow="0" w:firstColumn="1" w:lastColumn="0" w:noHBand="0" w:noVBand="1"/>
+        <w:tblStyle w:val="BCBlockTable"/>
+        <w:tblW w:w="5000" w:type="pct"/>
+        <w:tblLook w:val="0620" w:firstRow="1" w:lastRow="0" w:firstColumn="0" w:lastColumn="0" w:noHBand="1" w:noVBand="1"/>
         <w:tblCaption w:val="Address Block"/>
+        <w:tblDescription w:val="Layout table. Used for positioning, not for tabular data."/>
       </w:tblPr>
       <w:tblGrid>
         <w:gridCol w:w="3714"/>
-        <w:gridCol w:w="5633"/>
-        <w:gridCol w:w="6075"/>
+        <w:gridCol w:w="5634"/>
+        <w:gridCol w:w="6078"/>
       </w:tblGrid>
       <w:tr>
         <w:trPr>
+          <w:cnfStyle w:val="100000000000" w:firstRow="1" w:lastRow="0" w:firstColumn="0" w:lastColumn="0" w:oddVBand="0" w:evenVBand="0" w:oddHBand="0" w:evenHBand="0" w:firstRowFirstColumn="0" w:firstRowLastColumn="0" w:lastRowFirstColumn="0" w:lastRowLastColumn="0"/>
+          <w:cantSplit/>
           <w:trHeight w:val="302"/>
         </w:trPr>
         <w:sdt>
           <w:sdtPr>
             <w:rPr>
-              <w:rFonts w:ascii="Segoe UI Semibold" w:hAnsi="Segoe UI Semibold" w:eastAsia="Times New Roman" w:cs="Times New Roman"/>
-              <w:color w:val="242424"/>
-              <w:sz w:val="22"/>
-              <w:szCs w:val="22"/>
               <w:lang w:val="en-US" w:eastAsia="en-US"/>
             </w:rPr>
             <w:alias w:val="CustomerAddress1"/>
@@ -37,32 +33,22 @@
             <w15:color w:val="808080"/>
             <w:text/>
           </w:sdtPr>
+          <w:sdtEndPr/>
           <w:sdtContent>
             <w:tc>
               <w:tcPr>
-                <w:tcW w:w="2525" w:type="dxa"/>
+                <w:tcW w:w="1204" w:type="pct"/>
                 <w:hideMark/>
               </w:tcPr>
               <w:p>
                 <w:pPr>
-                  <w:keepNext/>
-                  <w:keepLines/>
-                  <w:spacing w:after="0" w:line="276" w:lineRule="auto"/>
-                  <w:outlineLvl w:val="0"/>
-                  <w:rPr>
-                    <w:rFonts w:ascii="Segoe UI Semibold" w:hAnsi="Segoe UI Semibold" w:eastAsia="Times New Roman" w:cs="Times New Roman"/>
-                    <w:color w:val="242424"/>
-                    <w:sz w:val="22"/>
-                    <w:szCs w:val="22"/>
+                  <w:pStyle w:val="BCLabel"/>
+                  <w:rPr>
                     <w:lang w:val="en-US" w:eastAsia="en-US"/>
                   </w:rPr>
                 </w:pPr>
                 <w:r>
                   <w:rPr>
-                    <w:rFonts w:ascii="Segoe UI Semibold" w:hAnsi="Segoe UI Semibold" w:eastAsia="Times New Roman" w:cs="Times New Roman"/>
-                    <w:color w:val="242424"/>
-                    <w:sz w:val="22"/>
-                    <w:szCs w:val="22"/>
                     <w:lang w:val="en-US" w:eastAsia="en-US"/>
                   </w:rPr>
                   <w:t>CustomerAddress1</w:t>
@@ -73,19 +59,12 @@
         </w:sdt>
         <w:tc>
           <w:tcPr>
-            <w:tcW w:w="3830" w:type="dxa"/>
+            <w:tcW w:w="1826" w:type="pct"/>
           </w:tcPr>
           <w:p>
             <w:pPr>
-              <w:keepNext/>
-              <w:keepLines/>
-              <w:spacing w:after="0" w:line="276" w:lineRule="auto"/>
-              <w:outlineLvl w:val="0"/>
+              <w:pStyle w:val="BCLabel"/>
               <w:rPr>
-                <w:rFonts w:ascii="Segoe UI Semibold" w:hAnsi="Segoe UI Semibold" w:eastAsia="Times New Roman" w:cs="Times New Roman"/>
-                <w:color w:val="242424"/>
-                <w:sz w:val="22"/>
-                <w:szCs w:val="22"/>
                 <w:lang w:val="en-US" w:eastAsia="en-US"/>
               </w:rPr>
             </w:pPr>
@@ -94,10 +73,6 @@
         <w:sdt>
           <w:sdtPr>
             <w:rPr>
-              <w:rFonts w:ascii="Segoe UI Semibold" w:hAnsi="Segoe UI Semibold" w:eastAsia="Times New Roman" w:cs="Times New Roman"/>
-              <w:color w:val="242424"/>
-              <w:sz w:val="22"/>
-              <w:szCs w:val="22"/>
               <w:lang w:val="en-US" w:eastAsia="en-US"/>
             </w:rPr>
             <w:alias w:val="CompanyAddress1"/>
@@ -107,33 +82,23 @@
             <w15:color w:val="808080"/>
             <w:text/>
           </w:sdtPr>
+          <w:sdtEndPr/>
           <w:sdtContent>
             <w:tc>
               <w:tcPr>
-                <w:tcW w:w="4130" w:type="dxa"/>
+                <w:tcW w:w="1970" w:type="pct"/>
                 <w:hideMark/>
               </w:tcPr>
               <w:p>
                 <w:pPr>
-                  <w:keepNext/>
-                  <w:keepLines/>
-                  <w:spacing w:after="0" w:line="276" w:lineRule="auto"/>
+                  <w:pStyle w:val="BCLabelNumber"/>
                   <w:jc w:val="right"/>
-                  <w:outlineLvl w:val="0"/>
-                  <w:rPr>
-                    <w:rFonts w:ascii="Segoe UI Semibold" w:hAnsi="Segoe UI Semibold" w:eastAsia="Times New Roman" w:cs="Times New Roman"/>
-                    <w:color w:val="242424"/>
-                    <w:sz w:val="22"/>
-                    <w:szCs w:val="22"/>
+                  <w:rPr>
                     <w:lang w:val="en-US" w:eastAsia="en-US"/>
                   </w:rPr>
                 </w:pPr>
                 <w:r>
                   <w:rPr>
-                    <w:rFonts w:ascii="Segoe UI Semibold" w:hAnsi="Segoe UI Semibold" w:eastAsia="Times New Roman" w:cs="Times New Roman"/>
-                    <w:color w:val="242424"/>
-                    <w:sz w:val="22"/>
-                    <w:szCs w:val="22"/>
                     <w:lang w:val="en-US" w:eastAsia="en-US"/>
                   </w:rPr>
                   <w:t>CompanyAddress1</w:t>
@@ -145,15 +110,12 @@
       </w:tr>
       <w:tr>
         <w:trPr>
+          <w:cantSplit/>
           <w:trHeight w:val="274"/>
         </w:trPr>
         <w:sdt>
           <w:sdtPr>
             <w:rPr>
-              <w:rFonts w:ascii="Segoe UI" w:hAnsi="Segoe UI" w:eastAsia="Times New Roman" w:cs="Times New Roman"/>
-              <w:color w:val="242424"/>
-              <w:sz w:val="22"/>
-              <w:szCs w:val="22"/>
               <w:lang w:val="en-US" w:eastAsia="en-US"/>
             </w:rPr>
             <w:alias w:val="CustomerAddress2"/>
@@ -163,29 +125,22 @@
             <w15:color w:val="808080"/>
             <w:text/>
           </w:sdtPr>
+          <w:sdtEndPr/>
           <w:sdtContent>
             <w:tc>
               <w:tcPr>
-                <w:tcW w:w="2525" w:type="dxa"/>
+                <w:tcW w:w="1204" w:type="pct"/>
                 <w:hideMark/>
               </w:tcPr>
               <w:p>
                 <w:pPr>
-                  <w:spacing w:after="0" w:line="240" w:lineRule="auto"/>
-                  <w:rPr>
-                    <w:rFonts w:ascii="Segoe UI" w:hAnsi="Segoe UI" w:eastAsia="Times New Roman" w:cs="Times New Roman"/>
-                    <w:color w:val="242424"/>
-                    <w:sz w:val="22"/>
-                    <w:szCs w:val="22"/>
+                  <w:pStyle w:val="NoSpacing"/>
+                  <w:rPr>
                     <w:lang w:val="en-US" w:eastAsia="en-US"/>
                   </w:rPr>
                 </w:pPr>
                 <w:r>
                   <w:rPr>
-                    <w:rFonts w:ascii="Segoe UI" w:hAnsi="Segoe UI" w:eastAsia="Times New Roman" w:cs="Times New Roman"/>
-                    <w:color w:val="242424"/>
-                    <w:sz w:val="22"/>
-                    <w:szCs w:val="22"/>
                     <w:lang w:val="en-US" w:eastAsia="en-US"/>
                   </w:rPr>
                   <w:t>CustomerAddress2</w:t>
@@ -196,16 +151,12 @@
         </w:sdt>
         <w:tc>
           <w:tcPr>
-            <w:tcW w:w="3830" w:type="dxa"/>
+            <w:tcW w:w="1826" w:type="pct"/>
           </w:tcPr>
           <w:p>
             <w:pPr>
-              <w:spacing w:after="0" w:line="240" w:lineRule="auto"/>
+              <w:pStyle w:val="NoSpacing"/>
               <w:rPr>
-                <w:rFonts w:ascii="Segoe UI" w:hAnsi="Segoe UI" w:eastAsia="Times New Roman" w:cs="Times New Roman"/>
-                <w:color w:val="242424"/>
-                <w:sz w:val="22"/>
-                <w:szCs w:val="22"/>
                 <w:lang w:val="en-US" w:eastAsia="en-US"/>
               </w:rPr>
             </w:pPr>
@@ -214,10 +165,6 @@
         <w:sdt>
           <w:sdtPr>
             <w:rPr>
-              <w:rFonts w:ascii="Segoe UI" w:hAnsi="Segoe UI" w:eastAsia="Times New Roman" w:cs="Times New Roman"/>
-              <w:color w:val="242424"/>
-              <w:sz w:val="22"/>
-              <w:szCs w:val="22"/>
               <w:lang w:val="en-US" w:eastAsia="en-US"/>
             </w:rPr>
             <w:alias w:val="CompanyAddress2"/>
@@ -227,29 +174,22 @@
             <w15:color w:val="808080"/>
             <w:text/>
           </w:sdtPr>
+          <w:sdtEndPr/>
           <w:sdtContent>
             <w:tc>
               <w:tcPr>
-                <w:tcW w:w="4130" w:type="dxa"/>
+                <w:tcW w:w="1970" w:type="pct"/>
               </w:tcPr>
               <w:p>
                 <w:pPr>
-                  <w:spacing w:after="0" w:line="240" w:lineRule="auto"/>
+                  <w:pStyle w:val="BCNumber"/>
                   <w:jc w:val="right"/>
                   <w:rPr>
-                    <w:rFonts w:ascii="Segoe UI" w:hAnsi="Segoe UI" w:eastAsia="Times New Roman" w:cs="Times New Roman"/>
-                    <w:color w:val="242424"/>
-                    <w:sz w:val="22"/>
-                    <w:szCs w:val="22"/>
                     <w:lang w:val="en-US" w:eastAsia="en-US"/>
                   </w:rPr>
                 </w:pPr>
                 <w:r>
                   <w:rPr>
-                    <w:rFonts w:ascii="Segoe UI" w:hAnsi="Segoe UI" w:eastAsia="Times New Roman" w:cs="Times New Roman"/>
-                    <w:color w:val="242424"/>
-                    <w:sz w:val="22"/>
-                    <w:szCs w:val="22"/>
                     <w:lang w:val="en-US" w:eastAsia="en-US"/>
                   </w:rPr>
                   <w:t>CompanyAddress2</w:t>
@@ -261,15 +201,12 @@
       </w:tr>
       <w:tr>
         <w:trPr>
+          <w:cantSplit/>
           <w:trHeight w:val="274"/>
         </w:trPr>
         <w:sdt>
           <w:sdtPr>
             <w:rPr>
-              <w:rFonts w:ascii="Segoe UI" w:hAnsi="Segoe UI" w:eastAsia="Times New Roman" w:cs="Times New Roman"/>
-              <w:color w:val="242424"/>
-              <w:sz w:val="22"/>
-              <w:szCs w:val="22"/>
               <w:lang w:val="en-US" w:eastAsia="en-US"/>
             </w:rPr>
             <w:alias w:val="CustomerAddress3"/>
@@ -279,29 +216,22 @@
             <w15:color w:val="808080"/>
             <w:text/>
           </w:sdtPr>
+          <w:sdtEndPr/>
           <w:sdtContent>
             <w:tc>
               <w:tcPr>
-                <w:tcW w:w="2525" w:type="dxa"/>
+                <w:tcW w:w="1204" w:type="pct"/>
                 <w:hideMark/>
               </w:tcPr>
               <w:p>
                 <w:pPr>
-                  <w:spacing w:after="0" w:line="240" w:lineRule="auto"/>
-                  <w:rPr>
-                    <w:rFonts w:ascii="Segoe UI" w:hAnsi="Segoe UI" w:eastAsia="Times New Roman" w:cs="Times New Roman"/>
-                    <w:color w:val="242424"/>
-                    <w:sz w:val="22"/>
-                    <w:szCs w:val="22"/>
+                  <w:pStyle w:val="NoSpacing"/>
+                  <w:rPr>
                     <w:lang w:val="en-US" w:eastAsia="en-US"/>
                   </w:rPr>
                 </w:pPr>
                 <w:r>
                   <w:rPr>
-                    <w:rFonts w:ascii="Segoe UI" w:hAnsi="Segoe UI" w:eastAsia="Times New Roman" w:cs="Times New Roman"/>
-                    <w:color w:val="242424"/>
-                    <w:sz w:val="22"/>
-                    <w:szCs w:val="22"/>
                     <w:lang w:val="en-US" w:eastAsia="en-US"/>
                   </w:rPr>
                   <w:t>CustomerAddress3</w:t>
@@ -312,16 +242,12 @@
         </w:sdt>
         <w:tc>
           <w:tcPr>
-            <w:tcW w:w="3830" w:type="dxa"/>
+            <w:tcW w:w="1826" w:type="pct"/>
           </w:tcPr>
           <w:p>
             <w:pPr>
-              <w:spacing w:after="0" w:line="240" w:lineRule="auto"/>
+              <w:pStyle w:val="NoSpacing"/>
               <w:rPr>
-                <w:rFonts w:ascii="Segoe UI" w:hAnsi="Segoe UI" w:eastAsia="Times New Roman" w:cs="Times New Roman"/>
-                <w:color w:val="242424"/>
-                <w:sz w:val="22"/>
-                <w:szCs w:val="22"/>
                 <w:lang w:val="en-US" w:eastAsia="en-US"/>
               </w:rPr>
             </w:pPr>
@@ -330,10 +256,6 @@
         <w:sdt>
           <w:sdtPr>
             <w:rPr>
-              <w:rFonts w:ascii="Segoe UI" w:hAnsi="Segoe UI" w:eastAsia="Times New Roman" w:cs="Times New Roman"/>
-              <w:color w:val="242424"/>
-              <w:sz w:val="22"/>
-              <w:szCs w:val="22"/>
               <w:lang w:val="en-US" w:eastAsia="en-US"/>
             </w:rPr>
             <w:alias w:val="CompanyAddress3"/>
@@ -343,29 +265,22 @@
             <w15:color w:val="808080"/>
             <w:text/>
           </w:sdtPr>
+          <w:sdtEndPr/>
           <w:sdtContent>
             <w:tc>
               <w:tcPr>
-                <w:tcW w:w="4130" w:type="dxa"/>
+                <w:tcW w:w="1970" w:type="pct"/>
               </w:tcPr>
               <w:p>
                 <w:pPr>
-                  <w:spacing w:after="0" w:line="240" w:lineRule="auto"/>
+                  <w:pStyle w:val="BCNumber"/>
                   <w:jc w:val="right"/>
                   <w:rPr>
-                    <w:rFonts w:ascii="Segoe UI" w:hAnsi="Segoe UI" w:eastAsia="Times New Roman" w:cs="Times New Roman"/>
-                    <w:color w:val="242424"/>
-                    <w:sz w:val="22"/>
-                    <w:szCs w:val="22"/>
                     <w:lang w:val="en-US" w:eastAsia="en-US"/>
                   </w:rPr>
                 </w:pPr>
                 <w:r>
                   <w:rPr>
-                    <w:rFonts w:ascii="Segoe UI" w:hAnsi="Segoe UI" w:eastAsia="Times New Roman" w:cs="Times New Roman"/>
-                    <w:color w:val="242424"/>
-                    <w:sz w:val="22"/>
-                    <w:szCs w:val="22"/>
                     <w:lang w:val="en-US" w:eastAsia="en-US"/>
                   </w:rPr>
                   <w:t>CompanyAddress3</w:t>
@@ -377,15 +292,12 @@
       </w:tr>
       <w:tr>
         <w:trPr>
+          <w:cantSplit/>
           <w:trHeight w:val="274"/>
         </w:trPr>
         <w:sdt>
           <w:sdtPr>
             <w:rPr>
-              <w:rFonts w:ascii="Segoe UI" w:hAnsi="Segoe UI" w:eastAsia="Times New Roman" w:cs="Times New Roman"/>
-              <w:color w:val="242424"/>
-              <w:sz w:val="22"/>
-              <w:szCs w:val="22"/>
               <w:lang w:val="en-US" w:eastAsia="en-US"/>
             </w:rPr>
             <w:alias w:val="CustomerAddress4"/>
@@ -395,29 +307,22 @@
             <w15:color w:val="808080"/>
             <w:text/>
           </w:sdtPr>
+          <w:sdtEndPr/>
           <w:sdtContent>
             <w:tc>
               <w:tcPr>
-                <w:tcW w:w="2525" w:type="dxa"/>
+                <w:tcW w:w="1204" w:type="pct"/>
                 <w:hideMark/>
               </w:tcPr>
               <w:p>
                 <w:pPr>
-                  <w:spacing w:after="0" w:line="240" w:lineRule="auto"/>
-                  <w:rPr>
-                    <w:rFonts w:ascii="Segoe UI" w:hAnsi="Segoe UI" w:eastAsia="Times New Roman" w:cs="Times New Roman"/>
-                    <w:color w:val="242424"/>
-                    <w:sz w:val="22"/>
-                    <w:szCs w:val="22"/>
+                  <w:pStyle w:val="NoSpacing"/>
+                  <w:rPr>
                     <w:lang w:val="en-US" w:eastAsia="en-US"/>
                   </w:rPr>
                 </w:pPr>
                 <w:r>
                   <w:rPr>
-                    <w:rFonts w:ascii="Segoe UI" w:hAnsi="Segoe UI" w:eastAsia="Times New Roman" w:cs="Times New Roman"/>
-                    <w:color w:val="242424"/>
-                    <w:sz w:val="22"/>
-                    <w:szCs w:val="22"/>
                     <w:lang w:val="en-US" w:eastAsia="en-US"/>
                   </w:rPr>
                   <w:t>CustomerAddress4</w:t>
@@ -428,16 +333,12 @@
         </w:sdt>
         <w:tc>
           <w:tcPr>
-            <w:tcW w:w="3830" w:type="dxa"/>
+            <w:tcW w:w="1826" w:type="pct"/>
           </w:tcPr>
           <w:p>
             <w:pPr>
-              <w:spacing w:after="0" w:line="240" w:lineRule="auto"/>
+              <w:pStyle w:val="NoSpacing"/>
               <w:rPr>
-                <w:rFonts w:ascii="Segoe UI" w:hAnsi="Segoe UI" w:eastAsia="Times New Roman" w:cs="Times New Roman"/>
-                <w:color w:val="242424"/>
-                <w:sz w:val="22"/>
-                <w:szCs w:val="22"/>
                 <w:lang w:val="en-US" w:eastAsia="en-US"/>
               </w:rPr>
             </w:pPr>
@@ -446,10 +347,6 @@
         <w:sdt>
           <w:sdtPr>
             <w:rPr>
-              <w:rFonts w:ascii="Segoe UI" w:hAnsi="Segoe UI" w:eastAsia="Times New Roman" w:cs="Times New Roman"/>
-              <w:color w:val="242424"/>
-              <w:sz w:val="22"/>
-              <w:szCs w:val="22"/>
               <w:lang w:val="en-US" w:eastAsia="en-US"/>
             </w:rPr>
             <w:alias w:val="CompanyAddress4"/>
@@ -459,29 +356,22 @@
             <w15:color w:val="808080"/>
             <w:text/>
           </w:sdtPr>
+          <w:sdtEndPr/>
           <w:sdtContent>
             <w:tc>
               <w:tcPr>
-                <w:tcW w:w="4130" w:type="dxa"/>
+                <w:tcW w:w="1970" w:type="pct"/>
               </w:tcPr>
               <w:p>
                 <w:pPr>
-                  <w:spacing w:after="0" w:line="240" w:lineRule="auto"/>
+                  <w:pStyle w:val="BCNumber"/>
                   <w:jc w:val="right"/>
                   <w:rPr>
-                    <w:rFonts w:ascii="Segoe UI" w:hAnsi="Segoe UI" w:eastAsia="Times New Roman" w:cs="Times New Roman"/>
-                    <w:color w:val="242424"/>
-                    <w:sz w:val="22"/>
-                    <w:szCs w:val="22"/>
                     <w:lang w:val="en-US" w:eastAsia="en-US"/>
                   </w:rPr>
                 </w:pPr>
                 <w:r>
                   <w:rPr>
-                    <w:rFonts w:ascii="Segoe UI" w:hAnsi="Segoe UI" w:eastAsia="Times New Roman" w:cs="Times New Roman"/>
-                    <w:color w:val="242424"/>
-                    <w:sz w:val="22"/>
-                    <w:szCs w:val="22"/>
                     <w:lang w:val="en-US" w:eastAsia="en-US"/>
                   </w:rPr>
                   <w:t>CompanyAddress4</w:t>
@@ -493,15 +383,12 @@
       </w:tr>
       <w:tr>
         <w:trPr>
+          <w:cantSplit/>
           <w:trHeight w:val="274"/>
         </w:trPr>
         <w:sdt>
           <w:sdtPr>
             <w:rPr>
-              <w:rFonts w:ascii="Segoe UI" w:hAnsi="Segoe UI" w:eastAsia="Times New Roman" w:cs="Times New Roman"/>
-              <w:color w:val="242424"/>
-              <w:sz w:val="22"/>
-              <w:szCs w:val="22"/>
               <w:lang w:val="en-US" w:eastAsia="en-US"/>
             </w:rPr>
             <w:alias w:val="CustomerAddress5"/>
@@ -511,29 +398,22 @@
             <w15:color w:val="808080"/>
             <w:text/>
           </w:sdtPr>
+          <w:sdtEndPr/>
           <w:sdtContent>
             <w:tc>
               <w:tcPr>
-                <w:tcW w:w="2525" w:type="dxa"/>
+                <w:tcW w:w="1204" w:type="pct"/>
                 <w:hideMark/>
               </w:tcPr>
               <w:p>
                 <w:pPr>
-                  <w:spacing w:after="0" w:line="240" w:lineRule="auto"/>
-                  <w:rPr>
-                    <w:rFonts w:ascii="Segoe UI" w:hAnsi="Segoe UI" w:eastAsia="Times New Roman" w:cs="Times New Roman"/>
-                    <w:color w:val="242424"/>
-                    <w:sz w:val="22"/>
-                    <w:szCs w:val="22"/>
+                  <w:pStyle w:val="NoSpacing"/>
+                  <w:rPr>
                     <w:lang w:val="en-US" w:eastAsia="en-US"/>
                   </w:rPr>
                 </w:pPr>
                 <w:r>
                   <w:rPr>
-                    <w:rFonts w:ascii="Segoe UI" w:hAnsi="Segoe UI" w:eastAsia="Times New Roman" w:cs="Times New Roman"/>
-                    <w:color w:val="242424"/>
-                    <w:sz w:val="22"/>
-                    <w:szCs w:val="22"/>
                     <w:lang w:val="en-US" w:eastAsia="en-US"/>
                   </w:rPr>
                   <w:t>CustomerAddress5</w:t>
@@ -544,16 +424,12 @@
         </w:sdt>
         <w:tc>
           <w:tcPr>
-            <w:tcW w:w="3830" w:type="dxa"/>
+            <w:tcW w:w="1826" w:type="pct"/>
           </w:tcPr>
           <w:p>
             <w:pPr>
-              <w:spacing w:after="0" w:line="240" w:lineRule="auto"/>
+              <w:pStyle w:val="NoSpacing"/>
               <w:rPr>
-                <w:rFonts w:ascii="Segoe UI" w:hAnsi="Segoe UI" w:eastAsia="Times New Roman" w:cs="Times New Roman"/>
-                <w:color w:val="242424"/>
-                <w:sz w:val="22"/>
-                <w:szCs w:val="22"/>
                 <w:lang w:val="en-US" w:eastAsia="en-US"/>
               </w:rPr>
             </w:pPr>
@@ -562,10 +438,6 @@
         <w:sdt>
           <w:sdtPr>
             <w:rPr>
-              <w:rFonts w:ascii="Segoe UI" w:hAnsi="Segoe UI" w:eastAsia="Times New Roman" w:cs="Times New Roman"/>
-              <w:color w:val="242424"/>
-              <w:sz w:val="22"/>
-              <w:szCs w:val="22"/>
               <w:lang w:val="en-US" w:eastAsia="en-US"/>
             </w:rPr>
             <w:alias w:val="CompanyAddress5"/>
@@ -575,29 +447,22 @@
             <w15:color w:val="808080"/>
             <w:text/>
           </w:sdtPr>
+          <w:sdtEndPr/>
           <w:sdtContent>
             <w:tc>
               <w:tcPr>
-                <w:tcW w:w="4130" w:type="dxa"/>
+                <w:tcW w:w="1970" w:type="pct"/>
               </w:tcPr>
               <w:p>
                 <w:pPr>
-                  <w:spacing w:after="0" w:line="240" w:lineRule="auto"/>
+                  <w:pStyle w:val="BCNumber"/>
                   <w:jc w:val="right"/>
                   <w:rPr>
-                    <w:rFonts w:ascii="Segoe UI" w:hAnsi="Segoe UI" w:eastAsia="Times New Roman" w:cs="Times New Roman"/>
-                    <w:color w:val="242424"/>
-                    <w:sz w:val="22"/>
-                    <w:szCs w:val="22"/>
                     <w:lang w:val="en-US" w:eastAsia="en-US"/>
                   </w:rPr>
                 </w:pPr>
                 <w:r>
                   <w:rPr>
-                    <w:rFonts w:ascii="Segoe UI" w:hAnsi="Segoe UI" w:eastAsia="Times New Roman" w:cs="Times New Roman"/>
-                    <w:color w:val="242424"/>
-                    <w:sz w:val="22"/>
-                    <w:szCs w:val="22"/>
                     <w:lang w:val="en-US" w:eastAsia="en-US"/>
                   </w:rPr>
                   <w:t>CompanyAddress5</w:t>
@@ -609,31 +474,24 @@
       </w:tr>
       <w:tr>
         <w:trPr>
+          <w:cantSplit/>
           <w:trHeight w:val="274"/>
         </w:trPr>
         <w:tc>
           <w:tcPr>
-            <w:tcW w:w="2525" w:type="dxa"/>
+            <w:tcW w:w="1204" w:type="pct"/>
             <w:hideMark/>
           </w:tcPr>
           <w:p>
             <w:pPr>
-              <w:spacing w:after="0" w:line="240" w:lineRule="auto"/>
+              <w:pStyle w:val="NoSpacing"/>
               <w:rPr>
-                <w:rFonts w:ascii="Segoe UI" w:hAnsi="Segoe UI" w:eastAsia="Times New Roman" w:cs="Times New Roman"/>
-                <w:color w:val="242424"/>
-                <w:sz w:val="22"/>
-                <w:szCs w:val="22"/>
                 <w:lang w:val="en-US" w:eastAsia="en-US"/>
               </w:rPr>
             </w:pPr>
             <w:sdt>
               <w:sdtPr>
                 <w:rPr>
-                  <w:rFonts w:ascii="Segoe UI" w:hAnsi="Segoe UI" w:eastAsia="Times New Roman" w:cs="Times New Roman"/>
-                  <w:color w:val="242424"/>
-                  <w:sz w:val="22"/>
-                  <w:szCs w:val="22"/>
                   <w:lang w:val="en-US" w:eastAsia="en-US"/>
                 </w:rPr>
                 <w:alias w:val="CustomerAddress6"/>
@@ -643,13 +501,10 @@
                 <w15:color w:val="808080"/>
                 <w:text/>
               </w:sdtPr>
+              <w:sdtEndPr/>
               <w:sdtContent>
                 <w:r>
                   <w:rPr>
-                    <w:rFonts w:ascii="Segoe UI" w:hAnsi="Segoe UI" w:eastAsia="Times New Roman" w:cs="Times New Roman"/>
-                    <w:color w:val="242424"/>
-                    <w:sz w:val="22"/>
-                    <w:szCs w:val="22"/>
                     <w:lang w:val="en-US" w:eastAsia="en-US"/>
                   </w:rPr>
                   <w:t>CustomerAddress6</w:t>
@@ -660,16 +515,12 @@
         </w:tc>
         <w:tc>
           <w:tcPr>
-            <w:tcW w:w="3830" w:type="dxa"/>
+            <w:tcW w:w="1826" w:type="pct"/>
           </w:tcPr>
           <w:p>
             <w:pPr>
-              <w:spacing w:after="0" w:line="240" w:lineRule="auto"/>
+              <w:pStyle w:val="NoSpacing"/>
               <w:rPr>
-                <w:rFonts w:ascii="Segoe UI" w:hAnsi="Segoe UI" w:eastAsia="Times New Roman" w:cs="Times New Roman"/>
-                <w:color w:val="242424"/>
-                <w:sz w:val="22"/>
-                <w:szCs w:val="22"/>
                 <w:lang w:val="en-US" w:eastAsia="en-US"/>
               </w:rPr>
             </w:pPr>
@@ -678,10 +529,6 @@
         <w:sdt>
           <w:sdtPr>
             <w:rPr>
-              <w:rFonts w:ascii="Segoe UI" w:hAnsi="Segoe UI" w:eastAsia="Times New Roman" w:cs="Times New Roman"/>
-              <w:color w:val="242424"/>
-              <w:sz w:val="22"/>
-              <w:szCs w:val="22"/>
               <w:lang w:val="en-US" w:eastAsia="en-US"/>
             </w:rPr>
             <w:alias w:val="CompanyAddress6"/>
@@ -691,29 +538,22 @@
             <w15:color w:val="808080"/>
             <w:text/>
           </w:sdtPr>
+          <w:sdtEndPr/>
           <w:sdtContent>
             <w:tc>
               <w:tcPr>
-                <w:tcW w:w="4130" w:type="dxa"/>
+                <w:tcW w:w="1970" w:type="pct"/>
               </w:tcPr>
               <w:p>
                 <w:pPr>
-                  <w:spacing w:after="0" w:line="240" w:lineRule="auto"/>
+                  <w:pStyle w:val="BCNumber"/>
                   <w:jc w:val="right"/>
                   <w:rPr>
-                    <w:rFonts w:ascii="Segoe UI" w:hAnsi="Segoe UI" w:eastAsia="Times New Roman" w:cs="Times New Roman"/>
-                    <w:color w:val="242424"/>
-                    <w:sz w:val="22"/>
-                    <w:szCs w:val="22"/>
                     <w:lang w:val="en-US" w:eastAsia="en-US"/>
                   </w:rPr>
                 </w:pPr>
                 <w:r>
                   <w:rPr>
-                    <w:rFonts w:ascii="Segoe UI" w:hAnsi="Segoe UI" w:eastAsia="Times New Roman" w:cs="Times New Roman"/>
-                    <w:color w:val="242424"/>
-                    <w:sz w:val="22"/>
-                    <w:szCs w:val="22"/>
                     <w:lang w:val="en-US" w:eastAsia="en-US"/>
                   </w:rPr>
                   <w:t>CompanyAddress6</w:t>
@@ -725,15 +565,12 @@
       </w:tr>
       <w:tr>
         <w:trPr>
+          <w:cantSplit/>
           <w:trHeight w:val="274"/>
         </w:trPr>
         <w:sdt>
           <w:sdtPr>
             <w:rPr>
-              <w:rFonts w:ascii="Segoe UI" w:hAnsi="Segoe UI" w:eastAsia="Times New Roman" w:cs="Times New Roman"/>
-              <w:color w:val="242424"/>
-              <w:sz w:val="22"/>
-              <w:szCs w:val="22"/>
               <w:lang w:val="en-US" w:eastAsia="en-US"/>
             </w:rPr>
             <w:alias w:val="CustomerAddress7"/>
@@ -743,28 +580,21 @@
             <w15:color w:val="808080"/>
             <w:text/>
           </w:sdtPr>
+          <w:sdtEndPr/>
           <w:sdtContent>
             <w:tc>
               <w:tcPr>
-                <w:tcW w:w="2525" w:type="dxa"/>
+                <w:tcW w:w="1204" w:type="pct"/>
               </w:tcPr>
               <w:p>
                 <w:pPr>
-                  <w:spacing w:after="0" w:line="240" w:lineRule="auto"/>
-                  <w:rPr>
-                    <w:rFonts w:ascii="Segoe UI" w:hAnsi="Segoe UI" w:eastAsia="Times New Roman" w:cs="Times New Roman"/>
-                    <w:color w:val="242424"/>
-                    <w:sz w:val="22"/>
-                    <w:szCs w:val="22"/>
+                  <w:pStyle w:val="NoSpacing"/>
+                  <w:rPr>
                     <w:lang w:val="en-US" w:eastAsia="en-US"/>
                   </w:rPr>
                 </w:pPr>
                 <w:r>
                   <w:rPr>
-                    <w:rFonts w:ascii="Segoe UI" w:hAnsi="Segoe UI" w:eastAsia="Times New Roman" w:cs="Times New Roman"/>
-                    <w:color w:val="242424"/>
-                    <w:sz w:val="22"/>
-                    <w:szCs w:val="22"/>
                     <w:lang w:val="en-US" w:eastAsia="en-US"/>
                   </w:rPr>
                   <w:t>CustomerAddress7</w:t>
@@ -775,16 +605,12 @@
         </w:sdt>
         <w:tc>
           <w:tcPr>
-            <w:tcW w:w="3830" w:type="dxa"/>
+            <w:tcW w:w="1826" w:type="pct"/>
           </w:tcPr>
           <w:p>
             <w:pPr>
-              <w:spacing w:after="0" w:line="240" w:lineRule="auto"/>
+              <w:pStyle w:val="NoSpacing"/>
               <w:rPr>
-                <w:rFonts w:ascii="Segoe UI" w:hAnsi="Segoe UI" w:eastAsia="Times New Roman" w:cs="Times New Roman"/>
-                <w:color w:val="242424"/>
-                <w:sz w:val="22"/>
-                <w:szCs w:val="22"/>
                 <w:lang w:val="en-US" w:eastAsia="en-US"/>
               </w:rPr>
             </w:pPr>
@@ -793,10 +619,6 @@
         <w:sdt>
           <w:sdtPr>
             <w:rPr>
-              <w:rFonts w:ascii="Segoe UI" w:hAnsi="Segoe UI" w:eastAsia="Times New Roman" w:cs="Times New Roman"/>
-              <w:color w:val="242424"/>
-              <w:sz w:val="22"/>
-              <w:szCs w:val="22"/>
               <w:lang w:val="en-US" w:eastAsia="en-US"/>
             </w:rPr>
             <w:alias w:val="CompanyLegalOffice_Lbl"/>
@@ -806,30 +628,23 @@
             <w15:color w:val="808080"/>
             <w:text/>
           </w:sdtPr>
+          <w:sdtEndPr/>
           <w:sdtContent>
             <w:tc>
               <w:tcPr>
-                <w:tcW w:w="4130" w:type="dxa"/>
+                <w:tcW w:w="1970" w:type="pct"/>
               </w:tcPr>
               <w:p>
                 <w:pPr>
-                  <w:spacing w:after="0" w:line="240" w:lineRule="auto"/>
+                  <w:pStyle w:val="BCNumber"/>
                   <w:jc w:val="right"/>
                   <w:rPr>
-                    <w:rFonts w:ascii="Segoe UI" w:hAnsi="Segoe UI" w:eastAsia="Times New Roman" w:cs="Times New Roman"/>
-                    <w:color w:val="242424"/>
-                    <w:sz w:val="22"/>
-                    <w:szCs w:val="22"/>
                     <w:lang w:val="en-US" w:eastAsia="en-US"/>
                   </w:rPr>
                 </w:pPr>
                 <w:proofErr w:type="spellStart"/>
                 <w:r>
                   <w:rPr>
-                    <w:rFonts w:ascii="Segoe UI" w:hAnsi="Segoe UI" w:eastAsia="Times New Roman" w:cs="Times New Roman"/>
-                    <w:color w:val="242424"/>
-                    <w:sz w:val="22"/>
-                    <w:szCs w:val="22"/>
                     <w:lang w:val="en-US" w:eastAsia="en-US"/>
                   </w:rPr>
                   <w:t>CompanyLegalOffice_Lbl</w:t>
@@ -842,15 +657,12 @@
       </w:tr>
       <w:tr>
         <w:trPr>
+          <w:cantSplit/>
           <w:trHeight w:val="274"/>
         </w:trPr>
         <w:sdt>
           <w:sdtPr>
             <w:rPr>
-              <w:rFonts w:ascii="Segoe UI" w:hAnsi="Segoe UI" w:eastAsia="Times New Roman" w:cs="Times New Roman"/>
-              <w:color w:val="242424"/>
-              <w:sz w:val="22"/>
-              <w:szCs w:val="22"/>
               <w:lang w:val="en-US" w:eastAsia="en-US"/>
             </w:rPr>
             <w:alias w:val="CustomerAddress8"/>
@@ -860,28 +672,21 @@
             <w15:color w:val="808080"/>
             <w:text/>
           </w:sdtPr>
+          <w:sdtEndPr/>
           <w:sdtContent>
             <w:tc>
               <w:tcPr>
-                <w:tcW w:w="2525" w:type="dxa"/>
+                <w:tcW w:w="1204" w:type="pct"/>
               </w:tcPr>
               <w:p>
                 <w:pPr>
-                  <w:spacing w:after="0" w:line="240" w:lineRule="auto"/>
-                  <w:rPr>
-                    <w:rFonts w:ascii="Segoe UI" w:hAnsi="Segoe UI" w:eastAsia="Times New Roman" w:cs="Times New Roman"/>
-                    <w:color w:val="242424"/>
-                    <w:sz w:val="22"/>
-                    <w:szCs w:val="22"/>
+                  <w:pStyle w:val="NoSpacing"/>
+                  <w:rPr>
                     <w:lang w:val="en-US" w:eastAsia="en-US"/>
                   </w:rPr>
                 </w:pPr>
                 <w:r>
                   <w:rPr>
-                    <w:rFonts w:ascii="Segoe UI" w:hAnsi="Segoe UI" w:eastAsia="Times New Roman" w:cs="Times New Roman"/>
-                    <w:color w:val="242424"/>
-                    <w:sz w:val="22"/>
-                    <w:szCs w:val="22"/>
                     <w:lang w:val="en-US" w:eastAsia="en-US"/>
                   </w:rPr>
                   <w:t>CustomerAddress8</w:t>
@@ -892,16 +697,12 @@
         </w:sdt>
         <w:tc>
           <w:tcPr>
-            <w:tcW w:w="3830" w:type="dxa"/>
+            <w:tcW w:w="1826" w:type="pct"/>
           </w:tcPr>
           <w:p>
             <w:pPr>
-              <w:spacing w:after="0" w:line="240" w:lineRule="auto"/>
+              <w:pStyle w:val="NoSpacing"/>
               <w:rPr>
-                <w:rFonts w:ascii="Segoe UI" w:hAnsi="Segoe UI" w:eastAsia="Times New Roman" w:cs="Times New Roman"/>
-                <w:color w:val="242424"/>
-                <w:sz w:val="22"/>
-                <w:szCs w:val="22"/>
                 <w:lang w:val="en-US" w:eastAsia="en-US"/>
               </w:rPr>
             </w:pPr>
@@ -910,10 +711,6 @@
         <w:sdt>
           <w:sdtPr>
             <w:rPr>
-              <w:rFonts w:ascii="Segoe UI" w:hAnsi="Segoe UI" w:eastAsia="Times New Roman" w:cs="Times New Roman"/>
-              <w:color w:val="242424"/>
-              <w:sz w:val="22"/>
-              <w:szCs w:val="22"/>
               <w:lang w:val="en-US" w:eastAsia="en-US"/>
             </w:rPr>
             <w:alias w:val="CompanyLegalOffice"/>
@@ -923,30 +720,23 @@
             <w15:color w:val="808080"/>
             <w:text/>
           </w:sdtPr>
+          <w:sdtEndPr/>
           <w:sdtContent>
             <w:tc>
               <w:tcPr>
-                <w:tcW w:w="4130" w:type="dxa"/>
+                <w:tcW w:w="1970" w:type="pct"/>
               </w:tcPr>
               <w:p>
                 <w:pPr>
-                  <w:spacing w:after="0" w:line="240" w:lineRule="auto"/>
+                  <w:pStyle w:val="BCNumber"/>
                   <w:jc w:val="right"/>
                   <w:rPr>
-                    <w:rFonts w:ascii="Segoe UI" w:hAnsi="Segoe UI" w:eastAsia="Times New Roman" w:cs="Times New Roman"/>
-                    <w:color w:val="242424"/>
-                    <w:sz w:val="22"/>
-                    <w:szCs w:val="22"/>
                     <w:lang w:val="en-US" w:eastAsia="en-US"/>
                   </w:rPr>
                 </w:pPr>
                 <w:proofErr w:type="spellStart"/>
                 <w:r>
                   <w:rPr>
-                    <w:rFonts w:ascii="Segoe UI" w:hAnsi="Segoe UI" w:eastAsia="Times New Roman" w:cs="Times New Roman"/>
-                    <w:color w:val="242424"/>
-                    <w:sz w:val="22"/>
-                    <w:szCs w:val="22"/>
                     <w:lang w:val="en-US" w:eastAsia="en-US"/>
                   </w:rPr>
                   <w:t>CompanyLegalOffice</w:t>
@@ -958,91 +748,95 @@
         </w:sdt>
       </w:tr>
     </w:tbl>
-    <w:p/>
+    <w:p>
+      <w:pPr>
+        <w:spacing w:after="0" w:line="240" w:lineRule="auto"/>
+      </w:pPr>
+    </w:p>
     <w:tbl>
       <w:tblPr>
-        <w:tblStyle w:val="TableGrid1"/>
-        <w:tblW w:w="15422" w:type="dxa"/>
-        <w:tblBorders>
-          <w:top w:val="none" w:color="auto" w:sz="0" w:space="0"/>
-          <w:left w:val="none" w:color="auto" w:sz="0" w:space="0"/>
-          <w:bottom w:val="none" w:color="auto" w:sz="0" w:space="0"/>
-          <w:right w:val="none" w:color="auto" w:sz="0" w:space="0"/>
-          <w:insideH w:val="none" w:color="auto" w:sz="0" w:space="0"/>
-          <w:insideV w:val="none" w:color="auto" w:sz="0" w:space="0"/>
-        </w:tblBorders>
-        <w:tblLayout w:type="fixed"/>
-        <w:tblCellMar>
-          <w:left w:w="0" w:type="dxa"/>
-          <w:right w:w="0" w:type="dxa"/>
-        </w:tblCellMar>
-        <w:tblLook w:val="04A0" w:firstRow="1" w:lastRow="0" w:firstColumn="1" w:lastColumn="0" w:noHBand="0" w:noVBand="1"/>
+        <w:tblStyle w:val="BCBlockTable"/>
+        <w:tblW w:w="5000" w:type="pct"/>
+        <w:tblLook w:val="0620" w:firstRow="1" w:lastRow="0" w:firstColumn="0" w:lastColumn="0" w:noHBand="1" w:noVBand="1"/>
         <w:tblCaption w:val="Document Information Block"/>
+        <w:tblDescription w:val="Layout table. Used for positioning, not for tabular data."/>
       </w:tblPr>
       <w:tblGrid>
-        <w:gridCol w:w="2570"/>
-        <w:gridCol w:w="2570"/>
-        <w:gridCol w:w="2571"/>
-        <w:gridCol w:w="2570"/>
-        <w:gridCol w:w="2570"/>
-        <w:gridCol w:w="2571"/>
+        <w:gridCol w:w="2489"/>
+        <w:gridCol w:w="2489"/>
+        <w:gridCol w:w="2490"/>
+        <w:gridCol w:w="2972"/>
+        <w:gridCol w:w="2490"/>
+        <w:gridCol w:w="2496"/>
       </w:tblGrid>
       <w:tr>
         <w:trPr>
+          <w:cnfStyle w:val="100000000000" w:firstRow="1" w:lastRow="0" w:firstColumn="0" w:lastColumn="0" w:oddVBand="0" w:evenVBand="0" w:oddHBand="0" w:evenHBand="0" w:firstRowFirstColumn="0" w:firstRowLastColumn="0" w:lastRowFirstColumn="0" w:lastRowLastColumn="0"/>
+          <w:cantSplit/>
           <w:trHeight w:val="254"/>
         </w:trPr>
         <w:sdt>
           <w:sdtPr>
-            <w:rPr>
-              <w:rFonts w:ascii="Segoe UI Semibold" w:hAnsi="Segoe UI Semibold" w:cs="Segoe UI Semibold"/>
-              <w:sz w:val="22"/>
-              <w:szCs w:val="22"/>
-            </w:rPr>
-            <w:alias w:val="DocumentDate_Lbl"/>
-            <w:tag w:val="#BC:InsertDataItem,DataItems/Header/DocumentDate_Lbl"/>
-            <w:id w:val="271524272"/>
+            <w:alias w:val="DocumentNo_Lbl"/>
+            <w:tag w:val="#BC:InsertDataItem,DataItems/Header/DocumentNo_Lbl"/>
+            <w:id w:val="-2052686217"/>
             <w:placeholder>
               <w:docPart w:val="DefaultPlaceholder_-1854013440"/>
             </w:placeholder>
             <w15:color w:val="808080"/>
             <w:text/>
-            <w:dataBinding w:prefixMappings="xmlns:ns0='urn:microsoft-dynamics-nav/reports/Standard_Sales_Invoice/1306/'" w:xpath="/ns0:NavWordReportXmlPart[1]/ns0:Header[1]/ns0:DocumentDate_Lbl[1]"/>
+            <w:dataBinding w:prefixMappings="xmlns:ns0='urn:microsoft-dynamics-nav/reports/Standard_Sales_Invoice/1306/'" w:xpath="/ns0:NavWordReportXmlPart[1]/ns0:Header[1]/ns0:DocumentNo_Lbl[1]"/>
           </w:sdtPr>
+          <w:sdtEndPr/>
           <w:sdtContent>
             <w:tc>
               <w:tcPr>
-                <w:tcW w:w="2570" w:type="dxa"/>
+                <w:tcW w:w="833" w:type="pct"/>
               </w:tcPr>
               <w:p>
                 <w:pPr>
-                  <w:pStyle w:val="Heading2"/>
-                  <w:rPr>
-                    <w:rFonts w:ascii="Segoe UI Semibold" w:hAnsi="Segoe UI Semibold" w:cs="Segoe UI Semibold"/>
-                    <w:sz w:val="22"/>
-                    <w:szCs w:val="22"/>
-                  </w:rPr>
+                  <w:pStyle w:val="BCLabel"/>
+                  <w:spacing w:line="276" w:lineRule="auto"/>
                 </w:pPr>
-                <w:proofErr w:type="spellStart"/>
                 <w:r>
-                  <w:rPr>
-                    <w:rFonts w:ascii="Segoe UI Semibold" w:hAnsi="Segoe UI Semibold" w:cs="Segoe UI Semibold"/>
-                    <w:sz w:val="22"/>
-                    <w:szCs w:val="22"/>
-                  </w:rPr>
-                  <w:t>DocumentDate_Lbl</w:t>
+                  <w:t>DocumentNo_Lbl</w:t>
                 </w:r>
-                <w:proofErr w:type="spellEnd"/>
               </w:p>
             </w:tc>
           </w:sdtContent>
         </w:sdt>
         <w:sdt>
           <w:sdtPr>
-            <w:rPr>
-              <w:rFonts w:ascii="Segoe UI Semibold" w:hAnsi="Segoe UI Semibold" w:cs="Segoe UI Semibold"/>
-              <w:sz w:val="22"/>
-              <w:szCs w:val="22"/>
-            </w:rPr>
+            <w:alias w:val="DocumentDate_Lbl"/>
+            <w:tag w:val="#BC:InsertDataItem,DataItems/Header/DocumentDate_Lbl"/>
+            <w:id w:val="271524272"/>
+            <w:placeholder>
+              <w:docPart w:val="0F9F082E92834850BE77CFF71C86F39C"/>
+            </w:placeholder>
+            <w:dataBinding w:prefixMappings="xmlns:ns0='urn:microsoft-dynamics-nav/reports/Standard_Sales_Invoice/1306/'" w:xpath="/ns0:NavWordReportXmlPart[1]/ns0:Header[1]/ns0:DocumentDate_Lbl[1]" w:storeItemID="{00000000-0000-0000-0000-000000000000}"/>
+            <w15:color w:val="808080"/>
+            <w:text/>
+          </w:sdtPr>
+          <w:sdtEndPr/>
+          <w:sdtContent>
+            <w:tc>
+              <w:tcPr>
+                <w:tcW w:w="833" w:type="pct"/>
+              </w:tcPr>
+              <w:p>
+                <w:pPr>
+                  <w:pStyle w:val="BCLabel"/>
+                  <w:spacing w:line="276" w:lineRule="auto"/>
+                </w:pPr>
+                <w:r>
+                  <w:t>DocumentDate_Lbl</w:t>
+                </w:r>
+              </w:p>
+            </w:tc>
+          </w:sdtContent>
+        </w:sdt>
+        <w:sdt>
+          <w:sdtPr>
             <w:alias w:val="DueDate_Lbl"/>
             <w:tag w:val="#BC:InsertDataItem,DataItems/Header/DueDate_Lbl"/>
             <w:id w:val="755092455"/>
@@ -1050,41 +844,26 @@
             <w15:color w:val="808080"/>
             <w:text/>
           </w:sdtPr>
+          <w:sdtEndPr/>
           <w:sdtContent>
             <w:tc>
               <w:tcPr>
-                <w:tcW w:w="2570" w:type="dxa"/>
+                <w:tcW w:w="833" w:type="pct"/>
               </w:tcPr>
               <w:p>
                 <w:pPr>
-                  <w:pStyle w:val="Heading2"/>
-                  <w:rPr>
-                    <w:rFonts w:ascii="Segoe UI Semibold" w:hAnsi="Segoe UI Semibold" w:cs="Segoe UI Semibold"/>
-                    <w:sz w:val="22"/>
-                    <w:szCs w:val="22"/>
-                  </w:rPr>
+                  <w:pStyle w:val="BCLabel"/>
+                  <w:spacing w:line="276" w:lineRule="auto"/>
                 </w:pPr>
-                <w:proofErr w:type="spellStart"/>
                 <w:r>
-                  <w:rPr>
-                    <w:rFonts w:ascii="Segoe UI Semibold" w:hAnsi="Segoe UI Semibold" w:cs="Segoe UI Semibold"/>
-                    <w:sz w:val="22"/>
-                    <w:szCs w:val="22"/>
-                  </w:rPr>
                   <w:t>DueDate_Lbl</w:t>
                 </w:r>
-                <w:proofErr w:type="spellEnd"/>
               </w:p>
             </w:tc>
           </w:sdtContent>
         </w:sdt>
         <w:sdt>
           <w:sdtPr>
-            <w:rPr>
-              <w:rFonts w:ascii="Segoe UI Semibold" w:hAnsi="Segoe UI Semibold" w:cs="Segoe UI Semibold"/>
-              <w:sz w:val="22"/>
-              <w:szCs w:val="22"/>
-            </w:rPr>
             <w:alias w:val="PaymentTermsDescription_Lbl"/>
             <w:tag w:val="#BC:InsertDataItem,DataItems/Header/PaymentTermsDescription_Lbl"/>
             <w:id w:val="-165563059"/>
@@ -1092,135 +871,112 @@
             <w15:color w:val="808080"/>
             <w:text/>
           </w:sdtPr>
+          <w:sdtEndPr/>
           <w:sdtContent>
             <w:tc>
               <w:tcPr>
-                <w:tcW w:w="2571" w:type="dxa"/>
+                <w:tcW w:w="833" w:type="pct"/>
               </w:tcPr>
               <w:p>
                 <w:pPr>
-                  <w:pStyle w:val="Heading2"/>
-                  <w:rPr>
-                    <w:rFonts w:ascii="Segoe UI Semibold" w:hAnsi="Segoe UI Semibold" w:cs="Segoe UI Semibold"/>
-                    <w:sz w:val="22"/>
-                    <w:szCs w:val="22"/>
-                  </w:rPr>
+                  <w:pStyle w:val="BCLabel"/>
+                  <w:spacing w:line="276" w:lineRule="auto"/>
                 </w:pPr>
-                <w:proofErr w:type="spellStart"/>
                 <w:r>
-                  <w:rPr>
-                    <w:rFonts w:ascii="Segoe UI Semibold" w:hAnsi="Segoe UI Semibold" w:cs="Segoe UI Semibold"/>
-                    <w:sz w:val="22"/>
-                    <w:szCs w:val="22"/>
-                  </w:rPr>
                   <w:t>PaymentTermsDescription_Lbl</w:t>
                 </w:r>
-                <w:proofErr w:type="spellEnd"/>
               </w:p>
             </w:tc>
           </w:sdtContent>
         </w:sdt>
         <w:tc>
           <w:tcPr>
-            <w:tcW w:w="2570" w:type="dxa"/>
+            <w:tcW w:w="833" w:type="pct"/>
           </w:tcPr>
           <w:p>
             <w:pPr>
+              <w:pStyle w:val="BCLabel"/>
               <w:spacing w:line="276" w:lineRule="auto"/>
-              <w:rPr>
-                <w:rFonts w:ascii="Segoe UI Semibold" w:hAnsi="Segoe UI Semibold" w:cs="Segoe UI Semibold"/>
-                <w:color w:val="242424"/>
-                <w:sz w:val="20"/>
-              </w:rPr>
             </w:pPr>
           </w:p>
         </w:tc>
         <w:tc>
           <w:tcPr>
-            <w:tcW w:w="2570" w:type="dxa"/>
+            <w:tcW w:w="835" w:type="pct"/>
           </w:tcPr>
           <w:p>
             <w:pPr>
+              <w:pStyle w:val="BCLabel"/>
               <w:spacing w:line="276" w:lineRule="auto"/>
-              <w:rPr>
-                <w:rFonts w:ascii="Segoe UI Semibold" w:hAnsi="Segoe UI Semibold" w:cs="Segoe UI Semibold"/>
-                <w:color w:val="242424"/>
-                <w:sz w:val="20"/>
-              </w:rPr>
-            </w:pPr>
-          </w:p>
-        </w:tc>
-        <w:tc>
-          <w:tcPr>
-            <w:tcW w:w="2571" w:type="dxa"/>
-          </w:tcPr>
-          <w:p>
-            <w:pPr>
-              <w:spacing w:line="276" w:lineRule="auto"/>
-              <w:rPr>
-                <w:rFonts w:ascii="Segoe UI Semibold" w:hAnsi="Segoe UI Semibold" w:cs="Segoe UI Semibold"/>
-                <w:color w:val="242424"/>
-                <w:sz w:val="20"/>
-              </w:rPr>
             </w:pPr>
           </w:p>
         </w:tc>
       </w:tr>
       <w:tr>
         <w:trPr>
+          <w:cantSplit/>
           <w:trHeight w:val="242"/>
         </w:trPr>
         <w:sdt>
           <w:sdtPr>
-            <w:rPr>
-              <w:rFonts w:ascii="Segoe UI" w:hAnsi="Segoe UI" w:cs="Segoe UI"/>
-              <w:color w:val="242424"/>
-              <w:sz w:val="20"/>
-            </w:rPr>
-            <w:alias w:val="DocumentDate"/>
-            <w:tag w:val="#BC:InsertDataItem,DataItems/Header/DocumentDate"/>
-            <w:id w:val="1113946311"/>
+            <w:alias w:val="DocumentNo"/>
+            <w:tag w:val="#BC:InsertDataItem,DataItems/Header/DocumentNo"/>
+            <w:id w:val="820320513"/>
             <w:placeholder>
               <w:docPart w:val="DefaultPlaceholder_-1854013440"/>
             </w:placeholder>
             <w15:color w:val="808080"/>
             <w:text/>
-            <w:dataBinding w:prefixMappings="xmlns:ns0='urn:microsoft-dynamics-nav/reports/Standard_Sales_Invoice/1306/'" w:xpath="/ns0:NavWordReportXmlPart[1]/ns0:Header[1]/ns0:DocumentDate[1]"/>
+            <w:dataBinding w:prefixMappings="xmlns:ns0='urn:microsoft-dynamics-nav/reports/Standard_Sales_Invoice/1306/'" w:xpath="/ns0:NavWordReportXmlPart[1]/ns0:Header[1]/ns0:DocumentNo[1]"/>
           </w:sdtPr>
+          <w:sdtEndPr/>
           <w:sdtContent>
             <w:tc>
               <w:tcPr>
-                <w:tcW w:w="2570" w:type="dxa"/>
+                <w:tcW w:w="833" w:type="pct"/>
               </w:tcPr>
               <w:p>
                 <w:pPr>
-                  <w:rPr>
-                    <w:rFonts w:ascii="Segoe UI" w:hAnsi="Segoe UI" w:cs="Segoe UI"/>
-                    <w:color w:val="242424"/>
-                    <w:sz w:val="20"/>
-                  </w:rPr>
+                  <w:pStyle w:val="NoSpacing"/>
                 </w:pPr>
-                <w:proofErr w:type="spellStart"/>
                 <w:r>
-                  <w:rPr>
-                    <w:rFonts w:ascii="Segoe UI" w:hAnsi="Segoe UI" w:cs="Segoe UI"/>
-                    <w:color w:val="242424"/>
-                    <w:sz w:val="20"/>
-                  </w:rPr>
-                  <w:t>DocumentDate</w:t>
+                  <w:t>DocumentNo</w:t>
                 </w:r>
-                <w:proofErr w:type="spellEnd"/>
               </w:p>
             </w:tc>
           </w:sdtContent>
         </w:sdt>
         <w:sdt>
           <w:sdtPr>
-            <w:rPr>
-              <w:rFonts w:ascii="Segoe UI" w:hAnsi="Segoe UI" w:cs="Segoe UI"/>
-              <w:color w:val="242424"/>
-              <w:sz w:val="20"/>
-            </w:rPr>
+            <w:alias w:val="DocumentDate"/>
+            <w:tag w:val="#BC:InsertDataItem,DataItems/Header/DocumentDate"/>
+            <w:id w:val="1113946311"/>
+            <w:placeholder>
+              <w:docPart w:val="D4CDF6197D5843518AA06D0C5FE471FE"/>
+            </w:placeholder>
+            <w:dataBinding w:prefixMappings="xmlns:ns0='urn:microsoft-dynamics-nav/reports/Standard_Sales_Invoice/1306/'" w:xpath="/ns0:NavWordReportXmlPart[1]/ns0:Header[1]/ns0:DocumentDate[1]" w:storeItemID="{00000000-0000-0000-0000-000000000000}"/>
+            <w15:color w:val="808080"/>
+            <w:text/>
+          </w:sdtPr>
+          <w:sdtEndPr/>
+          <w:sdtContent>
+            <w:tc>
+              <w:tcPr>
+                <w:tcW w:w="833" w:type="pct"/>
+              </w:tcPr>
+              <w:p>
+                <w:pPr>
+                  <w:pStyle w:val="NoSpacing"/>
+                </w:pPr>
+                <w:r>
+                  <w:t>DocumentDate</w:t>
+                </w:r>
+              </w:p>
+            </w:tc>
+          </w:sdtContent>
+        </w:sdt>
+        <w:sdt>
+          <w:sdtPr>
             <w:alias w:val="DueDate"/>
             <w:tag w:val="#BC:InsertDataItem,DataItems/Header/DueDate"/>
             <w:id w:val="1511642603"/>
@@ -1228,40 +984,25 @@
             <w15:color w:val="808080"/>
             <w:text/>
           </w:sdtPr>
+          <w:sdtEndPr/>
           <w:sdtContent>
             <w:tc>
               <w:tcPr>
-                <w:tcW w:w="2570" w:type="dxa"/>
+                <w:tcW w:w="833" w:type="pct"/>
               </w:tcPr>
               <w:p>
                 <w:pPr>
-                  <w:rPr>
-                    <w:rFonts w:ascii="Segoe UI" w:hAnsi="Segoe UI" w:cs="Segoe UI"/>
-                    <w:color w:val="242424"/>
-                    <w:sz w:val="20"/>
-                  </w:rPr>
+                  <w:pStyle w:val="NoSpacing"/>
                 </w:pPr>
-                <w:proofErr w:type="spellStart"/>
                 <w:r>
-                  <w:rPr>
-                    <w:rFonts w:ascii="Segoe UI" w:hAnsi="Segoe UI" w:cs="Segoe UI"/>
-                    <w:color w:val="242424"/>
-                    <w:sz w:val="20"/>
-                  </w:rPr>
                   <w:t>DueDate</w:t>
                 </w:r>
-                <w:proofErr w:type="spellEnd"/>
               </w:p>
             </w:tc>
           </w:sdtContent>
         </w:sdt>
         <w:sdt>
           <w:sdtPr>
-            <w:rPr>
-              <w:rFonts w:ascii="Segoe UI" w:hAnsi="Segoe UI" w:cs="Segoe UI"/>
-              <w:color w:val="242424"/>
-              <w:sz w:val="20"/>
-            </w:rPr>
             <w:alias w:val="PaymentTermsDescription"/>
             <w:tag w:val="#BC:InsertDataItem,DataItems/Header/PaymentTermsDescription"/>
             <w:id w:val="-1513372881"/>
@@ -1269,72 +1010,40 @@
             <w15:color w:val="808080"/>
             <w:text/>
           </w:sdtPr>
+          <w:sdtEndPr/>
           <w:sdtContent>
             <w:tc>
               <w:tcPr>
-                <w:tcW w:w="2571" w:type="dxa"/>
+                <w:tcW w:w="833" w:type="pct"/>
               </w:tcPr>
               <w:p>
                 <w:pPr>
-                  <w:rPr>
-                    <w:rFonts w:ascii="Segoe UI" w:hAnsi="Segoe UI" w:cs="Segoe UI"/>
-                    <w:color w:val="242424"/>
-                    <w:sz w:val="20"/>
-                  </w:rPr>
+                  <w:pStyle w:val="NoSpacing"/>
                 </w:pPr>
-                <w:proofErr w:type="spellStart"/>
                 <w:r>
-                  <w:rPr>
-                    <w:rFonts w:ascii="Segoe UI" w:hAnsi="Segoe UI" w:cs="Segoe UI"/>
-                    <w:color w:val="242424"/>
-                    <w:sz w:val="20"/>
-                  </w:rPr>
                   <w:t>PaymentTermsDescription</w:t>
                 </w:r>
-                <w:proofErr w:type="spellEnd"/>
               </w:p>
             </w:tc>
           </w:sdtContent>
         </w:sdt>
         <w:tc>
           <w:tcPr>
-            <w:tcW w:w="2570" w:type="dxa"/>
+            <w:tcW w:w="833" w:type="pct"/>
           </w:tcPr>
           <w:p>
             <w:pPr>
-              <w:rPr>
-                <w:rFonts w:ascii="Segoe UI" w:hAnsi="Segoe UI" w:cs="Segoe UI"/>
-                <w:color w:val="242424"/>
-                <w:sz w:val="20"/>
-              </w:rPr>
+              <w:pStyle w:val="NoSpacing"/>
             </w:pPr>
           </w:p>
         </w:tc>
         <w:tc>
           <w:tcPr>
-            <w:tcW w:w="2570" w:type="dxa"/>
+            <w:tcW w:w="835" w:type="pct"/>
           </w:tcPr>
           <w:p>
             <w:pPr>
-              <w:rPr>
-                <w:rFonts w:ascii="Segoe UI" w:hAnsi="Segoe UI" w:cs="Segoe UI"/>
-                <w:color w:val="242424"/>
-                <w:sz w:val="20"/>
-              </w:rPr>
-            </w:pPr>
-          </w:p>
-        </w:tc>
-        <w:tc>
-          <w:tcPr>
-            <w:tcW w:w="2571" w:type="dxa"/>
-          </w:tcPr>
-          <w:p>
-            <w:pPr>
-              <w:rPr>
-                <w:rFonts w:ascii="Segoe UI" w:hAnsi="Segoe UI" w:cs="Segoe UI"/>
-                <w:color w:val="242424"/>
-                <w:sz w:val="20"/>
-              </w:rPr>
+              <w:pStyle w:val="NoSpacing"/>
             </w:pPr>
           </w:p>
         </w:tc>
@@ -1343,22 +1052,22 @@
     <w:p/>
     <w:tbl>
       <w:tblPr>
-        <w:tblStyle w:val="CLSequoiatablestyle021"/>
-        <w:tblW w:w="15422" w:type="dxa"/>
-        <w:tblLayout w:type="fixed"/>
-        <w:tblLook w:val="04A0" w:firstRow="1" w:lastRow="0" w:firstColumn="1" w:lastColumn="0" w:noHBand="0" w:noVBand="1"/>
+        <w:tblStyle w:val="BCDataTable"/>
+        <w:tblW w:w="5000" w:type="pct"/>
+        <w:tblLook w:val="0420" w:firstRow="1" w:lastRow="0" w:firstColumn="0" w:lastColumn="0" w:noHBand="0" w:noVBand="1"/>
         <w:tblCaption w:val="Data Table Block"/>
+        <w:tblDescription w:val="Document lines. Column headers in the first row."/>
       </w:tblPr>
       <w:tblGrid>
-        <w:gridCol w:w="1055"/>
-        <w:gridCol w:w="2635"/>
-        <w:gridCol w:w="1800"/>
-        <w:gridCol w:w="1138"/>
-        <w:gridCol w:w="1022"/>
-        <w:gridCol w:w="2340"/>
-        <w:gridCol w:w="1350"/>
-        <w:gridCol w:w="1170"/>
-        <w:gridCol w:w="2912"/>
+        <w:gridCol w:w="1522"/>
+        <w:gridCol w:w="1831"/>
+        <w:gridCol w:w="1723"/>
+        <w:gridCol w:w="1601"/>
+        <w:gridCol w:w="1462"/>
+        <w:gridCol w:w="1249"/>
+        <w:gridCol w:w="2670"/>
+        <w:gridCol w:w="1492"/>
+        <w:gridCol w:w="1876"/>
       </w:tblGrid>
       <w:tr>
         <w:trPr>
@@ -1367,15 +1076,11 @@
         </w:trPr>
         <w:tc>
           <w:tcPr>
-            <w:cnfStyle w:val="001000000000" w:firstRow="0" w:lastRow="0" w:firstColumn="1" w:lastColumn="0" w:oddVBand="0" w:evenVBand="0" w:oddHBand="0" w:evenHBand="0" w:firstRowFirstColumn="0" w:firstRowLastColumn="0" w:lastRowFirstColumn="0" w:lastRowLastColumn="0"/>
-            <w:tcW w:w="1055" w:type="dxa"/>
+            <w:tcW w:w="342" w:type="pct"/>
           </w:tcPr>
           <w:sdt>
             <w:sdtPr>
               <w:rPr>
-                <w:rFonts w:ascii="Segoe UI Semibold" w:hAnsi="Segoe UI Semibold" w:eastAsia="Times New Roman" w:cs="Segoe UI Semibold"/>
-                <w:sz w:val="22"/>
-                <w:szCs w:val="22"/>
                 <w:lang w:val="en-US" w:eastAsia="en-US"/>
               </w:rPr>
               <w:alias w:val="ItemNo_Line_Lbl"/>
@@ -1385,28 +1090,19 @@
               <w15:color w:val="808080"/>
               <w:text/>
             </w:sdtPr>
+            <w:sdtEndPr/>
             <w:sdtContent>
               <w:p>
                 <w:pPr>
-                  <w:pStyle w:val="Heading2"/>
+                  <w:pStyle w:val="BCLabel"/>
                   <w:spacing w:before="160" w:after="80"/>
                   <w:rPr>
-                    <w:rFonts w:ascii="Segoe UI Semibold" w:hAnsi="Segoe UI Semibold" w:eastAsia="Times New Roman" w:cs="Segoe UI Semibold"/>
-                    <w:b w:val="0"/>
-                    <w:bCs w:val="0"/>
-                    <w:sz w:val="22"/>
-                    <w:szCs w:val="22"/>
                     <w:lang w:val="en-US" w:eastAsia="en-US"/>
                   </w:rPr>
                 </w:pPr>
                 <w:proofErr w:type="spellStart"/>
                 <w:r>
                   <w:rPr>
-                    <w:rFonts w:ascii="Segoe UI Semibold" w:hAnsi="Segoe UI Semibold" w:eastAsia="Times New Roman" w:cs="Segoe UI Semibold"/>
-                    <w:b w:val="0"/>
-                    <w:bCs w:val="0"/>
-                    <w:sz w:val="22"/>
-                    <w:szCs w:val="22"/>
                     <w:lang w:val="en-US" w:eastAsia="en-US"/>
                   </w:rPr>
                   <w:t>ItemNo_Line_Lbl</w:t>
@@ -1419,9 +1115,6 @@
         <w:sdt>
           <w:sdtPr>
             <w:rPr>
-              <w:rFonts w:ascii="Segoe UI Semibold" w:hAnsi="Segoe UI Semibold" w:eastAsia="Times New Roman" w:cs="Segoe UI Semibold"/>
-              <w:sz w:val="22"/>
-              <w:szCs w:val="22"/>
               <w:lang w:val="en-US" w:eastAsia="en-US"/>
             </w:rPr>
             <w:alias w:val="Description_Line_Lbl"/>
@@ -1431,33 +1124,23 @@
             <w15:color w:val="808080"/>
             <w:text/>
           </w:sdtPr>
+          <w:sdtEndPr/>
           <w:sdtContent>
             <w:tc>
               <w:tcPr>
-                <w:tcW w:w="2635" w:type="dxa"/>
+                <w:tcW w:w="854" w:type="pct"/>
               </w:tcPr>
               <w:p>
                 <w:pPr>
-                  <w:pStyle w:val="Heading2"/>
+                  <w:pStyle w:val="BCLabel"/>
                   <w:spacing w:before="160" w:after="80"/>
-                  <w:cnfStyle w:val="100000000000" w:firstRow="1" w:lastRow="0" w:firstColumn="0" w:lastColumn="0" w:oddVBand="0" w:evenVBand="0" w:oddHBand="0" w:evenHBand="0" w:firstRowFirstColumn="0" w:firstRowLastColumn="0" w:lastRowFirstColumn="0" w:lastRowLastColumn="0"/>
-                  <w:rPr>
-                    <w:rFonts w:ascii="Segoe UI Semibold" w:hAnsi="Segoe UI Semibold" w:eastAsia="Times New Roman" w:cs="Segoe UI Semibold"/>
-                    <w:b w:val="0"/>
-                    <w:bCs w:val="0"/>
-                    <w:sz w:val="22"/>
-                    <w:szCs w:val="22"/>
+                  <w:rPr>
                     <w:lang w:val="en-US" w:eastAsia="en-US"/>
                   </w:rPr>
                 </w:pPr>
                 <w:proofErr w:type="spellStart"/>
                 <w:r>
                   <w:rPr>
-                    <w:rFonts w:ascii="Segoe UI Semibold" w:hAnsi="Segoe UI Semibold" w:eastAsia="Times New Roman" w:cs="Segoe UI Semibold"/>
-                    <w:b w:val="0"/>
-                    <w:bCs w:val="0"/>
-                    <w:sz w:val="22"/>
-                    <w:szCs w:val="22"/>
                     <w:lang w:val="en-US" w:eastAsia="en-US"/>
                   </w:rPr>
                   <w:t>Description_Line_Lbl</w:t>
@@ -1470,11 +1153,6 @@
         <w:sdt>
           <w:sdtPr>
             <w:rPr>
-              <w:rFonts w:ascii="Segoe UI Semibold" w:hAnsi="Segoe UI Semibold" w:eastAsia="Times New Roman" w:cs="Segoe UI Semibold"/>
-              <w:b w:val="0"/>
-              <w:bCs w:val="0"/>
-              <w:sz w:val="22"/>
-              <w:szCs w:val="22"/>
               <w:lang w:val="en-US" w:eastAsia="en-US"/>
             </w:rPr>
             <w:alias w:val="CO2ePerUnit_Lbl"/>
@@ -1483,37 +1161,27 @@
             <w:placeholder>
               <w:docPart w:val="DefaultPlaceholder_-1854013440"/>
             </w:placeholder>
+            <w:dataBinding w:prefixMappings="xmlns:ns0='urn:microsoft-dynamics-nav/reports/Standard_Sales_Invoice/1306/'" w:xpath="/ns0:NavWordReportXmlPart[1]/ns0:Header[1]/ns0:CO2ePerUnit_Lbl[1]" w:storeItemID="{00000000-0000-0000-0000-000000000000}"/>
             <w15:color w:val="808080"/>
             <w:text/>
-            <w:dataBinding w:prefixMappings="xmlns:ns0='urn:microsoft-dynamics-nav/reports/Standard_Sales_Invoice/1306/'" w:xpath="/ns0:NavWordReportXmlPart[1]/ns0:Header[1]/ns0:CO2ePerUnit_Lbl[1]"/>
           </w:sdtPr>
+          <w:sdtEndPr/>
           <w:sdtContent>
             <w:tc>
               <w:tcPr>
-                <w:tcW w:w="1800" w:type="dxa"/>
+                <w:tcW w:w="584" w:type="pct"/>
               </w:tcPr>
               <w:p>
                 <w:pPr>
-                  <w:pStyle w:val="Heading2"/>
+                  <w:pStyle w:val="BCLabelNumber"/>
                   <w:spacing w:before="160" w:after="80"/>
                   <w:jc w:val="right"/>
-                  <w:cnfStyle w:val="100000000000" w:firstRow="1" w:lastRow="0" w:firstColumn="0" w:lastColumn="0" w:oddVBand="0" w:evenVBand="0" w:oddHBand="0" w:evenHBand="0" w:firstRowFirstColumn="0" w:firstRowLastColumn="0" w:lastRowFirstColumn="0" w:lastRowLastColumn="0"/>
-                  <w:rPr>
-                    <w:rFonts w:ascii="Segoe UI Semibold" w:hAnsi="Segoe UI Semibold" w:eastAsia="Times New Roman" w:cs="Segoe UI Semibold"/>
-                    <w:b w:val="0"/>
-                    <w:bCs w:val="0"/>
-                    <w:sz w:val="22"/>
-                    <w:szCs w:val="22"/>
+                  <w:rPr>
                     <w:lang w:val="en-US" w:eastAsia="en-US"/>
                   </w:rPr>
                 </w:pPr>
                 <w:r>
                   <w:rPr>
-                    <w:rFonts w:ascii="Segoe UI Semibold" w:hAnsi="Segoe UI Semibold" w:eastAsia="Times New Roman" w:cs="Segoe UI Semibold"/>
-                    <w:b w:val="0"/>
-                    <w:bCs w:val="0"/>
-                    <w:sz w:val="22"/>
-                    <w:szCs w:val="22"/>
                     <w:lang w:val="en-US" w:eastAsia="en-US"/>
                   </w:rPr>
                   <w:t>CO2ePerUnit_Lbl</w:t>
@@ -1525,9 +1193,6 @@
         <w:sdt>
           <w:sdtPr>
             <w:rPr>
-              <w:rFonts w:ascii="Segoe UI Semibold" w:hAnsi="Segoe UI Semibold" w:eastAsia="Times New Roman" w:cs="Segoe UI Semibold"/>
-              <w:sz w:val="22"/>
-              <w:szCs w:val="22"/>
               <w:lang w:val="en-US" w:eastAsia="en-US"/>
             </w:rPr>
             <w:alias w:val="Quantity_Line_Lbl"/>
@@ -1537,34 +1202,24 @@
             <w15:color w:val="808080"/>
             <w:text/>
           </w:sdtPr>
+          <w:sdtEndPr/>
           <w:sdtContent>
             <w:tc>
               <w:tcPr>
-                <w:tcW w:w="1138" w:type="dxa"/>
+                <w:tcW w:w="369" w:type="pct"/>
               </w:tcPr>
               <w:p>
                 <w:pPr>
-                  <w:pStyle w:val="Heading2"/>
+                  <w:pStyle w:val="BCLabelNumber"/>
                   <w:spacing w:before="160" w:after="80"/>
                   <w:jc w:val="right"/>
-                  <w:cnfStyle w:val="100000000000" w:firstRow="1" w:lastRow="0" w:firstColumn="0" w:lastColumn="0" w:oddVBand="0" w:evenVBand="0" w:oddHBand="0" w:evenHBand="0" w:firstRowFirstColumn="0" w:firstRowLastColumn="0" w:lastRowFirstColumn="0" w:lastRowLastColumn="0"/>
-                  <w:rPr>
-                    <w:rFonts w:ascii="Segoe UI Semibold" w:hAnsi="Segoe UI Semibold" w:eastAsia="Times New Roman" w:cs="Segoe UI Semibold"/>
-                    <w:b w:val="0"/>
-                    <w:bCs w:val="0"/>
-                    <w:sz w:val="22"/>
-                    <w:szCs w:val="22"/>
+                  <w:rPr>
                     <w:lang w:val="en-US" w:eastAsia="en-US"/>
                   </w:rPr>
                 </w:pPr>
                 <w:proofErr w:type="spellStart"/>
                 <w:r>
                   <w:rPr>
-                    <w:rFonts w:ascii="Segoe UI Semibold" w:hAnsi="Segoe UI Semibold" w:eastAsia="Times New Roman" w:cs="Segoe UI Semibold"/>
-                    <w:b w:val="0"/>
-                    <w:bCs w:val="0"/>
-                    <w:sz w:val="22"/>
-                    <w:szCs w:val="22"/>
                     <w:lang w:val="en-US" w:eastAsia="en-US"/>
                   </w:rPr>
                   <w:t>Quantity_Line_Lbl</w:t>
@@ -1577,9 +1232,6 @@
         <w:sdt>
           <w:sdtPr>
             <w:rPr>
-              <w:rFonts w:ascii="Segoe UI Semibold" w:hAnsi="Segoe UI Semibold" w:eastAsia="Times New Roman" w:cs="Segoe UI Semibold"/>
-              <w:sz w:val="22"/>
-              <w:szCs w:val="22"/>
               <w:lang w:val="en-US" w:eastAsia="en-US"/>
             </w:rPr>
             <w:alias w:val="Unit_Lbl"/>
@@ -1588,37 +1240,27 @@
             <w:placeholder>
               <w:docPart w:val="463CB301DB114C62BF12F9ECAAC86C5A"/>
             </w:placeholder>
+            <w:dataBinding w:prefixMappings="xmlns:ns0='urn:microsoft-dynamics-nav/reports/Standard_Sales_Invoice/1306/'" w:xpath="/ns0:NavWordReportXmlPart[1]/ns0:Header[1]/ns0:Line[1]/ns0:Unit_Lbl[1]" w:storeItemID="{00000000-0000-0000-0000-000000000000}"/>
             <w15:color w:val="808080"/>
             <w:text/>
-            <w:dataBinding w:prefixMappings="xmlns:ns0='urn:microsoft-dynamics-nav/reports/Standard_Sales_Invoice/1306/'" w:xpath="/ns0:NavWordReportXmlPart[1]/ns0:Header[1]/ns0:Line[1]/ns0:Unit_Lbl[1]"/>
           </w:sdtPr>
+          <w:sdtEndPr/>
           <w:sdtContent>
             <w:tc>
               <w:tcPr>
-                <w:tcW w:w="1022" w:type="dxa"/>
+                <w:tcW w:w="331" w:type="pct"/>
               </w:tcPr>
               <w:p>
                 <w:pPr>
-                  <w:pStyle w:val="Heading2"/>
+                  <w:pStyle w:val="BCLabel"/>
                   <w:spacing w:before="160" w:after="80"/>
-                  <w:cnfStyle w:val="100000000000" w:firstRow="1" w:lastRow="0" w:firstColumn="0" w:lastColumn="0" w:oddVBand="0" w:evenVBand="0" w:oddHBand="0" w:evenHBand="0" w:firstRowFirstColumn="0" w:firstRowLastColumn="0" w:lastRowFirstColumn="0" w:lastRowLastColumn="0"/>
-                  <w:rPr>
-                    <w:rFonts w:ascii="Segoe UI Semibold" w:hAnsi="Segoe UI Semibold" w:eastAsia="Times New Roman" w:cs="Segoe UI Semibold"/>
-                    <w:b w:val="0"/>
-                    <w:bCs w:val="0"/>
-                    <w:sz w:val="22"/>
-                    <w:szCs w:val="22"/>
+                  <w:rPr>
                     <w:lang w:val="en-US" w:eastAsia="en-US"/>
                   </w:rPr>
                 </w:pPr>
                 <w:proofErr w:type="spellStart"/>
                 <w:r>
                   <w:rPr>
-                    <w:rFonts w:ascii="Segoe UI Semibold" w:hAnsi="Segoe UI Semibold" w:eastAsia="Times New Roman" w:cs="Segoe UI Semibold"/>
-                    <w:b w:val="0"/>
-                    <w:bCs w:val="0"/>
-                    <w:sz w:val="22"/>
-                    <w:szCs w:val="22"/>
                     <w:lang w:val="en-US" w:eastAsia="en-US"/>
                   </w:rPr>
                   <w:t>Unit_Lbl</w:t>
@@ -1631,9 +1273,6 @@
         <w:sdt>
           <w:sdtPr>
             <w:rPr>
-              <w:rFonts w:ascii="Segoe UI Semibold" w:hAnsi="Segoe UI Semibold" w:eastAsia="Times New Roman" w:cs="Segoe UI Semibold"/>
-              <w:sz w:val="22"/>
-              <w:szCs w:val="22"/>
               <w:lang w:val="en-US" w:eastAsia="en-US"/>
             </w:rPr>
             <w:alias w:val="UnitPrice_Lbl"/>
@@ -1643,34 +1282,24 @@
             <w15:color w:val="808080"/>
             <w:text/>
           </w:sdtPr>
+          <w:sdtEndPr/>
           <w:sdtContent>
             <w:tc>
               <w:tcPr>
-                <w:tcW w:w="2340" w:type="dxa"/>
+                <w:tcW w:w="759" w:type="pct"/>
               </w:tcPr>
               <w:p>
                 <w:pPr>
-                  <w:pStyle w:val="Heading2"/>
+                  <w:pStyle w:val="BCLabelNumber"/>
                   <w:spacing w:before="160" w:after="80"/>
                   <w:jc w:val="right"/>
-                  <w:cnfStyle w:val="100000000000" w:firstRow="1" w:lastRow="0" w:firstColumn="0" w:lastColumn="0" w:oddVBand="0" w:evenVBand="0" w:oddHBand="0" w:evenHBand="0" w:firstRowFirstColumn="0" w:firstRowLastColumn="0" w:lastRowFirstColumn="0" w:lastRowLastColumn="0"/>
-                  <w:rPr>
-                    <w:rFonts w:ascii="Segoe UI Semibold" w:hAnsi="Segoe UI Semibold" w:eastAsia="Times New Roman" w:cs="Segoe UI Semibold"/>
-                    <w:b w:val="0"/>
-                    <w:bCs w:val="0"/>
-                    <w:sz w:val="22"/>
-                    <w:szCs w:val="22"/>
+                  <w:rPr>
                     <w:lang w:val="en-US" w:eastAsia="en-US"/>
                   </w:rPr>
                 </w:pPr>
                 <w:proofErr w:type="spellStart"/>
                 <w:r>
                   <w:rPr>
-                    <w:rFonts w:ascii="Segoe UI Semibold" w:hAnsi="Segoe UI Semibold" w:eastAsia="Times New Roman" w:cs="Segoe UI Semibold"/>
-                    <w:b w:val="0"/>
-                    <w:bCs w:val="0"/>
-                    <w:sz w:val="22"/>
-                    <w:szCs w:val="22"/>
                     <w:lang w:val="en-US" w:eastAsia="en-US"/>
                   </w:rPr>
                   <w:t>UnitPrice_Lbl</w:t>
@@ -1683,9 +1312,6 @@
         <w:sdt>
           <w:sdtPr>
             <w:rPr>
-              <w:rFonts w:ascii="Segoe UI Semibold" w:hAnsi="Segoe UI Semibold" w:eastAsia="Times New Roman" w:cs="Segoe UI Semibold"/>
-              <w:sz w:val="22"/>
-              <w:szCs w:val="22"/>
               <w:lang w:val="en-US" w:eastAsia="en-US"/>
             </w:rPr>
             <w:alias w:val="SalesInvoiceLineDiscount_Lbl"/>
@@ -1698,34 +1324,24 @@
             <w15:color w:val="808080"/>
             <w:text/>
           </w:sdtPr>
+          <w:sdtEndPr/>
           <w:sdtContent>
             <w:tc>
               <w:tcPr>
-                <w:tcW w:w="1350" w:type="dxa"/>
+                <w:tcW w:w="438" w:type="pct"/>
               </w:tcPr>
               <w:p>
                 <w:pPr>
-                  <w:pStyle w:val="Heading2"/>
+                  <w:pStyle w:val="BCLabelNumber"/>
                   <w:spacing w:before="160" w:after="80"/>
                   <w:jc w:val="right"/>
-                  <w:cnfStyle w:val="100000000000" w:firstRow="1" w:lastRow="0" w:firstColumn="0" w:lastColumn="0" w:oddVBand="0" w:evenVBand="0" w:oddHBand="0" w:evenHBand="0" w:firstRowFirstColumn="0" w:firstRowLastColumn="0" w:lastRowFirstColumn="0" w:lastRowLastColumn="0"/>
-                  <w:rPr>
-                    <w:rFonts w:ascii="Segoe UI Semibold" w:hAnsi="Segoe UI Semibold" w:eastAsia="Times New Roman" w:cs="Segoe UI Semibold"/>
-                    <w:b w:val="0"/>
-                    <w:bCs w:val="0"/>
-                    <w:sz w:val="22"/>
-                    <w:szCs w:val="22"/>
+                  <w:rPr>
                     <w:lang w:val="en-US" w:eastAsia="en-US"/>
                   </w:rPr>
                 </w:pPr>
                 <w:proofErr w:type="spellStart"/>
                 <w:r>
                   <w:rPr>
-                    <w:rFonts w:ascii="Segoe UI Semibold" w:hAnsi="Segoe UI Semibold" w:eastAsia="Times New Roman" w:cs="Segoe UI Semibold"/>
-                    <w:b w:val="0"/>
-                    <w:bCs w:val="0"/>
-                    <w:sz w:val="22"/>
-                    <w:szCs w:val="22"/>
                     <w:lang w:val="en-US" w:eastAsia="en-US"/>
                   </w:rPr>
                   <w:t>SalesInvoiceLineDiscount_Lbl</w:t>
@@ -1738,9 +1354,6 @@
         <w:sdt>
           <w:sdtPr>
             <w:rPr>
-              <w:rFonts w:ascii="Segoe UI Semibold" w:hAnsi="Segoe UI Semibold" w:eastAsia="Times New Roman" w:cs="Segoe UI Semibold"/>
-              <w:sz w:val="22"/>
-              <w:szCs w:val="22"/>
               <w:lang w:val="en-US" w:eastAsia="en-US"/>
             </w:rPr>
             <w:alias w:val="VATPct_Line_Lbl"/>
@@ -1750,34 +1363,24 @@
             <w15:color w:val="808080"/>
             <w:text/>
           </w:sdtPr>
+          <w:sdtEndPr/>
           <w:sdtContent>
             <w:tc>
               <w:tcPr>
-                <w:tcW w:w="1170" w:type="dxa"/>
+                <w:tcW w:w="379" w:type="pct"/>
               </w:tcPr>
               <w:p>
                 <w:pPr>
-                  <w:pStyle w:val="Heading2"/>
+                  <w:pStyle w:val="BCLabelNumber"/>
                   <w:spacing w:before="160" w:after="80"/>
                   <w:jc w:val="right"/>
-                  <w:cnfStyle w:val="100000000000" w:firstRow="1" w:lastRow="0" w:firstColumn="0" w:lastColumn="0" w:oddVBand="0" w:evenVBand="0" w:oddHBand="0" w:evenHBand="0" w:firstRowFirstColumn="0" w:firstRowLastColumn="0" w:lastRowFirstColumn="0" w:lastRowLastColumn="0"/>
-                  <w:rPr>
-                    <w:rFonts w:ascii="Segoe UI Semibold" w:hAnsi="Segoe UI Semibold" w:eastAsia="Times New Roman" w:cs="Segoe UI Semibold"/>
-                    <w:b w:val="0"/>
-                    <w:bCs w:val="0"/>
-                    <w:sz w:val="22"/>
-                    <w:szCs w:val="22"/>
+                  <w:rPr>
                     <w:lang w:val="en-US" w:eastAsia="en-US"/>
                   </w:rPr>
                 </w:pPr>
                 <w:proofErr w:type="spellStart"/>
                 <w:r>
                   <w:rPr>
-                    <w:rFonts w:ascii="Segoe UI Semibold" w:hAnsi="Segoe UI Semibold" w:eastAsia="Times New Roman" w:cs="Segoe UI Semibold"/>
-                    <w:b w:val="0"/>
-                    <w:bCs w:val="0"/>
-                    <w:sz w:val="22"/>
-                    <w:szCs w:val="22"/>
                     <w:lang w:val="en-US" w:eastAsia="en-US"/>
                   </w:rPr>
                   <w:t>VATPct_Line_Lbl</w:t>
@@ -1790,9 +1393,6 @@
         <w:sdt>
           <w:sdtPr>
             <w:rPr>
-              <w:rFonts w:ascii="Segoe UI Semibold" w:hAnsi="Segoe UI Semibold" w:eastAsia="Times New Roman" w:cs="Segoe UI Semibold"/>
-              <w:sz w:val="22"/>
-              <w:szCs w:val="22"/>
               <w:lang w:val="en-US" w:eastAsia="en-US"/>
             </w:rPr>
             <w:alias w:val="LineAmount_Line_Lbl"/>
@@ -1802,34 +1402,24 @@
             <w15:color w:val="808080"/>
             <w:text/>
           </w:sdtPr>
+          <w:sdtEndPr/>
           <w:sdtContent>
             <w:tc>
               <w:tcPr>
-                <w:tcW w:w="2912" w:type="dxa"/>
+                <w:tcW w:w="944" w:type="pct"/>
               </w:tcPr>
               <w:p>
                 <w:pPr>
-                  <w:pStyle w:val="Heading2"/>
+                  <w:pStyle w:val="BCLabelNumber"/>
                   <w:spacing w:before="160" w:after="80"/>
                   <w:jc w:val="right"/>
-                  <w:cnfStyle w:val="100000000000" w:firstRow="1" w:lastRow="0" w:firstColumn="0" w:lastColumn="0" w:oddVBand="0" w:evenVBand="0" w:oddHBand="0" w:evenHBand="0" w:firstRowFirstColumn="0" w:firstRowLastColumn="0" w:lastRowFirstColumn="0" w:lastRowLastColumn="0"/>
-                  <w:rPr>
-                    <w:rFonts w:ascii="Segoe UI Semibold" w:hAnsi="Segoe UI Semibold" w:eastAsia="Times New Roman" w:cs="Segoe UI Semibold"/>
-                    <w:b w:val="0"/>
-                    <w:bCs w:val="0"/>
-                    <w:sz w:val="22"/>
-                    <w:szCs w:val="22"/>
+                  <w:rPr>
                     <w:lang w:val="en-US" w:eastAsia="en-US"/>
                   </w:rPr>
                 </w:pPr>
                 <w:proofErr w:type="spellStart"/>
                 <w:r>
                   <w:rPr>
-                    <w:rFonts w:ascii="Segoe UI Semibold" w:hAnsi="Segoe UI Semibold" w:eastAsia="Times New Roman" w:cs="Segoe UI Semibold"/>
-                    <w:b w:val="0"/>
-                    <w:bCs w:val="0"/>
-                    <w:sz w:val="22"/>
-                    <w:szCs w:val="22"/>
                     <w:lang w:val="en-US" w:eastAsia="en-US"/>
                   </w:rPr>
                   <w:t>LineAmount_Line_Lbl</w:t>
@@ -1843,22 +1433,16 @@
       <w:tr>
         <w:trPr>
           <w:cnfStyle w:val="000000100000" w:firstRow="0" w:lastRow="0" w:firstColumn="0" w:lastColumn="0" w:oddVBand="0" w:evenVBand="0" w:oddHBand="1" w:evenHBand="0" w:firstRowFirstColumn="0" w:firstRowLastColumn="0" w:lastRowFirstColumn="0" w:lastRowLastColumn="0"/>
-          <w:trHeight w:val="245" w:hRule="exact"/>
+          <w:trHeight w:val="245"/>
         </w:trPr>
         <w:tc>
           <w:tcPr>
-            <w:cnfStyle w:val="001000000000" w:firstRow="0" w:lastRow="0" w:firstColumn="1" w:lastColumn="0" w:oddVBand="0" w:evenVBand="0" w:oddHBand="0" w:evenHBand="0" w:firstRowFirstColumn="0" w:firstRowLastColumn="0" w:lastRowFirstColumn="0" w:lastRowLastColumn="0"/>
-            <w:tcW w:w="1055" w:type="dxa"/>
-            <w:vAlign w:val="center"/>
+            <w:tcW w:w="342" w:type="pct"/>
           </w:tcPr>
           <w:p>
             <w:pPr>
+              <w:pStyle w:val="NoSpacing"/>
               <w:rPr>
-                <w:rFonts w:ascii="Segoe UI Semibold" w:hAnsi="Segoe UI Semibold" w:eastAsia="Segoe UI" w:cs="Segoe UI Semibold"/>
-                <w:b/>
-                <w:color w:val="242424"/>
-                <w:sz w:val="22"/>
-                <w:szCs w:val="22"/>
                 <w:lang w:val="en-US" w:eastAsia="en-US"/>
               </w:rPr>
             </w:pPr>
@@ -1866,19 +1450,12 @@
         </w:tc>
         <w:tc>
           <w:tcPr>
-            <w:tcW w:w="2635" w:type="dxa"/>
-            <w:vAlign w:val="center"/>
+            <w:tcW w:w="854" w:type="pct"/>
           </w:tcPr>
           <w:p>
             <w:pPr>
-              <w:cnfStyle w:val="000000100000" w:firstRow="0" w:lastRow="0" w:firstColumn="0" w:lastColumn="0" w:oddVBand="0" w:evenVBand="0" w:oddHBand="1" w:evenHBand="0" w:firstRowFirstColumn="0" w:firstRowLastColumn="0" w:lastRowFirstColumn="0" w:lastRowLastColumn="0"/>
+              <w:pStyle w:val="NoSpacing"/>
               <w:rPr>
-                <w:rFonts w:ascii="Segoe UI Semibold" w:hAnsi="Segoe UI Semibold" w:eastAsia="Segoe UI" w:cs="Segoe UI Semibold"/>
-                <w:b/>
-                <w:bCs/>
-                <w:color w:val="242424"/>
-                <w:sz w:val="22"/>
-                <w:szCs w:val="22"/>
                 <w:lang w:val="en-US" w:eastAsia="en-US"/>
               </w:rPr>
             </w:pPr>
@@ -1886,18 +1463,12 @@
         </w:tc>
         <w:tc>
           <w:tcPr>
-            <w:tcW w:w="1800" w:type="dxa"/>
+            <w:tcW w:w="584" w:type="pct"/>
           </w:tcPr>
           <w:p>
             <w:pPr>
-              <w:cnfStyle w:val="000000100000" w:firstRow="0" w:lastRow="0" w:firstColumn="0" w:lastColumn="0" w:oddVBand="0" w:evenVBand="0" w:oddHBand="1" w:evenHBand="0" w:firstRowFirstColumn="0" w:firstRowLastColumn="0" w:lastRowFirstColumn="0" w:lastRowLastColumn="0"/>
+              <w:pStyle w:val="NoSpacing"/>
               <w:rPr>
-                <w:rFonts w:ascii="Segoe UI Semibold" w:hAnsi="Segoe UI Semibold" w:eastAsia="Segoe UI" w:cs="Segoe UI Semibold"/>
-                <w:b/>
-                <w:bCs/>
-                <w:color w:val="242424"/>
-                <w:sz w:val="22"/>
-                <w:szCs w:val="22"/>
                 <w:lang w:val="en-US" w:eastAsia="en-US"/>
               </w:rPr>
             </w:pPr>
@@ -1905,19 +1476,12 @@
         </w:tc>
         <w:tc>
           <w:tcPr>
-            <w:tcW w:w="1138" w:type="dxa"/>
-            <w:vAlign w:val="center"/>
+            <w:tcW w:w="369" w:type="pct"/>
           </w:tcPr>
           <w:p>
             <w:pPr>
-              <w:cnfStyle w:val="000000100000" w:firstRow="0" w:lastRow="0" w:firstColumn="0" w:lastColumn="0" w:oddVBand="0" w:evenVBand="0" w:oddHBand="1" w:evenHBand="0" w:firstRowFirstColumn="0" w:firstRowLastColumn="0" w:lastRowFirstColumn="0" w:lastRowLastColumn="0"/>
+              <w:pStyle w:val="NoSpacing"/>
               <w:rPr>
-                <w:rFonts w:ascii="Segoe UI Semibold" w:hAnsi="Segoe UI Semibold" w:eastAsia="Segoe UI" w:cs="Segoe UI Semibold"/>
-                <w:b/>
-                <w:bCs/>
-                <w:color w:val="242424"/>
-                <w:sz w:val="22"/>
-                <w:szCs w:val="22"/>
                 <w:lang w:val="en-US" w:eastAsia="en-US"/>
               </w:rPr>
             </w:pPr>
@@ -1925,18 +1489,12 @@
         </w:tc>
         <w:tc>
           <w:tcPr>
-            <w:tcW w:w="1022" w:type="dxa"/>
+            <w:tcW w:w="331" w:type="pct"/>
           </w:tcPr>
           <w:p>
             <w:pPr>
-              <w:cnfStyle w:val="000000100000" w:firstRow="0" w:lastRow="0" w:firstColumn="0" w:lastColumn="0" w:oddVBand="0" w:evenVBand="0" w:oddHBand="1" w:evenHBand="0" w:firstRowFirstColumn="0" w:firstRowLastColumn="0" w:lastRowFirstColumn="0" w:lastRowLastColumn="0"/>
+              <w:pStyle w:val="NoSpacing"/>
               <w:rPr>
-                <w:rFonts w:ascii="Segoe UI Semibold" w:hAnsi="Segoe UI Semibold" w:eastAsia="Segoe UI" w:cs="Segoe UI Semibold"/>
-                <w:b/>
-                <w:bCs/>
-                <w:color w:val="242424"/>
-                <w:sz w:val="22"/>
-                <w:szCs w:val="22"/>
                 <w:lang w:val="en-US" w:eastAsia="en-US"/>
               </w:rPr>
             </w:pPr>
@@ -1944,19 +1502,12 @@
         </w:tc>
         <w:tc>
           <w:tcPr>
-            <w:tcW w:w="2340" w:type="dxa"/>
-            <w:vAlign w:val="center"/>
+            <w:tcW w:w="759" w:type="pct"/>
           </w:tcPr>
           <w:p>
             <w:pPr>
-              <w:cnfStyle w:val="000000100000" w:firstRow="0" w:lastRow="0" w:firstColumn="0" w:lastColumn="0" w:oddVBand="0" w:evenVBand="0" w:oddHBand="1" w:evenHBand="0" w:firstRowFirstColumn="0" w:firstRowLastColumn="0" w:lastRowFirstColumn="0" w:lastRowLastColumn="0"/>
+              <w:pStyle w:val="NoSpacing"/>
               <w:rPr>
-                <w:rFonts w:ascii="Segoe UI Semibold" w:hAnsi="Segoe UI Semibold" w:eastAsia="Segoe UI" w:cs="Segoe UI Semibold"/>
-                <w:b/>
-                <w:bCs/>
-                <w:color w:val="242424"/>
-                <w:sz w:val="22"/>
-                <w:szCs w:val="22"/>
                 <w:lang w:val="en-US" w:eastAsia="en-US"/>
               </w:rPr>
             </w:pPr>
@@ -1964,19 +1515,13 @@
         </w:tc>
         <w:tc>
           <w:tcPr>
-            <w:tcW w:w="1350" w:type="dxa"/>
+            <w:tcW w:w="438" w:type="pct"/>
           </w:tcPr>
           <w:p>
             <w:pPr>
+              <w:pStyle w:val="BCNumber"/>
               <w:jc w:val="right"/>
-              <w:cnfStyle w:val="000000100000" w:firstRow="0" w:lastRow="0" w:firstColumn="0" w:lastColumn="0" w:oddVBand="0" w:evenVBand="0" w:oddHBand="1" w:evenHBand="0" w:firstRowFirstColumn="0" w:firstRowLastColumn="0" w:lastRowFirstColumn="0" w:lastRowLastColumn="0"/>
               <w:rPr>
-                <w:rFonts w:ascii="Segoe UI Semibold" w:hAnsi="Segoe UI Semibold" w:eastAsia="Segoe UI" w:cs="Segoe UI Semibold"/>
-                <w:b/>
-                <w:bCs/>
-                <w:color w:val="242424"/>
-                <w:sz w:val="22"/>
-                <w:szCs w:val="22"/>
                 <w:lang w:val="en-US" w:eastAsia="en-US"/>
               </w:rPr>
             </w:pPr>
@@ -1984,19 +1529,13 @@
         </w:tc>
         <w:tc>
           <w:tcPr>
-            <w:tcW w:w="1170" w:type="dxa"/>
+            <w:tcW w:w="379" w:type="pct"/>
           </w:tcPr>
           <w:p>
             <w:pPr>
+              <w:pStyle w:val="BCNumber"/>
               <w:jc w:val="right"/>
-              <w:cnfStyle w:val="000000100000" w:firstRow="0" w:lastRow="0" w:firstColumn="0" w:lastColumn="0" w:oddVBand="0" w:evenVBand="0" w:oddHBand="1" w:evenHBand="0" w:firstRowFirstColumn="0" w:firstRowLastColumn="0" w:lastRowFirstColumn="0" w:lastRowLastColumn="0"/>
               <w:rPr>
-                <w:rFonts w:ascii="Segoe UI Semibold" w:hAnsi="Segoe UI Semibold" w:eastAsia="Segoe UI" w:cs="Segoe UI Semibold"/>
-                <w:b/>
-                <w:bCs/>
-                <w:color w:val="242424"/>
-                <w:sz w:val="22"/>
-                <w:szCs w:val="22"/>
                 <w:lang w:val="en-US" w:eastAsia="en-US"/>
               </w:rPr>
             </w:pPr>
@@ -2004,20 +1543,13 @@
         </w:tc>
         <w:tc>
           <w:tcPr>
-            <w:tcW w:w="2912" w:type="dxa"/>
-            <w:vAlign w:val="center"/>
+            <w:tcW w:w="944" w:type="pct"/>
           </w:tcPr>
           <w:p>
             <w:pPr>
+              <w:pStyle w:val="BCNumber"/>
               <w:jc w:val="right"/>
-              <w:cnfStyle w:val="000000100000" w:firstRow="0" w:lastRow="0" w:firstColumn="0" w:lastColumn="0" w:oddVBand="0" w:evenVBand="0" w:oddHBand="1" w:evenHBand="0" w:firstRowFirstColumn="0" w:firstRowLastColumn="0" w:lastRowFirstColumn="0" w:lastRowLastColumn="0"/>
               <w:rPr>
-                <w:rFonts w:ascii="Segoe UI Semibold" w:hAnsi="Segoe UI Semibold" w:eastAsia="Segoe UI" w:cs="Segoe UI Semibold"/>
-                <w:b/>
-                <w:bCs/>
-                <w:color w:val="242424"/>
-                <w:sz w:val="22"/>
-                <w:szCs w:val="22"/>
                 <w:lang w:val="en-US" w:eastAsia="en-US"/>
               </w:rPr>
             </w:pPr>
@@ -2027,14 +1559,8 @@
       <w:sdt>
         <w:sdtPr>
           <w:rPr>
-            <w:rFonts w:ascii="Segoe UI" w:hAnsi="Segoe UI" w:eastAsia="Segoe UI" w:cs="Arial"/>
-            <w:bCs w:val="0"/>
-            <w:color w:val="242424"/>
-            <w:kern w:val="2"/>
-            <w:sz w:val="22"/>
-            <w:szCs w:val="22"/>
             <w:lang w:val="en-US" w:eastAsia="en-US"/>
-            <w14:ligatures w14:val="standardContextual"/>
+            <w14:numSpacing w14:val="tabular"/>
           </w:rPr>
           <w:alias w:val="Repeater: Line"/>
           <w:tag w:val="#BC:InsertRepeater,DataItems/Header/Line"/>
@@ -2042,518 +1568,409 @@
           <w:placeholder>
             <w:docPart w:val="7BBF8387707B4251A9268EEAF1A0B144"/>
           </w:placeholder>
+          <w15:dataBinding w:prefixMappings="xmlns:ns0='urn:microsoft-dynamics-nav/reports/Standard_Sales_Invoice/1306/'" w:xpath="/ns0:NavWordReportXmlPart[1]/ns0:Header[1]/ns0:Line" w:storeItemID="{00000000-0000-0000-0000-000000000000}"/>
           <w15:color w:val="808080"/>
+          <w15:repeatingSection/>
         </w:sdtPr>
-        <w:sdtEndPr>
-          <w:rPr>
-            <w:rFonts w:cs="Times New Roman"/>
-          </w:rPr>
-        </w:sdtEndPr>
+        <w:sdtEndPr/>
         <w:sdtContent>
-          <w:tr>
-            <w:trPr>
-              <w:cnfStyle w:val="000000010000" w:firstRow="0" w:lastRow="0" w:firstColumn="0" w:lastColumn="0" w:oddVBand="0" w:evenVBand="0" w:oddHBand="0" w:evenHBand="1" w:firstRowFirstColumn="0" w:firstRowLastColumn="0" w:lastRowFirstColumn="0" w:lastRowLastColumn="0"/>
-              <w:trHeight w:val="490"/>
-            </w:trPr>
-            <w:sdt>
-              <w:sdtPr>
-                <w:rPr>
-                  <w:rFonts w:ascii="Segoe UI" w:hAnsi="Segoe UI" w:eastAsia="Segoe UI" w:cs="Arial"/>
-                  <w:bCs w:val="0"/>
-                  <w:color w:val="242424"/>
-                  <w:kern w:val="2"/>
-                  <w:sz w:val="22"/>
-                  <w:szCs w:val="22"/>
-                  <w:lang w:val="en-US" w:eastAsia="en-US"/>
-                  <w14:ligatures w14:val="standardContextual"/>
-                </w:rPr>
-                <w:alias w:val="ItemNo_Line"/>
-                <w:tag w:val="#BC:InsertDataItem,DataItems/Header/Line/ItemNo_Line"/>
-                <w:id w:val="1767953054"/>
-                <w:dataBinding w:prefixMappings="xmlns:ns0='urn:microsoft-dynamics-nav/reports/Standard_Sales_Invoice/1306/'" w:xpath="/ns0:NavWordReportXmlPart[1]/ns0:Header[1]/ns0:Line[1]/ns0:ItemNo_Line[1]" w:storeItemID="{00000000-0000-0000-0000-000000000000}"/>
-                <w15:color w:val="808080"/>
-                <w:text/>
-              </w:sdtPr>
-              <w:sdtEndPr>
-                <w:rPr>
-                  <w:bCs/>
-                  <w:kern w:val="0"/>
-                  <w14:ligatures w14:val="none"/>
-                </w:rPr>
-              </w:sdtEndPr>
-              <w:sdtContent>
+          <w:sdt>
+            <w:sdtPr>
+              <w:rPr>
+                <w:lang w:val="en-US" w:eastAsia="en-US"/>
+                <w14:numSpacing w14:val="tabular"/>
+              </w:rPr>
+              <w:id w:val="-1530948020"/>
+              <w15:color w:val="808080"/>
+              <w15:repeatingSectionItem/>
+            </w:sdtPr>
+            <w:sdtEndPr>
+              <w:rPr>
+                <w:lang/>
+              </w:rPr>
+            </w:sdtEndPr>
+            <w:sdtContent>
+              <w:tr>
+                <w:trPr>
+                  <w:cnfStyle w:val="000000010000" w:firstRow="0" w:lastRow="0" w:firstColumn="0" w:lastColumn="0" w:oddVBand="0" w:evenVBand="0" w:oddHBand="0" w:evenHBand="1" w:firstRowFirstColumn="0" w:firstRowLastColumn="0" w:lastRowFirstColumn="0" w:lastRowLastColumn="0"/>
+                  <w:trHeight w:val="490"/>
+                </w:trPr>
+                <w:sdt>
+                  <w:sdtPr>
+                    <w:rPr>
+                      <w:lang w:val="en-US" w:eastAsia="en-US"/>
+                      <w14:numSpacing w14:val="tabular"/>
+                    </w:rPr>
+                    <w:alias w:val="ItemNo_Line"/>
+                    <w:tag w:val="#BC:InsertDataItem,DataItems/Header/Line/ItemNo_Line"/>
+                    <w:id w:val="1767953054"/>
+                    <w:dataBinding w:prefixMappings="xmlns:ns0='urn:microsoft-dynamics-nav/reports/Standard_Sales_Invoice/1306/'" w:xpath="/ns0:NavWordReportXmlPart[1]/ns0:Header[1]/ns0:Line[1]/ns0:ItemNo_Line[1]" w:storeItemID="{00000000-0000-0000-0000-000000000000}"/>
+                    <w15:color w:val="808080"/>
+                    <w:text/>
+                  </w:sdtPr>
+                  <w:sdtEndPr>
+                    <w:rPr>
+                      <w14:numSpacing w14:val="default"/>
+                    </w:rPr>
+                  </w:sdtEndPr>
+                  <w:sdtContent>
+                    <w:tc>
+                      <w:tcPr>
+                        <w:tcW w:w="342" w:type="pct"/>
+                      </w:tcPr>
+                      <w:p>
+                        <w:pPr>
+                          <w:pStyle w:val="NoSpacing"/>
+                          <w:rPr>
+                            <w:lang w:val="en-US" w:eastAsia="en-US"/>
+                          </w:rPr>
+                        </w:pPr>
+                        <w:proofErr w:type="spellStart"/>
+                        <w:r>
+                          <w:rPr>
+                            <w:lang w:val="en-US" w:eastAsia="en-US"/>
+                          </w:rPr>
+                          <w:t>ItemNo_Line</w:t>
+                        </w:r>
+                        <w:proofErr w:type="spellEnd"/>
+                      </w:p>
+                    </w:tc>
+                  </w:sdtContent>
+                </w:sdt>
+                <w:sdt>
+                  <w:sdtPr>
+                    <w:rPr>
+                      <w:lang w:val="en-US" w:eastAsia="en-US"/>
+                    </w:rPr>
+                    <w:alias w:val="Description_Line"/>
+                    <w:tag w:val="#BC:InsertDataItem,DataItems/Header/Line/Description_Line"/>
+                    <w:id w:val="1393535743"/>
+                    <w:dataBinding w:prefixMappings="xmlns:ns0='urn:microsoft-dynamics-nav/reports/Standard_Sales_Invoice/1306/'" w:xpath="/ns0:NavWordReportXmlPart[1]/ns0:Header[1]/ns0:Line[1]/ns0:Description_Line[1]" w:storeItemID="{00000000-0000-0000-0000-000000000000}"/>
+                    <w15:color w:val="808080"/>
+                    <w:text/>
+                  </w:sdtPr>
+                  <w:sdtEndPr/>
+                  <w:sdtContent>
+                    <w:tc>
+                      <w:tcPr>
+                        <w:tcW w:w="854" w:type="pct"/>
+                      </w:tcPr>
+                      <w:p>
+                        <w:pPr>
+                          <w:pStyle w:val="NoSpacing"/>
+                          <w:rPr>
+                            <w:lang w:val="en-US" w:eastAsia="en-US"/>
+                          </w:rPr>
+                        </w:pPr>
+                        <w:proofErr w:type="spellStart"/>
+                        <w:r>
+                          <w:rPr>
+                            <w:lang w:val="en-US" w:eastAsia="en-US"/>
+                          </w:rPr>
+                          <w:t>Description_Line</w:t>
+                        </w:r>
+                        <w:proofErr w:type="spellEnd"/>
+                      </w:p>
+                    </w:tc>
+                  </w:sdtContent>
+                </w:sdt>
+                <w:sdt>
+                  <w:sdtPr>
+                    <w:rPr>
+                      <w:lang w:val="en-US" w:eastAsia="en-US"/>
+                    </w:rPr>
+                    <w:alias w:val="CO2ePerUnit_Line"/>
+                    <w:tag w:val="#BC:InsertDataItem,DataItems/Header/Line/CO2ePerUnit_Line"/>
+                    <w:id w:val="-2008894208"/>
+                    <w:placeholder>
+                      <w:docPart w:val="DefaultPlaceholder_-1854013440"/>
+                    </w:placeholder>
+                    <w:dataBinding w:prefixMappings="xmlns:ns0='urn:microsoft-dynamics-nav/reports/Standard_Sales_Invoice/1306/'" w:xpath="/ns0:NavWordReportXmlPart[1]/ns0:Header[1]/ns0:Line[1]/ns0:CO2ePerUnit_Line[1]" w:storeItemID="{00000000-0000-0000-0000-000000000000}"/>
+                    <w15:color w:val="808080"/>
+                    <w:text/>
+                  </w:sdtPr>
+                  <w:sdtEndPr/>
+                  <w:sdtContent>
+                    <w:tc>
+                      <w:tcPr>
+                        <w:tcW w:w="584" w:type="pct"/>
+                      </w:tcPr>
+                      <w:p>
+                        <w:pPr>
+                          <w:pStyle w:val="BCNumber"/>
+                          <w:jc w:val="right"/>
+                          <w:rPr>
+                            <w:lang w:val="en-US" w:eastAsia="en-US"/>
+                          </w:rPr>
+                        </w:pPr>
+                        <w:r>
+                          <w:rPr>
+                            <w:lang w:val="en-US" w:eastAsia="en-US"/>
+                          </w:rPr>
+                          <w:t>CO2ePerUnit_Line</w:t>
+                        </w:r>
+                      </w:p>
+                    </w:tc>
+                  </w:sdtContent>
+                </w:sdt>
+                <w:sdt>
+                  <w:sdtPr>
+                    <w:rPr>
+                      <w:lang w:val="en-US" w:eastAsia="en-US"/>
+                    </w:rPr>
+                    <w:alias w:val="Quantity_Line"/>
+                    <w:tag w:val="#BC:InsertDataItem,DataItems/Header/Line/Quantity_Line"/>
+                    <w:id w:val="1672756728"/>
+                    <w:dataBinding w:prefixMappings="xmlns:ns0='urn:microsoft-dynamics-nav/reports/Standard_Sales_Invoice/1306/'" w:xpath="/ns0:NavWordReportXmlPart[1]/ns0:Header[1]/ns0:Line[1]/ns0:Quantity_Line[1]" w:storeItemID="{00000000-0000-0000-0000-000000000000}"/>
+                    <w15:color w:val="808080"/>
+                    <w:text/>
+                  </w:sdtPr>
+                  <w:sdtEndPr/>
+                  <w:sdtContent>
+                    <w:tc>
+                      <w:tcPr>
+                        <w:tcW w:w="369" w:type="pct"/>
+                      </w:tcPr>
+                      <w:p>
+                        <w:pPr>
+                          <w:pStyle w:val="BCNumber"/>
+                          <w:jc w:val="right"/>
+                          <w:rPr>
+                            <w:lang w:val="en-US" w:eastAsia="en-US"/>
+                          </w:rPr>
+                        </w:pPr>
+                        <w:proofErr w:type="spellStart"/>
+                        <w:r>
+                          <w:rPr>
+                            <w:lang w:val="en-US" w:eastAsia="en-US"/>
+                          </w:rPr>
+                          <w:t>Quantity_Line</w:t>
+                        </w:r>
+                        <w:proofErr w:type="spellEnd"/>
+                      </w:p>
+                    </w:tc>
+                  </w:sdtContent>
+                </w:sdt>
+                <w:sdt>
+                  <w:sdtPr>
+                    <w:rPr>
+                      <w:lang w:val="en-US" w:eastAsia="en-US"/>
+                    </w:rPr>
+                    <w:alias w:val="UnitOfMeasure"/>
+                    <w:tag w:val="#BC:InsertDataItem,DataItems/Header/Line/UnitOfMeasure"/>
+                    <w:id w:val="-1382475212"/>
+                    <w:placeholder>
+                      <w:docPart w:val="463CB301DB114C62BF12F9ECAAC86C5A"/>
+                    </w:placeholder>
+                    <w:dataBinding w:prefixMappings="xmlns:ns0='urn:microsoft-dynamics-nav/reports/Standard_Sales_Invoice/1306/'" w:xpath="/ns0:NavWordReportXmlPart[1]/ns0:Header[1]/ns0:Line[1]/ns0:UnitOfMeasure[1]" w:storeItemID="{00000000-0000-0000-0000-000000000000}"/>
+                    <w15:color w:val="808080"/>
+                    <w:text/>
+                  </w:sdtPr>
+                  <w:sdtEndPr/>
+                  <w:sdtContent>
+                    <w:tc>
+                      <w:tcPr>
+                        <w:tcW w:w="331" w:type="pct"/>
+                      </w:tcPr>
+                      <w:p>
+                        <w:pPr>
+                          <w:pStyle w:val="NoSpacing"/>
+                          <w:rPr>
+                            <w:lang w:val="en-US" w:eastAsia="en-US"/>
+                          </w:rPr>
+                        </w:pPr>
+                        <w:proofErr w:type="spellStart"/>
+                        <w:r>
+                          <w:rPr>
+                            <w:lang w:val="en-US" w:eastAsia="en-US"/>
+                          </w:rPr>
+                          <w:t>UnitOfMeasure</w:t>
+                        </w:r>
+                        <w:proofErr w:type="spellEnd"/>
+                      </w:p>
+                    </w:tc>
+                  </w:sdtContent>
+                </w:sdt>
                 <w:tc>
                   <w:tcPr>
-                    <w:cnfStyle w:val="001000000000" w:firstRow="0" w:lastRow="0" w:firstColumn="1" w:lastColumn="0" w:oddVBand="0" w:evenVBand="0" w:oddHBand="0" w:evenHBand="0" w:firstRowFirstColumn="0" w:firstRowLastColumn="0" w:lastRowFirstColumn="0" w:lastRowLastColumn="0"/>
-                    <w:tcW w:w="1055" w:type="dxa"/>
-                    <w:vAlign w:val="center"/>
+                    <w:tcW w:w="759" w:type="pct"/>
                   </w:tcPr>
                   <w:p>
                     <w:pPr>
-                      <w:spacing w:before="0" w:after="0"/>
+                      <w:pStyle w:val="BCNumber"/>
+                      <w:jc w:val="right"/>
                       <w:rPr>
-                        <w:rFonts w:ascii="Segoe UI" w:hAnsi="Segoe UI" w:eastAsia="Segoe UI" w:cs="Arial"/>
-                        <w:color w:val="242424"/>
-                        <w:sz w:val="22"/>
-                        <w:szCs w:val="22"/>
                         <w:lang w:val="en-US" w:eastAsia="en-US"/>
                       </w:rPr>
                     </w:pPr>
-                    <w:proofErr w:type="spellStart"/>
-                    <w:r>
-                      <w:rPr>
-                        <w:rFonts w:ascii="Segoe UI" w:hAnsi="Segoe UI" w:eastAsia="Segoe UI" w:cs="Arial"/>
-                        <w:color w:val="242424"/>
-                        <w:sz w:val="22"/>
-                        <w:szCs w:val="22"/>
-                        <w:lang w:val="en-US" w:eastAsia="en-US"/>
-                      </w:rPr>
-                      <w:t>ItemNo_Line</w:t>
-                    </w:r>
-                    <w:proofErr w:type="spellEnd"/>
+                    <w:sdt>
+                      <w:sdtPr>
+                        <w:rPr>
+                          <w:lang w:val="en-US" w:eastAsia="en-US"/>
+                        </w:rPr>
+                        <w:alias w:val="UnitPrice"/>
+                        <w:tag w:val="#BC:InsertDataItem,DataItems/Header/Line/UnitPrice"/>
+                        <w:id w:val="-1253814634"/>
+                        <w:dataBinding w:prefixMappings="xmlns:ns0='urn:microsoft-dynamics-nav/reports/Standard_Sales_Invoice/1306/'" w:xpath="/ns0:NavWordReportXmlPart[1]/ns0:Header[1]/ns0:Line[1]/ns0:UnitPrice[1]" w:storeItemID="{00000000-0000-0000-0000-000000000000}"/>
+                        <w15:color w:val="808080"/>
+                        <w:text/>
+                      </w:sdtPr>
+                      <w:sdtEndPr/>
+                      <w:sdtContent>
+                        <w:proofErr w:type="spellStart"/>
+                        <w:r>
+                          <w:rPr>
+                            <w:lang w:val="en-US" w:eastAsia="en-US"/>
+                          </w:rPr>
+                          <w:t>UnitPrice</w:t>
+                        </w:r>
+                        <w:proofErr w:type="spellEnd"/>
+                      </w:sdtContent>
+                    </w:sdt>
                   </w:p>
                 </w:tc>
-              </w:sdtContent>
-            </w:sdt>
-            <w:sdt>
-              <w:sdtPr>
-                <w:rPr>
-                  <w:rFonts w:ascii="Segoe UI" w:hAnsi="Segoe UI" w:eastAsia="Segoe UI" w:cs="Arial"/>
-                  <w:color w:val="242424"/>
-                  <w:sz w:val="22"/>
-                  <w:szCs w:val="22"/>
-                  <w:lang w:val="en-US" w:eastAsia="en-US"/>
-                </w:rPr>
-                <w:alias w:val="Description_Line"/>
-                <w:tag w:val="#BC:InsertDataItem,DataItems/Header/Line/Description_Line"/>
-                <w:id w:val="1393535743"/>
-                <w:dataBinding w:prefixMappings="xmlns:ns0='urn:microsoft-dynamics-nav/reports/Standard_Sales_Invoice/1306/'" w:xpath="/ns0:NavWordReportXmlPart[1]/ns0:Header[1]/ns0:Line[1]/ns0:Description_Line[1]" w:storeItemID="{00000000-0000-0000-0000-000000000000}"/>
-                <w15:color w:val="808080"/>
-                <w:text/>
-              </w:sdtPr>
-              <w:sdtContent>
+                <w:sdt>
+                  <w:sdtPr>
+                    <w:rPr>
+                      <w:lang w:val="en-US" w:eastAsia="en-US"/>
+                    </w:rPr>
+                    <w:alias w:val="LineDiscountPercentText_Line"/>
+                    <w:tag w:val="#BC:InsertDataItem,DataItems/Header/Line/LineDiscountPercentText_Line"/>
+                    <w:id w:val="-1902209822"/>
+                    <w:placeholder>
+                      <w:docPart w:val="FBB02AF6EDB84AA5B701374F7AC9E91C"/>
+                    </w:placeholder>
+                    <w:dataBinding w:prefixMappings="xmlns:ns0='urn:microsoft-dynamics-nav/reports/Standard_Sales_Invoice/1306/'" w:xpath="/ns0:NavWordReportXmlPart[1]/ns0:Header[1]/ns0:Line[1]/ns0:LineDiscountPercentText_Line[1]" w:storeItemID="{00000000-0000-0000-0000-000000000000}"/>
+                    <w15:color w:val="808080"/>
+                    <w:text/>
+                  </w:sdtPr>
+                  <w:sdtEndPr/>
+                  <w:sdtContent>
+                    <w:tc>
+                      <w:tcPr>
+                        <w:tcW w:w="438" w:type="pct"/>
+                      </w:tcPr>
+                      <w:p>
+                        <w:pPr>
+                          <w:pStyle w:val="BCNumber"/>
+                          <w:jc w:val="right"/>
+                          <w:rPr>
+                            <w:lang w:val="en-US" w:eastAsia="en-US"/>
+                          </w:rPr>
+                        </w:pPr>
+                        <w:proofErr w:type="spellStart"/>
+                        <w:r>
+                          <w:rPr>
+                            <w:lang w:val="en-US" w:eastAsia="en-US"/>
+                          </w:rPr>
+                          <w:t>LineDiscountPercentText_Line</w:t>
+                        </w:r>
+                        <w:proofErr w:type="spellEnd"/>
+                      </w:p>
+                    </w:tc>
+                  </w:sdtContent>
+                </w:sdt>
+                <w:sdt>
+                  <w:sdtPr>
+                    <w:rPr>
+                      <w:lang w:val="en-US" w:eastAsia="en-US"/>
+                    </w:rPr>
+                    <w:alias w:val="VATPct_Line"/>
+                    <w:tag w:val="#BC:InsertDataItem,DataItems/Header/Line/VATPct_Line"/>
+                    <w:id w:val="1436251310"/>
+                    <w:dataBinding w:prefixMappings="xmlns:ns0='urn:microsoft-dynamics-nav/reports/Standard_Sales_Invoice/1306/'" w:xpath="/ns0:NavWordReportXmlPart[1]/ns0:Header[1]/ns0:Line[1]/ns0:VATPct_Line[1]" w:storeItemID="{00000000-0000-0000-0000-000000000000}"/>
+                    <w15:color w:val="808080"/>
+                    <w:text/>
+                  </w:sdtPr>
+                  <w:sdtEndPr/>
+                  <w:sdtContent>
+                    <w:tc>
+                      <w:tcPr>
+                        <w:tcW w:w="379" w:type="pct"/>
+                      </w:tcPr>
+                      <w:p>
+                        <w:pPr>
+                          <w:pStyle w:val="BCNumber"/>
+                          <w:jc w:val="right"/>
+                          <w:rPr>
+                            <w:lang w:val="en-US" w:eastAsia="en-US"/>
+                          </w:rPr>
+                        </w:pPr>
+                        <w:proofErr w:type="spellStart"/>
+                        <w:r>
+                          <w:rPr>
+                            <w:lang w:val="en-US" w:eastAsia="en-US"/>
+                          </w:rPr>
+                          <w:t>VATPct_Line</w:t>
+                        </w:r>
+                        <w:proofErr w:type="spellEnd"/>
+                      </w:p>
+                    </w:tc>
+                  </w:sdtContent>
+                </w:sdt>
                 <w:tc>
                   <w:tcPr>
-                    <w:tcW w:w="2635" w:type="dxa"/>
-                    <w:vAlign w:val="center"/>
+                    <w:tcW w:w="944" w:type="pct"/>
                   </w:tcPr>
                   <w:p>
                     <w:pPr>
-                      <w:spacing w:before="0" w:after="0"/>
-                      <w:cnfStyle w:val="000000010000" w:firstRow="0" w:lastRow="0" w:firstColumn="0" w:lastColumn="0" w:oddVBand="0" w:evenVBand="0" w:oddHBand="0" w:evenHBand="1" w:firstRowFirstColumn="0" w:firstRowLastColumn="0" w:lastRowFirstColumn="0" w:lastRowLastColumn="0"/>
+                      <w:pStyle w:val="BCNumber"/>
+                      <w:jc w:val="right"/>
                       <w:rPr>
-                        <w:rFonts w:ascii="Segoe UI" w:hAnsi="Segoe UI" w:eastAsia="Segoe UI" w:cs="Arial"/>
-                        <w:color w:val="242424"/>
-                        <w:sz w:val="22"/>
-                        <w:szCs w:val="22"/>
                         <w:lang w:val="en-US" w:eastAsia="en-US"/>
                       </w:rPr>
                     </w:pPr>
-                    <w:proofErr w:type="spellStart"/>
+                    <w:sdt>
+                      <w:sdtPr>
+                        <w:rPr>
+                          <w:lang w:val="en-US" w:eastAsia="en-US"/>
+                        </w:rPr>
+                        <w:alias w:val="LineAmount_Line"/>
+                        <w:tag w:val="#BC:InsertDataItem,DataItems/Header/Line/LineAmount_Line"/>
+                        <w:id w:val="787541011"/>
+                        <w:dataBinding w:prefixMappings="xmlns:ns0='urn:microsoft-dynamics-nav/reports/Standard_Sales_Invoice/1306/'" w:xpath="/ns0:NavWordReportXmlPart[1]/ns0:Header[1]/ns0:Line[1]/ns0:LineAmount_Line[1]" w:storeItemID="{00000000-0000-0000-0000-000000000000}"/>
+                        <w15:color w:val="808080"/>
+                        <w:text/>
+                      </w:sdtPr>
+                      <w:sdtEndPr/>
+                      <w:sdtContent>
+                        <w:proofErr w:type="spellStart"/>
+                        <w:r>
+                          <w:rPr>
+                            <w:lang w:val="en-US" w:eastAsia="en-US"/>
+                          </w:rPr>
+                          <w:t>LineAmount_Line</w:t>
+                        </w:r>
+                        <w:proofErr w:type="spellEnd"/>
+                      </w:sdtContent>
+                    </w:sdt>
                     <w:r>
                       <w:rPr>
-                        <w:rFonts w:ascii="Segoe UI" w:hAnsi="Segoe UI" w:eastAsia="Segoe UI" w:cs="Arial"/>
-                        <w:color w:val="242424"/>
-                        <w:sz w:val="22"/>
-                        <w:szCs w:val="22"/>
                         <w:lang w:val="en-US" w:eastAsia="en-US"/>
                       </w:rPr>
-                      <w:t>Description_Line</w:t>
-                    </w:r>
-                    <w:proofErr w:type="spellEnd"/>
-                  </w:p>
-                </w:tc>
-              </w:sdtContent>
-            </w:sdt>
-            <w:sdt>
-              <w:sdtPr>
-                <w:rPr>
-                  <w:rFonts w:ascii="Segoe UI" w:hAnsi="Segoe UI" w:eastAsia="Segoe UI" w:cs="Times New Roman"/>
-                  <w:color w:val="242424"/>
-                  <w:sz w:val="22"/>
-                  <w:szCs w:val="22"/>
-                  <w:lang w:val="en-US" w:eastAsia="en-US"/>
-                </w:rPr>
-                <w:alias w:val="CO2ePerUnit_Line"/>
-                <w:tag w:val="#BC:InsertDataItem,DataItems/Header/Line/CO2ePerUnit_Line"/>
-                <w:id w:val="-2008894208"/>
-                <w:placeholder>
-                  <w:docPart w:val="DefaultPlaceholder_-1854013440"/>
-                </w:placeholder>
-                <w15:color w:val="808080"/>
-                <w:text/>
-                <w:dataBinding w:prefixMappings="xmlns:ns0='urn:microsoft-dynamics-nav/reports/Standard_Sales_Invoice/1306/'" w:xpath="/ns0:NavWordReportXmlPart[1]/ns0:Header[1]/ns0:Line[1]/ns0:CO2ePerUnit_Line[1]"/>
-              </w:sdtPr>
-              <w:sdtContent>
-                <w:tc>
-                  <w:tcPr>
-                    <w:tcW w:w="1800" w:type="dxa"/>
-                    <w:vAlign w:val="center"/>
-                  </w:tcPr>
-                  <w:p>
-                    <w:pPr>
-                      <w:spacing w:before="0" w:after="0"/>
-                      <w:jc w:val="right"/>
-                      <w:cnfStyle w:val="000000010000" w:firstRow="0" w:lastRow="0" w:firstColumn="0" w:lastColumn="0" w:oddVBand="0" w:evenVBand="0" w:oddHBand="0" w:evenHBand="1" w:firstRowFirstColumn="0" w:firstRowLastColumn="0" w:lastRowFirstColumn="0" w:lastRowLastColumn="0"/>
-                      <w:rPr>
-                        <w:rFonts w:ascii="Segoe UI" w:hAnsi="Segoe UI" w:eastAsia="Segoe UI" w:cs="Times New Roman"/>
-                        <w:color w:val="242424"/>
-                        <w:sz w:val="22"/>
-                        <w:szCs w:val="22"/>
-                        <w:lang w:val="en-US" w:eastAsia="en-US"/>
-                      </w:rPr>
-                    </w:pPr>
-                    <w:r>
-                      <w:rPr>
-                        <w:rFonts w:ascii="Segoe UI" w:hAnsi="Segoe UI" w:eastAsia="Segoe UI" w:cs="Times New Roman"/>
-                        <w:color w:val="242424"/>
-                        <w:sz w:val="22"/>
-                        <w:szCs w:val="22"/>
-                        <w:lang w:val="en-US" w:eastAsia="en-US"/>
-                      </w:rPr>
-                      <w:t>CO2ePerUnit_Line</w:t>
+                      <w:t> </w:t>
                     </w:r>
                   </w:p>
                 </w:tc>
-              </w:sdtContent>
-            </w:sdt>
-            <w:sdt>
-              <w:sdtPr>
-                <w:rPr>
-                  <w:rFonts w:ascii="Segoe UI" w:hAnsi="Segoe UI" w:eastAsia="Segoe UI" w:cs="Arial"/>
-                  <w:color w:val="242424"/>
-                  <w:sz w:val="22"/>
-                  <w:szCs w:val="22"/>
-                  <w:lang w:val="en-US" w:eastAsia="en-US"/>
-                </w:rPr>
-                <w:alias w:val="Quantity_Line"/>
-                <w:tag w:val="#BC:InsertDataItem,DataItems/Header/Line/Quantity_Line"/>
-                <w:id w:val="1672756728"/>
-                <w:dataBinding w:prefixMappings="xmlns:ns0='urn:microsoft-dynamics-nav/reports/Standard_Sales_Invoice/1306/'" w:xpath="/ns0:NavWordReportXmlPart[1]/ns0:Header[1]/ns0:Line[1]/ns0:Quantity_Line[1]" w:storeItemID="{00000000-0000-0000-0000-000000000000}"/>
-                <w15:color w:val="808080"/>
-                <w:text/>
-              </w:sdtPr>
-              <w:sdtContent>
-                <w:tc>
-                  <w:tcPr>
-                    <w:tcW w:w="1138" w:type="dxa"/>
-                    <w:vAlign w:val="center"/>
-                  </w:tcPr>
-                  <w:p>
-                    <w:pPr>
-                      <w:spacing w:before="0" w:after="0"/>
-                      <w:jc w:val="right"/>
-                      <w:cnfStyle w:val="000000010000" w:firstRow="0" w:lastRow="0" w:firstColumn="0" w:lastColumn="0" w:oddVBand="0" w:evenVBand="0" w:oddHBand="0" w:evenHBand="1" w:firstRowFirstColumn="0" w:firstRowLastColumn="0" w:lastRowFirstColumn="0" w:lastRowLastColumn="0"/>
-                      <w:rPr>
-                        <w:rFonts w:ascii="Segoe UI" w:hAnsi="Segoe UI" w:eastAsia="Segoe UI" w:cs="Arial"/>
-                        <w:color w:val="242424"/>
-                        <w:sz w:val="22"/>
-                        <w:szCs w:val="22"/>
-                        <w:lang w:val="en-US" w:eastAsia="en-US"/>
-                      </w:rPr>
-                    </w:pPr>
-                    <w:proofErr w:type="spellStart"/>
-                    <w:r>
-                      <w:rPr>
-                        <w:rFonts w:ascii="Segoe UI" w:hAnsi="Segoe UI" w:eastAsia="Segoe UI" w:cs="Arial"/>
-                        <w:color w:val="242424"/>
-                        <w:sz w:val="22"/>
-                        <w:szCs w:val="22"/>
-                        <w:lang w:val="en-US" w:eastAsia="en-US"/>
-                      </w:rPr>
-                      <w:t>Quantity_Line</w:t>
-                    </w:r>
-                    <w:proofErr w:type="spellEnd"/>
-                  </w:p>
-                </w:tc>
-              </w:sdtContent>
-            </w:sdt>
-            <w:sdt>
-              <w:sdtPr>
-                <w:rPr>
-                  <w:rFonts w:ascii="Segoe UI" w:hAnsi="Segoe UI" w:eastAsia="Segoe UI" w:cs="Times New Roman"/>
-                  <w:color w:val="242424"/>
-                  <w:sz w:val="22"/>
-                  <w:szCs w:val="22"/>
-                  <w:lang w:val="en-US" w:eastAsia="en-US"/>
-                </w:rPr>
-                <w:alias w:val="UnitOfMeasure"/>
-                <w:tag w:val="#BC:InsertDataItem,DataItems/Header/Line/UnitOfMeasure"/>
-                <w:id w:val="-1382475212"/>
-                <w:placeholder>
-                  <w:docPart w:val="463CB301DB114C62BF12F9ECAAC86C5A"/>
-                </w:placeholder>
-                <w15:color w:val="808080"/>
-                <w:text/>
-                <w:dataBinding w:prefixMappings="xmlns:ns0='urn:microsoft-dynamics-nav/reports/Standard_Sales_Invoice/1306/'" w:xpath="/ns0:NavWordReportXmlPart[1]/ns0:Header[1]/ns0:Line[1]/ns0:UnitOfMeasure[1]"/>
-              </w:sdtPr>
-              <w:sdtContent>
-                <w:tc>
-                  <w:tcPr>
-                    <w:tcW w:w="1022" w:type="dxa"/>
-                    <w:vAlign w:val="center"/>
-                  </w:tcPr>
-                  <w:p>
-                    <w:pPr>
-                      <w:spacing w:before="0" w:after="0"/>
-                      <w:cnfStyle w:val="000000010000" w:firstRow="0" w:lastRow="0" w:firstColumn="0" w:lastColumn="0" w:oddVBand="0" w:evenVBand="0" w:oddHBand="0" w:evenHBand="1" w:firstRowFirstColumn="0" w:firstRowLastColumn="0" w:lastRowFirstColumn="0" w:lastRowLastColumn="0"/>
-                      <w:rPr>
-                        <w:rFonts w:ascii="Segoe UI" w:hAnsi="Segoe UI" w:eastAsia="Segoe UI" w:cs="Times New Roman"/>
-                        <w:color w:val="242424"/>
-                        <w:sz w:val="22"/>
-                        <w:szCs w:val="22"/>
-                        <w:lang w:val="en-US" w:eastAsia="en-US"/>
-                      </w:rPr>
-                    </w:pPr>
-                    <w:proofErr w:type="spellStart"/>
-                    <w:r>
-                      <w:rPr>
-                        <w:rFonts w:ascii="Segoe UI" w:hAnsi="Segoe UI" w:eastAsia="Segoe UI" w:cs="Times New Roman"/>
-                        <w:color w:val="242424"/>
-                        <w:sz w:val="22"/>
-                        <w:szCs w:val="22"/>
-                        <w:lang w:val="en-US" w:eastAsia="en-US"/>
-                      </w:rPr>
-                      <w:t>UnitOfMeasure</w:t>
-                    </w:r>
-                    <w:proofErr w:type="spellEnd"/>
-                  </w:p>
-                </w:tc>
-              </w:sdtContent>
-            </w:sdt>
-            <w:tc>
-              <w:tcPr>
-                <w:tcW w:w="2340" w:type="dxa"/>
-                <w:vAlign w:val="center"/>
-              </w:tcPr>
-              <w:p>
-                <w:pPr>
-                  <w:spacing w:before="0" w:after="0"/>
-                  <w:jc w:val="right"/>
-                  <w:cnfStyle w:val="000000010000" w:firstRow="0" w:lastRow="0" w:firstColumn="0" w:lastColumn="0" w:oddVBand="0" w:evenVBand="0" w:oddHBand="0" w:evenHBand="1" w:firstRowFirstColumn="0" w:firstRowLastColumn="0" w:lastRowFirstColumn="0" w:lastRowLastColumn="0"/>
-                  <w:rPr>
-                    <w:rFonts w:ascii="Segoe UI" w:hAnsi="Segoe UI" w:eastAsia="Segoe UI" w:cs="Arial"/>
-                    <w:color w:val="242424"/>
-                    <w:sz w:val="22"/>
-                    <w:szCs w:val="22"/>
-                    <w:lang w:val="en-US" w:eastAsia="en-US"/>
-                  </w:rPr>
-                </w:pPr>
-                <w:sdt>
-                  <w:sdtPr>
-                    <w:rPr>
-                      <w:rFonts w:ascii="Segoe UI" w:hAnsi="Segoe UI" w:eastAsia="Segoe UI" w:cs="Times New Roman"/>
-                      <w:color w:val="242424"/>
-                      <w:sz w:val="22"/>
-                      <w:szCs w:val="22"/>
-                      <w:lang w:val="en-US" w:eastAsia="en-US"/>
-                    </w:rPr>
-                    <w:alias w:val="UnitPrice"/>
-                    <w:tag w:val="#BC:InsertDataItem,DataItems/Header/Line/UnitPrice"/>
-                    <w:id w:val="-1253814634"/>
-                    <w:dataBinding w:prefixMappings="xmlns:ns0='urn:microsoft-dynamics-nav/reports/Standard_Sales_Invoice/1306/'" w:xpath="/ns0:NavWordReportXmlPart[1]/ns0:Header[1]/ns0:Line[1]/ns0:UnitPrice[1]" w:storeItemID="{00000000-0000-0000-0000-000000000000}"/>
-                    <w15:color w:val="808080"/>
-                    <w:text/>
-                  </w:sdtPr>
-                  <w:sdtContent>
-                    <w:proofErr w:type="spellStart"/>
-                    <w:r>
-                      <w:rPr>
-                        <w:rFonts w:ascii="Segoe UI" w:hAnsi="Segoe UI" w:eastAsia="Segoe UI" w:cs="Times New Roman"/>
-                        <w:color w:val="242424"/>
-                        <w:sz w:val="22"/>
-                        <w:szCs w:val="22"/>
-                        <w:lang w:val="en-US" w:eastAsia="en-US"/>
-                      </w:rPr>
-                      <w:t>UnitPrice</w:t>
-                    </w:r>
-                    <w:proofErr w:type="spellEnd"/>
-                  </w:sdtContent>
-                </w:sdt>
-              </w:p>
-            </w:tc>
-            <w:sdt>
-              <w:sdtPr>
-                <w:rPr>
-                  <w:rFonts w:ascii="Segoe UI" w:hAnsi="Segoe UI" w:eastAsia="Segoe UI" w:cs="Times New Roman"/>
-                  <w:color w:val="242424"/>
-                  <w:sz w:val="22"/>
-                  <w:szCs w:val="22"/>
-                  <w:lang w:val="en-US" w:eastAsia="en-US"/>
-                </w:rPr>
-                <w:alias w:val="LineDiscountPercentText_Line"/>
-                <w:tag w:val="#BC:InsertDataItem,DataItems/Header/Line/LineDiscountPercentText_Line"/>
-                <w:id w:val="-1902209822"/>
-                <w:placeholder>
-                  <w:docPart w:val="FBB02AF6EDB84AA5B701374F7AC9E91C"/>
-                </w:placeholder>
-                <w:dataBinding w:prefixMappings="xmlns:ns0='urn:microsoft-dynamics-nav/reports/Standard_Sales_Invoice/1306/'" w:xpath="/ns0:NavWordReportXmlPart[1]/ns0:Header[1]/ns0:Line[1]/ns0:LineDiscountPercentText_Line[1]" w:storeItemID="{00000000-0000-0000-0000-000000000000}"/>
-                <w15:color w:val="808080"/>
-                <w:text/>
-              </w:sdtPr>
-              <w:sdtContent>
-                <w:tc>
-                  <w:tcPr>
-                    <w:tcW w:w="1350" w:type="dxa"/>
-                    <w:vAlign w:val="center"/>
-                  </w:tcPr>
-                  <w:p>
-                    <w:pPr>
-                      <w:spacing w:before="0" w:after="0"/>
-                      <w:jc w:val="right"/>
-                      <w:cnfStyle w:val="000000010000" w:firstRow="0" w:lastRow="0" w:firstColumn="0" w:lastColumn="0" w:oddVBand="0" w:evenVBand="0" w:oddHBand="0" w:evenHBand="1" w:firstRowFirstColumn="0" w:firstRowLastColumn="0" w:lastRowFirstColumn="0" w:lastRowLastColumn="0"/>
-                      <w:rPr>
-                        <w:rFonts w:ascii="Segoe UI" w:hAnsi="Segoe UI" w:eastAsia="Segoe UI" w:cs="Times New Roman"/>
-                        <w:color w:val="242424"/>
-                        <w:sz w:val="22"/>
-                        <w:szCs w:val="22"/>
-                        <w:lang w:val="en-US" w:eastAsia="en-US"/>
-                      </w:rPr>
-                    </w:pPr>
-                    <w:proofErr w:type="spellStart"/>
-                    <w:r>
-                      <w:rPr>
-                        <w:rFonts w:ascii="Segoe UI" w:hAnsi="Segoe UI" w:eastAsia="Segoe UI" w:cs="Times New Roman"/>
-                        <w:color w:val="242424"/>
-                        <w:sz w:val="22"/>
-                        <w:szCs w:val="22"/>
-                        <w:lang w:val="en-US" w:eastAsia="en-US"/>
-                      </w:rPr>
-                      <w:t>LineDiscountPercentText_Line</w:t>
-                    </w:r>
-                    <w:proofErr w:type="spellEnd"/>
-                  </w:p>
-                </w:tc>
-              </w:sdtContent>
-            </w:sdt>
-            <w:sdt>
-              <w:sdtPr>
-                <w:rPr>
-                  <w:rFonts w:ascii="Segoe UI" w:hAnsi="Segoe UI" w:eastAsia="Segoe UI" w:cs="Times New Roman"/>
-                  <w:color w:val="242424"/>
-                  <w:sz w:val="22"/>
-                  <w:szCs w:val="22"/>
-                  <w:lang w:val="en-US" w:eastAsia="en-US"/>
-                </w:rPr>
-                <w:alias w:val="VATPct_Line"/>
-                <w:tag w:val="#BC:InsertDataItem,DataItems/Header/Line/VATPct_Line"/>
-                <w:id w:val="1436251310"/>
-                <w:dataBinding w:prefixMappings="xmlns:ns0='urn:microsoft-dynamics-nav/reports/Standard_Sales_Invoice/1306/'" w:xpath="/ns0:NavWordReportXmlPart[1]/ns0:Header[1]/ns0:Line[1]/ns0:VATPct_Line[1]" w:storeItemID="{00000000-0000-0000-0000-000000000000}"/>
-                <w15:color w:val="808080"/>
-                <w:text/>
-              </w:sdtPr>
-              <w:sdtContent>
-                <w:tc>
-                  <w:tcPr>
-                    <w:tcW w:w="1170" w:type="dxa"/>
-                    <w:vAlign w:val="center"/>
-                  </w:tcPr>
-                  <w:p>
-                    <w:pPr>
-                      <w:spacing w:before="0" w:after="0"/>
-                      <w:jc w:val="right"/>
-                      <w:cnfStyle w:val="000000010000" w:firstRow="0" w:lastRow="0" w:firstColumn="0" w:lastColumn="0" w:oddVBand="0" w:evenVBand="0" w:oddHBand="0" w:evenHBand="1" w:firstRowFirstColumn="0" w:firstRowLastColumn="0" w:lastRowFirstColumn="0" w:lastRowLastColumn="0"/>
-                      <w:rPr>
-                        <w:rFonts w:ascii="Segoe UI" w:hAnsi="Segoe UI" w:eastAsia="Segoe UI" w:cs="Times New Roman"/>
-                        <w:color w:val="242424"/>
-                        <w:sz w:val="22"/>
-                        <w:szCs w:val="22"/>
-                        <w:lang w:val="en-US" w:eastAsia="en-US"/>
-                      </w:rPr>
-                    </w:pPr>
-                    <w:proofErr w:type="spellStart"/>
-                    <w:r>
-                      <w:rPr>
-                        <w:rFonts w:ascii="Segoe UI" w:hAnsi="Segoe UI" w:eastAsia="Segoe UI" w:cs="Times New Roman"/>
-                        <w:color w:val="242424"/>
-                        <w:sz w:val="22"/>
-                        <w:szCs w:val="22"/>
-                        <w:lang w:val="en-US" w:eastAsia="en-US"/>
-                      </w:rPr>
-                      <w:t>VATPct_Line</w:t>
-                    </w:r>
-                    <w:proofErr w:type="spellEnd"/>
-                  </w:p>
-                </w:tc>
-              </w:sdtContent>
-            </w:sdt>
-            <w:tc>
-              <w:tcPr>
-                <w:tcW w:w="2912" w:type="dxa"/>
-                <w:vAlign w:val="center"/>
-              </w:tcPr>
-              <w:p>
-                <w:pPr>
-                  <w:spacing w:before="0" w:after="0"/>
-                  <w:jc w:val="right"/>
-                  <w:cnfStyle w:val="000000010000" w:firstRow="0" w:lastRow="0" w:firstColumn="0" w:lastColumn="0" w:oddVBand="0" w:evenVBand="0" w:oddHBand="0" w:evenHBand="1" w:firstRowFirstColumn="0" w:firstRowLastColumn="0" w:lastRowFirstColumn="0" w:lastRowLastColumn="0"/>
-                  <w:rPr>
-                    <w:rFonts w:ascii="Segoe UI" w:hAnsi="Segoe UI" w:eastAsia="Segoe UI" w:cs="Arial"/>
-                    <w:color w:val="242424"/>
-                    <w:sz w:val="22"/>
-                    <w:szCs w:val="22"/>
-                    <w:lang w:val="en-US" w:eastAsia="en-US"/>
-                  </w:rPr>
-                </w:pPr>
-                <w:sdt>
-                  <w:sdtPr>
-                    <w:rPr>
-                      <w:rFonts w:ascii="Segoe UI" w:hAnsi="Segoe UI" w:eastAsia="Segoe UI" w:cs="Times New Roman"/>
-                      <w:color w:val="242424"/>
-                      <w:sz w:val="22"/>
-                      <w:szCs w:val="22"/>
-                      <w:lang w:val="en-US" w:eastAsia="en-US"/>
-                    </w:rPr>
-                    <w:alias w:val="LineAmount_Line"/>
-                    <w:tag w:val="#BC:InsertDataItem,DataItems/Header/Line/LineAmount_Line"/>
-                    <w:id w:val="787541011"/>
-                    <w:dataBinding w:prefixMappings="xmlns:ns0='urn:microsoft-dynamics-nav/reports/Standard_Sales_Invoice/1306/'" w:xpath="/ns0:NavWordReportXmlPart[1]/ns0:Header[1]/ns0:Line[1]/ns0:LineAmount_Line[1]" w:storeItemID="{00000000-0000-0000-0000-000000000000}"/>
-                    <w15:color w:val="808080"/>
-                    <w:text/>
-                  </w:sdtPr>
-                  <w:sdtContent>
-                    <w:proofErr w:type="spellStart"/>
-                    <w:r>
-                      <w:rPr>
-                        <w:rFonts w:ascii="Segoe UI" w:hAnsi="Segoe UI" w:eastAsia="Segoe UI" w:cs="Times New Roman"/>
-                        <w:color w:val="242424"/>
-                        <w:sz w:val="22"/>
-                        <w:szCs w:val="22"/>
-                        <w:lang w:val="en-US" w:eastAsia="en-US"/>
-                      </w:rPr>
-                      <w:t>LineAmount_Line</w:t>
-                    </w:r>
-                    <w:proofErr w:type="spellEnd"/>
-                  </w:sdtContent>
-                </w:sdt>
-                <w:r>
-                  <w:rPr>
-                    <w:rFonts w:ascii="Segoe UI" w:hAnsi="Segoe UI" w:eastAsia="Segoe UI" w:cs="Times New Roman"/>
-                    <w:color w:val="242424"/>
-                    <w:sz w:val="22"/>
-                    <w:szCs w:val="22"/>
-                    <w:lang w:val="en-US" w:eastAsia="en-US"/>
-                  </w:rPr>
-                  <w:t> </w:t>
-                </w:r>
-              </w:p>
-            </w:tc>
-          </w:tr>
+              </w:tr>
+            </w:sdtContent>
+          </w:sdt>
         </w:sdtContent>
       </w:sdt>
     </w:tbl>
     <w:p/>
     <w:tbl>
       <w:tblPr>
-        <w:tblStyle w:val="CLSequoiatablestyle0211"/>
-        <w:tblW w:w="15422" w:type="dxa"/>
-        <w:tblLook w:val="06C0" w:firstRow="0" w:lastRow="1" w:firstColumn="1" w:lastColumn="0" w:noHBand="1" w:noVBand="1"/>
+        <w:tblStyle w:val="BCTotalsTable"/>
+        <w:tblW w:w="5000" w:type="pct"/>
+        <w:tblLook w:val="0640" w:firstRow="0" w:lastRow="1" w:firstColumn="0" w:lastColumn="0" w:noHBand="1" w:noVBand="1"/>
         <w:tblCaption w:val="Detailed Totals Block"/>
+        <w:tblDescription w:val="Document totals."/>
       </w:tblPr>
       <w:tblGrid>
-        <w:gridCol w:w="10169"/>
+        <w:gridCol w:w="10172"/>
         <w:gridCol w:w="879"/>
-        <w:gridCol w:w="4374"/>
+        <w:gridCol w:w="4375"/>
       </w:tblGrid>
       <w:tr>
         <w:trPr>
@@ -2562,10 +1979,6 @@
         <w:sdt>
           <w:sdtPr>
             <w:rPr>
-              <w:rFonts w:eastAsia="Times New Roman" w:cs="Times New Roman"/>
-              <w:color w:val="242424"/>
-              <w:sz w:val="22"/>
-              <w:szCs w:val="22"/>
               <w:lang w:val="en-US" w:eastAsia="en-US"/>
             </w:rPr>
             <w:alias w:val="Description_ReportTotalsLine"/>
@@ -2574,35 +1987,26 @@
             <w:placeholder>
               <w:docPart w:val="0013D710346D46BE89D6EE8549FF096A"/>
             </w:placeholder>
+            <w:dataBinding w:prefixMappings="xmlns:ns0='urn:microsoft-dynamics-nav/reports/Standard_Sales_Invoice/1306/'" w:xpath="/ns0:NavWordReportXmlPart[1]/ns0:Header[1]/ns0:ReportTotalsLine[1]/ns0:Description_ReportTotalsLine[1]" w:storeItemID="{00000000-0000-0000-0000-000000000000}"/>
             <w15:color w:val="808080"/>
             <w:text/>
-            <w:dataBinding w:prefixMappings="xmlns:ns0='urn:microsoft-dynamics-nav/reports/Standard_Sales_Invoice/1306/'" w:xpath="/ns0:NavWordReportXmlPart[1]/ns0:Header[1]/ns0:ReportTotalsLine[1]/ns0:Description_ReportTotalsLine[1]"/>
           </w:sdtPr>
+          <w:sdtEndPr/>
           <w:sdtContent>
             <w:tc>
               <w:tcPr>
-                <w:cnfStyle w:val="001000000000" w:firstRow="0" w:lastRow="0" w:firstColumn="1" w:lastColumn="0" w:oddVBand="0" w:evenVBand="0" w:oddHBand="0" w:evenHBand="0" w:firstRowFirstColumn="0" w:firstRowLastColumn="0" w:lastRowFirstColumn="0" w:lastRowLastColumn="0"/>
-                <w:tcW w:w="9616" w:type="dxa"/>
-                <w:vAlign w:val="center"/>
+                <w:tcW w:w="3297" w:type="pct"/>
               </w:tcPr>
               <w:p>
                 <w:pPr>
-                  <w:spacing w:line="240" w:lineRule="exact"/>
-                  <w:rPr>
-                    <w:rFonts w:eastAsia="Times New Roman" w:cs="Times New Roman"/>
-                    <w:color w:val="242424"/>
-                    <w:sz w:val="22"/>
-                    <w:szCs w:val="22"/>
+                  <w:pStyle w:val="NoSpacing"/>
+                  <w:rPr>
                     <w:lang w:val="en-US" w:eastAsia="en-US"/>
                   </w:rPr>
                 </w:pPr>
                 <w:proofErr w:type="spellStart"/>
                 <w:r>
                   <w:rPr>
-                    <w:rFonts w:eastAsia="Times New Roman" w:cs="Times New Roman"/>
-                    <w:color w:val="242424"/>
-                    <w:sz w:val="22"/>
-                    <w:szCs w:val="22"/>
                     <w:lang w:val="en-US" w:eastAsia="en-US"/>
                   </w:rPr>
                   <w:t>Description_ReportTotalsLine</w:t>
@@ -2614,18 +2018,12 @@
         </w:sdt>
         <w:tc>
           <w:tcPr>
-            <w:tcW w:w="831" w:type="dxa"/>
-            <w:vAlign w:val="center"/>
+            <w:tcW w:w="285" w:type="pct"/>
           </w:tcPr>
           <w:p>
             <w:pPr>
-              <w:spacing w:line="240" w:lineRule="exact"/>
-              <w:cnfStyle w:val="000000000000" w:firstRow="0" w:lastRow="0" w:firstColumn="0" w:lastColumn="0" w:oddVBand="0" w:evenVBand="0" w:oddHBand="0" w:evenHBand="0" w:firstRowFirstColumn="0" w:firstRowLastColumn="0" w:lastRowFirstColumn="0" w:lastRowLastColumn="0"/>
+              <w:pStyle w:val="NoSpacing"/>
               <w:rPr>
-                <w:rFonts w:eastAsia="Segoe UI" w:cs="Arial"/>
-                <w:color w:val="242424"/>
-                <w:sz w:val="22"/>
-                <w:szCs w:val="22"/>
                 <w:lang w:val="en-US" w:eastAsia="en-US"/>
               </w:rPr>
             </w:pPr>
@@ -2634,10 +2032,6 @@
         <w:sdt>
           <w:sdtPr>
             <w:rPr>
-              <w:rFonts w:eastAsia="Segoe UI" w:cs="Arial"/>
-              <w:color w:val="242424"/>
-              <w:sz w:val="22"/>
-              <w:szCs w:val="22"/>
               <w:lang w:val="en-US" w:eastAsia="en-US"/>
             </w:rPr>
             <w:alias w:val="AmountFormatted_ReportTotalsLine"/>
@@ -2646,36 +2040,27 @@
             <w:placeholder>
               <w:docPart w:val="0013D710346D46BE89D6EE8549FF096A"/>
             </w:placeholder>
+            <w:dataBinding w:prefixMappings="xmlns:ns0='urn:microsoft-dynamics-nav/reports/Standard_Sales_Invoice/1306/'" w:xpath="/ns0:NavWordReportXmlPart[1]/ns0:Header[1]/ns0:ReportTotalsLine[1]/ns0:AmountFormatted_ReportTotalsLine[1]" w:storeItemID="{00000000-0000-0000-0000-000000000000}"/>
             <w15:color w:val="808080"/>
             <w:text/>
-            <w:dataBinding w:prefixMappings="xmlns:ns0='urn:microsoft-dynamics-nav/reports/Standard_Sales_Invoice/1306/'" w:xpath="/ns0:NavWordReportXmlPart[1]/ns0:Header[1]/ns0:ReportTotalsLine[1]/ns0:AmountFormatted_ReportTotalsLine[1]"/>
           </w:sdtPr>
+          <w:sdtEndPr/>
           <w:sdtContent>
             <w:tc>
               <w:tcPr>
-                <w:tcW w:w="4136" w:type="dxa"/>
-                <w:vAlign w:val="center"/>
+                <w:tcW w:w="1418" w:type="pct"/>
               </w:tcPr>
               <w:p>
                 <w:pPr>
-                  <w:spacing w:line="240" w:lineRule="exact"/>
+                  <w:pStyle w:val="BCNumber"/>
                   <w:jc w:val="right"/>
-                  <w:cnfStyle w:val="000000000000" w:firstRow="0" w:lastRow="0" w:firstColumn="0" w:lastColumn="0" w:oddVBand="0" w:evenVBand="0" w:oddHBand="0" w:evenHBand="0" w:firstRowFirstColumn="0" w:firstRowLastColumn="0" w:lastRowFirstColumn="0" w:lastRowLastColumn="0"/>
-                  <w:rPr>
-                    <w:rFonts w:eastAsia="Segoe UI" w:cs="Arial"/>
-                    <w:color w:val="242424"/>
-                    <w:sz w:val="22"/>
-                    <w:szCs w:val="22"/>
+                  <w:rPr>
                     <w:lang w:val="en-US" w:eastAsia="en-US"/>
                   </w:rPr>
                 </w:pPr>
                 <w:proofErr w:type="spellStart"/>
                 <w:r>
                   <w:rPr>
-                    <w:rFonts w:eastAsia="Segoe UI" w:cs="Arial"/>
-                    <w:color w:val="242424"/>
-                    <w:sz w:val="22"/>
-                    <w:szCs w:val="22"/>
                     <w:lang w:val="en-US" w:eastAsia="en-US"/>
                   </w:rPr>
                   <w:t>AmountFormatted_ReportTotalsLine</w:t>
@@ -2693,10 +2078,6 @@
         <w:sdt>
           <w:sdtPr>
             <w:rPr>
-              <w:rFonts w:eastAsia="Times New Roman" w:cs="Times New Roman"/>
-              <w:color w:val="242424"/>
-              <w:sz w:val="22"/>
-              <w:szCs w:val="22"/>
               <w:lang w:val="en-US" w:eastAsia="en-US"/>
             </w:rPr>
             <w:alias w:val="TotalCO2e_Lbl"/>
@@ -2705,37 +2086,25 @@
             <w:placeholder>
               <w:docPart w:val="0013D710346D46BE89D6EE8549FF096A"/>
             </w:placeholder>
+            <w:dataBinding w:prefixMappings="xmlns:ns0='urn:microsoft-dynamics-nav/reports/Standard_Sales_Invoice/1306/'" w:xpath="/ns0:NavWordReportXmlPart[1]/ns0:Header[1]/ns0:TotalCO2e_Lbl[1]" w:storeItemID="{00000000-0000-0000-0000-000000000000}"/>
             <w15:color w:val="808080"/>
             <w:text/>
-            <w:dataBinding w:prefixMappings="xmlns:ns0='urn:microsoft-dynamics-nav/reports/Standard_Sales_Invoice/1306/'" w:xpath="/ns0:NavWordReportXmlPart[1]/ns0:Header[1]/ns0:TotalCO2e_Lbl[1]"/>
           </w:sdtPr>
+          <w:sdtEndPr/>
           <w:sdtContent>
             <w:tc>
               <w:tcPr>
-                <w:cnfStyle w:val="001000000000" w:firstRow="0" w:lastRow="0" w:firstColumn="1" w:lastColumn="0" w:oddVBand="0" w:evenVBand="0" w:oddHBand="0" w:evenHBand="0" w:firstRowFirstColumn="0" w:firstRowLastColumn="0" w:lastRowFirstColumn="0" w:lastRowLastColumn="0"/>
-                <w:tcW w:w="9616" w:type="dxa"/>
-                <w:tcBorders>
-                  <w:bottom w:val="single" w:color="auto" w:sz="4" w:space="0"/>
-                </w:tcBorders>
-                <w:vAlign w:val="center"/>
+                <w:tcW w:w="3297" w:type="pct"/>
               </w:tcPr>
               <w:p>
                 <w:pPr>
-                  <w:spacing w:line="240" w:lineRule="exact"/>
-                  <w:rPr>
-                    <w:rFonts w:eastAsia="Times New Roman" w:cs="Times New Roman"/>
-                    <w:color w:val="242424"/>
-                    <w:sz w:val="22"/>
-                    <w:szCs w:val="22"/>
+                  <w:pStyle w:val="NoSpacing"/>
+                  <w:rPr>
                     <w:lang w:val="en-US" w:eastAsia="en-US"/>
                   </w:rPr>
                 </w:pPr>
                 <w:r>
                   <w:rPr>
-                    <w:rFonts w:eastAsia="Times New Roman" w:cs="Times New Roman"/>
-                    <w:color w:val="242424"/>
-                    <w:sz w:val="22"/>
-                    <w:szCs w:val="22"/>
                     <w:lang w:val="en-US" w:eastAsia="en-US"/>
                   </w:rPr>
                   <w:t>TotalCO2e_Lbl</w:t>
@@ -2746,21 +2115,12 @@
         </w:sdt>
         <w:tc>
           <w:tcPr>
-            <w:tcW w:w="831" w:type="dxa"/>
-            <w:tcBorders>
-              <w:bottom w:val="single" w:color="auto" w:sz="4" w:space="0"/>
-            </w:tcBorders>
-            <w:vAlign w:val="center"/>
+            <w:tcW w:w="285" w:type="pct"/>
           </w:tcPr>
           <w:p>
             <w:pPr>
-              <w:spacing w:line="240" w:lineRule="exact"/>
-              <w:cnfStyle w:val="000000000000" w:firstRow="0" w:lastRow="0" w:firstColumn="0" w:lastColumn="0" w:oddVBand="0" w:evenVBand="0" w:oddHBand="0" w:evenHBand="0" w:firstRowFirstColumn="0" w:firstRowLastColumn="0" w:lastRowFirstColumn="0" w:lastRowLastColumn="0"/>
+              <w:pStyle w:val="NoSpacing"/>
               <w:rPr>
-                <w:rFonts w:eastAsia="Segoe UI" w:cs="Arial"/>
-                <w:color w:val="242424"/>
-                <w:sz w:val="22"/>
-                <w:szCs w:val="22"/>
                 <w:lang w:val="en-US" w:eastAsia="en-US"/>
               </w:rPr>
             </w:pPr>
@@ -2769,10 +2129,6 @@
         <w:sdt>
           <w:sdtPr>
             <w:rPr>
-              <w:rFonts w:eastAsia="Segoe UI" w:cs="Arial"/>
-              <w:color w:val="242424"/>
-              <w:sz w:val="22"/>
-              <w:szCs w:val="22"/>
               <w:lang w:val="en-US" w:eastAsia="en-US"/>
             </w:rPr>
             <w:alias w:val="TotalCO2e"/>
@@ -2781,38 +2137,26 @@
             <w:placeholder>
               <w:docPart w:val="0013D710346D46BE89D6EE8549FF096A"/>
             </w:placeholder>
+            <w:dataBinding w:prefixMappings="xmlns:ns0='urn:microsoft-dynamics-nav/reports/Standard_Sales_Invoice/1306/'" w:xpath="/ns0:NavWordReportXmlPart[1]/ns0:Header[1]/ns0:Totals[1]/ns0:TotalCO2e[1]" w:storeItemID="{00000000-0000-0000-0000-000000000000}"/>
             <w15:color w:val="808080"/>
             <w:text/>
-            <w:dataBinding w:prefixMappings="xmlns:ns0='urn:microsoft-dynamics-nav/reports/Standard_Sales_Invoice/1306/'" w:xpath="/ns0:NavWordReportXmlPart[1]/ns0:Header[1]/ns0:Totals[1]/ns0:TotalCO2e[1]"/>
           </w:sdtPr>
+          <w:sdtEndPr/>
           <w:sdtContent>
             <w:tc>
               <w:tcPr>
-                <w:tcW w:w="4136" w:type="dxa"/>
-                <w:tcBorders>
-                  <w:bottom w:val="single" w:color="auto" w:sz="4" w:space="0"/>
-                </w:tcBorders>
-                <w:vAlign w:val="center"/>
+                <w:tcW w:w="1418" w:type="pct"/>
               </w:tcPr>
               <w:p>
                 <w:pPr>
-                  <w:spacing w:line="240" w:lineRule="exact"/>
+                  <w:pStyle w:val="BCNumber"/>
                   <w:jc w:val="right"/>
-                  <w:cnfStyle w:val="000000000000" w:firstRow="0" w:lastRow="0" w:firstColumn="0" w:lastColumn="0" w:oddVBand="0" w:evenVBand="0" w:oddHBand="0" w:evenHBand="0" w:firstRowFirstColumn="0" w:firstRowLastColumn="0" w:lastRowFirstColumn="0" w:lastRowLastColumn="0"/>
-                  <w:rPr>
-                    <w:rFonts w:eastAsia="Segoe UI" w:cs="Arial"/>
-                    <w:color w:val="242424"/>
-                    <w:sz w:val="22"/>
-                    <w:szCs w:val="22"/>
+                  <w:rPr>
                     <w:lang w:val="en-US" w:eastAsia="en-US"/>
                   </w:rPr>
                 </w:pPr>
                 <w:r>
                   <w:rPr>
-                    <w:rFonts w:eastAsia="Segoe UI" w:cs="Arial"/>
-                    <w:color w:val="242424"/>
-                    <w:sz w:val="22"/>
-                    <w:szCs w:val="22"/>
                     <w:lang w:val="en-US" w:eastAsia="en-US"/>
                   </w:rPr>
                   <w:t>TotalCO2e</w:t>
@@ -2824,16 +2168,12 @@
       </w:tr>
       <w:tr>
         <w:trPr>
+          <w:cnfStyle w:val="010000000000" w:firstRow="0" w:lastRow="1" w:firstColumn="0" w:lastColumn="0" w:oddVBand="0" w:evenVBand="0" w:oddHBand="0" w:evenHBand="0" w:firstRowFirstColumn="0" w:firstRowLastColumn="0" w:lastRowFirstColumn="0" w:lastRowLastColumn="0"/>
           <w:trHeight w:val="490"/>
         </w:trPr>
         <w:sdt>
           <w:sdtPr>
             <w:rPr>
-              <w:rFonts w:ascii="Segoe UI Semibold" w:hAnsi="Segoe UI Semibold" w:eastAsia="Times New Roman" w:cs="Segoe UI Semibold"/>
-              <w:b/>
-              <w:bCs w:val="0"/>
-              <w:sz w:val="22"/>
-              <w:szCs w:val="22"/>
               <w:lang w:val="en-US" w:eastAsia="en-US"/>
             </w:rPr>
             <w:alias w:val="TotalText"/>
@@ -2842,41 +2182,26 @@
             <w:placeholder>
               <w:docPart w:val="0013D710346D46BE89D6EE8549FF096A"/>
             </w:placeholder>
+            <w:dataBinding w:prefixMappings="xmlns:ns0='urn:microsoft-dynamics-nav/reports/Standard_Sales_Invoice/1306/'" w:xpath="/ns0:NavWordReportXmlPart[1]/ns0:Header[1]/ns0:Totals[1]/ns0:TotalText[1]" w:storeItemID="{00000000-0000-0000-0000-000000000000}"/>
             <w15:color w:val="808080"/>
             <w:text/>
-            <w:dataBinding w:prefixMappings="xmlns:ns0='urn:microsoft-dynamics-nav/reports/Standard_Sales_Invoice/1306/'" w:xpath="/ns0:NavWordReportXmlPart[1]/ns0:Header[1]/ns0:Totals[1]/ns0:TotalText[1]"/>
           </w:sdtPr>
+          <w:sdtEndPr/>
           <w:sdtContent>
             <w:tc>
               <w:tcPr>
-                <w:cnfStyle w:val="001000000000" w:firstRow="0" w:lastRow="0" w:firstColumn="1" w:lastColumn="0" w:oddVBand="0" w:evenVBand="0" w:oddHBand="0" w:evenHBand="0" w:firstRowFirstColumn="0" w:firstRowLastColumn="0" w:lastRowFirstColumn="0" w:lastRowLastColumn="0"/>
-                <w:tcW w:w="9616" w:type="dxa"/>
-                <w:tcBorders>
-                  <w:top w:val="single" w:color="auto" w:sz="4" w:space="0"/>
-                  <w:bottom w:val="single" w:color="auto" w:sz="8" w:space="0"/>
-                </w:tcBorders>
-                <w:vAlign w:val="center"/>
+                <w:tcW w:w="3297" w:type="pct"/>
               </w:tcPr>
               <w:p>
                 <w:pPr>
-                  <w:pStyle w:val="Heading2"/>
-                  <w:rPr>
-                    <w:rFonts w:ascii="Segoe UI Semibold" w:hAnsi="Segoe UI Semibold" w:eastAsia="Times New Roman" w:cs="Segoe UI Semibold"/>
-                    <w:b/>
-                    <w:bCs w:val="0"/>
-                    <w:sz w:val="22"/>
-                    <w:szCs w:val="22"/>
+                  <w:pStyle w:val="BCLabel"/>
+                  <w:rPr>
                     <w:lang w:val="en-US" w:eastAsia="en-US"/>
                   </w:rPr>
                 </w:pPr>
                 <w:proofErr w:type="spellStart"/>
                 <w:r>
                   <w:rPr>
-                    <w:rFonts w:ascii="Segoe UI Semibold" w:hAnsi="Segoe UI Semibold" w:eastAsia="Times New Roman" w:cs="Segoe UI Semibold"/>
-                    <w:b/>
-                    <w:bCs w:val="0"/>
-                    <w:sz w:val="22"/>
-                    <w:szCs w:val="22"/>
                     <w:lang w:val="en-US" w:eastAsia="en-US"/>
                   </w:rPr>
                   <w:t>TotalText</w:t>
@@ -2888,22 +2213,12 @@
         </w:sdt>
         <w:tc>
           <w:tcPr>
-            <w:tcW w:w="831" w:type="dxa"/>
-            <w:tcBorders>
-              <w:top w:val="single" w:color="auto" w:sz="4" w:space="0"/>
-              <w:bottom w:val="single" w:color="auto" w:sz="8" w:space="0"/>
-            </w:tcBorders>
-            <w:vAlign w:val="center"/>
+            <w:tcW w:w="285" w:type="pct"/>
           </w:tcPr>
           <w:p>
             <w:pPr>
-              <w:pStyle w:val="Heading2"/>
-              <w:cnfStyle w:val="000000000000" w:firstRow="0" w:lastRow="0" w:firstColumn="0" w:lastColumn="0" w:oddVBand="0" w:evenVBand="0" w:oddHBand="0" w:evenHBand="0" w:firstRowFirstColumn="0" w:firstRowLastColumn="0" w:lastRowFirstColumn="0" w:lastRowLastColumn="0"/>
+              <w:pStyle w:val="BCLabel"/>
               <w:rPr>
-                <w:rFonts w:ascii="Segoe UI Semibold" w:hAnsi="Segoe UI Semibold" w:eastAsia="Times New Roman" w:cs="Segoe UI Semibold"/>
-                <w:b/>
-                <w:sz w:val="22"/>
-                <w:szCs w:val="22"/>
                 <w:lang w:val="en-US" w:eastAsia="en-US"/>
               </w:rPr>
             </w:pPr>
@@ -2911,32 +2226,18 @@
         </w:tc>
         <w:tc>
           <w:tcPr>
-            <w:tcW w:w="4136" w:type="dxa"/>
-            <w:tcBorders>
-              <w:top w:val="single" w:color="auto" w:sz="4" w:space="0"/>
-              <w:bottom w:val="single" w:color="auto" w:sz="8" w:space="0"/>
-            </w:tcBorders>
-            <w:vAlign w:val="center"/>
+            <w:tcW w:w="1418" w:type="pct"/>
           </w:tcPr>
           <w:p>
             <w:pPr>
-              <w:pStyle w:val="Heading2"/>
+              <w:pStyle w:val="BCLabelNumber"/>
               <w:jc w:val="right"/>
-              <w:cnfStyle w:val="000000000000" w:firstRow="0" w:lastRow="0" w:firstColumn="0" w:lastColumn="0" w:oddVBand="0" w:evenVBand="0" w:oddHBand="0" w:evenHBand="0" w:firstRowFirstColumn="0" w:firstRowLastColumn="0" w:lastRowFirstColumn="0" w:lastRowLastColumn="0"/>
               <w:rPr>
-                <w:rFonts w:ascii="Segoe UI Semibold" w:hAnsi="Segoe UI Semibold" w:eastAsia="Times New Roman" w:cs="Segoe UI Semibold"/>
-                <w:b/>
-                <w:sz w:val="22"/>
-                <w:szCs w:val="22"/>
                 <w:lang w:val="en-US" w:eastAsia="en-US"/>
               </w:rPr>
             </w:pPr>
             <w:r>
               <w:rPr>
-                <w:rFonts w:ascii="Segoe UI Semibold" w:hAnsi="Segoe UI Semibold" w:eastAsia="Times New Roman" w:cs="Segoe UI Semibold"/>
-                <w:b/>
-                <w:sz w:val="22"/>
-                <w:szCs w:val="22"/>
                 <w:lang w:val="en-US" w:eastAsia="en-US"/>
               </w:rPr>
               <w:t> </w:t>
@@ -2945,10 +2246,6 @@
             <w:sdt>
               <w:sdtPr>
                 <w:rPr>
-                  <w:rFonts w:ascii="Segoe UI Semibold" w:hAnsi="Segoe UI Semibold" w:eastAsia="Times New Roman" w:cs="Segoe UI Semibold"/>
-                  <w:b/>
-                  <w:sz w:val="22"/>
-                  <w:szCs w:val="22"/>
                   <w:lang w:val="en-US" w:eastAsia="en-US"/>
                 </w:rPr>
                 <w:alias w:val="TotalAmountIncludingVAT"/>
@@ -2958,13 +2255,10 @@
                 <w15:color w:val="808080"/>
                 <w:text/>
               </w:sdtPr>
+              <w:sdtEndPr/>
               <w:sdtContent>
                 <w:r>
                   <w:rPr>
-                    <w:rFonts w:ascii="Segoe UI Semibold" w:hAnsi="Segoe UI Semibold" w:eastAsia="Times New Roman" w:cs="Segoe UI Semibold"/>
-                    <w:b/>
-                    <w:sz w:val="22"/>
-                    <w:szCs w:val="22"/>
                     <w:lang w:val="en-US" w:eastAsia="en-US"/>
                   </w:rPr>
                   <w:t>TotalAmountIncludingVAT</w:t>
@@ -2975,6 +2269,21 @@
           </w:p>
         </w:tc>
       </w:tr>
+    </w:tbl>
+    <w:p/>
+    <w:tbl>
+      <w:tblPr>
+        <w:tblStyle w:val="BCTotalsTable"/>
+        <w:tblW w:w="5000" w:type="pct"/>
+        <w:tblLook w:val="0640" w:firstRow="0" w:lastRow="1" w:firstColumn="0" w:lastColumn="0" w:noHBand="1" w:noVBand="1"/>
+        <w:tblCaption w:val="Detailed Totals Block"/>
+        <w:tblDescription w:val="Document totals."/>
+      </w:tblPr>
+      <w:tblGrid>
+        <w:gridCol w:w="10172"/>
+        <w:gridCol w:w="879"/>
+        <w:gridCol w:w="4375"/>
+      </w:tblGrid>
       <w:tr>
         <w:trPr>
           <w:cnfStyle w:val="010000000000" w:firstRow="0" w:lastRow="1" w:firstColumn="0" w:lastColumn="0" w:oddVBand="0" w:evenVBand="0" w:oddHBand="0" w:evenHBand="0" w:firstRowFirstColumn="0" w:firstRowLastColumn="0" w:lastRowFirstColumn="0" w:lastRowLastColumn="0"/>
@@ -2983,12 +2292,6 @@
         <w:sdt>
           <w:sdtPr>
             <w:rPr>
-              <w:rFonts w:eastAsia="Segoe UI" w:cs="Times New Roman" w:asciiTheme="minorHAnsi" w:hAnsiTheme="minorHAnsi"/>
-              <w:b w:val="0"/>
-              <w:bCs w:val="0"/>
-              <w:color w:val="242424"/>
-              <w:sz w:val="22"/>
-              <w:szCs w:val="22"/>
               <w:lang w:val="en-US" w:eastAsia="en-US"/>
             </w:rPr>
             <w:alias w:val="Description_VATClauseLine"/>
@@ -2997,44 +2300,27 @@
             <w:placeholder>
               <w:docPart w:val="0013D710346D46BE89D6EE8549FF096A"/>
             </w:placeholder>
+            <w:dataBinding w:prefixMappings="xmlns:ns0='urn:microsoft-dynamics-nav/reports/Standard_Sales_Invoice/1306/'" w:xpath="/ns0:NavWordReportXmlPart[1]/ns0:Header[1]/ns0:VATClauseLine[1]/ns0:Description_VATClauseLine[1]" w:storeItemID="{00000000-0000-0000-0000-000000000000}"/>
             <w15:color w:val="808080"/>
             <w:text/>
-            <w:dataBinding w:prefixMappings="xmlns:ns0='urn:microsoft-dynamics-nav/reports/Standard_Sales_Invoice/1306/'" w:xpath="/ns0:NavWordReportXmlPart[1]/ns0:Header[1]/ns0:VATClauseLine[1]/ns0:Description_VATClauseLine[1]"/>
           </w:sdtPr>
+          <w:sdtEndPr/>
           <w:sdtContent>
             <w:tc>
               <w:tcPr>
-                <w:cnfStyle w:val="001000000000" w:firstRow="0" w:lastRow="0" w:firstColumn="1" w:lastColumn="0" w:oddVBand="0" w:evenVBand="0" w:oddHBand="0" w:evenHBand="0" w:firstRowFirstColumn="0" w:firstRowLastColumn="0" w:lastRowFirstColumn="0" w:lastRowLastColumn="0"/>
-                <w:tcW w:w="9616" w:type="dxa"/>
-                <w:tcBorders>
-                  <w:top w:val="single" w:color="auto" w:sz="8" w:space="0"/>
-                  <w:bottom w:val="none" w:color="auto" w:sz="0" w:space="0"/>
-                </w:tcBorders>
-                <w:vAlign w:val="center"/>
+                <w:tcW w:w="3297" w:type="pct"/>
               </w:tcPr>
               <w:p>
                 <w:pPr>
-                  <w:spacing w:line="240" w:lineRule="exact"/>
+                  <w:pStyle w:val="BCLabel"/>
                   <w:textAlignment w:val="baseline"/>
                   <w:rPr>
-                    <w:rFonts w:eastAsia="Segoe UI" w:cs="Times New Roman" w:asciiTheme="minorHAnsi" w:hAnsiTheme="minorHAnsi"/>
-                    <w:b w:val="0"/>
-                    <w:bCs w:val="0"/>
-                    <w:color w:val="242424"/>
-                    <w:sz w:val="22"/>
-                    <w:szCs w:val="22"/>
                     <w:lang w:val="en-US" w:eastAsia="en-US"/>
                   </w:rPr>
                 </w:pPr>
                 <w:proofErr w:type="spellStart"/>
                 <w:r>
                   <w:rPr>
-                    <w:rFonts w:eastAsia="Segoe UI" w:cs="Times New Roman" w:asciiTheme="minorHAnsi" w:hAnsiTheme="minorHAnsi"/>
-                    <w:b w:val="0"/>
-                    <w:bCs w:val="0"/>
-                    <w:color w:val="242424"/>
-                    <w:sz w:val="22"/>
-                    <w:szCs w:val="22"/>
                     <w:lang w:val="en-US" w:eastAsia="en-US"/>
                   </w:rPr>
                   <w:t>Description_VATClauseLine</w:t>
@@ -3046,24 +2332,12 @@
         </w:sdt>
         <w:tc>
           <w:tcPr>
-            <w:tcW w:w="831" w:type="dxa"/>
-            <w:tcBorders>
-              <w:top w:val="single" w:color="auto" w:sz="8" w:space="0"/>
-              <w:bottom w:val="none" w:color="auto" w:sz="0" w:space="0"/>
-            </w:tcBorders>
-            <w:vAlign w:val="center"/>
+            <w:tcW w:w="285" w:type="pct"/>
           </w:tcPr>
           <w:p>
             <w:pPr>
-              <w:spacing w:line="240" w:lineRule="exact"/>
-              <w:cnfStyle w:val="010000000000" w:firstRow="0" w:lastRow="1" w:firstColumn="0" w:lastColumn="0" w:oddVBand="0" w:evenVBand="0" w:oddHBand="0" w:evenHBand="0" w:firstRowFirstColumn="0" w:firstRowLastColumn="0" w:lastRowFirstColumn="0" w:lastRowLastColumn="0"/>
+              <w:pStyle w:val="BCLabel"/>
               <w:rPr>
-                <w:rFonts w:eastAsia="Segoe UI" w:cs="Arial" w:asciiTheme="minorHAnsi" w:hAnsiTheme="minorHAnsi"/>
-                <w:b w:val="0"/>
-                <w:bCs w:val="0"/>
-                <w:color w:val="242424"/>
-                <w:sz w:val="22"/>
-                <w:szCs w:val="22"/>
                 <w:lang w:val="en-US" w:eastAsia="en-US"/>
               </w:rPr>
             </w:pPr>
@@ -3072,12 +2346,6 @@
         <w:sdt>
           <w:sdtPr>
             <w:rPr>
-              <w:rFonts w:eastAsia="Times New Roman" w:cs="Segoe UI" w:asciiTheme="minorHAnsi" w:hAnsiTheme="minorHAnsi"/>
-              <w:b w:val="0"/>
-              <w:bCs w:val="0"/>
-              <w:color w:val="242424"/>
-              <w:sz w:val="22"/>
-              <w:szCs w:val="22"/>
               <w:lang w:val="en-US" w:eastAsia="en-US"/>
             </w:rPr>
             <w:alias w:val="VATAmount_VATClauseLine"/>
@@ -3086,44 +2354,27 @@
             <w:placeholder>
               <w:docPart w:val="0013D710346D46BE89D6EE8549FF096A"/>
             </w:placeholder>
+            <w:dataBinding w:prefixMappings="xmlns:ns0='urn:microsoft-dynamics-nav/reports/Standard_Sales_Invoice/1306/'" w:xpath="/ns0:NavWordReportXmlPart[1]/ns0:Header[1]/ns0:VATClauseLine[1]/ns0:VATAmount_VATClauseLine[1]" w:storeItemID="{00000000-0000-0000-0000-000000000000}"/>
             <w15:color w:val="808080"/>
             <w:text/>
-            <w:dataBinding w:prefixMappings="xmlns:ns0='urn:microsoft-dynamics-nav/reports/Standard_Sales_Invoice/1306/'" w:xpath="/ns0:NavWordReportXmlPart[1]/ns0:Header[1]/ns0:VATClauseLine[1]/ns0:VATAmount_VATClauseLine[1]"/>
           </w:sdtPr>
+          <w:sdtEndPr/>
           <w:sdtContent>
             <w:tc>
               <w:tcPr>
-                <w:tcW w:w="4136" w:type="dxa"/>
-                <w:tcBorders>
-                  <w:top w:val="single" w:color="auto" w:sz="8" w:space="0"/>
-                  <w:bottom w:val="none" w:color="auto" w:sz="0" w:space="0"/>
-                </w:tcBorders>
-                <w:vAlign w:val="center"/>
+                <w:tcW w:w="1418" w:type="pct"/>
               </w:tcPr>
               <w:p>
                 <w:pPr>
-                  <w:spacing w:line="240" w:lineRule="exact"/>
+                  <w:pStyle w:val="BCLabelNumber"/>
                   <w:jc w:val="right"/>
-                  <w:cnfStyle w:val="010000000000" w:firstRow="0" w:lastRow="1" w:firstColumn="0" w:lastColumn="0" w:oddVBand="0" w:evenVBand="0" w:oddHBand="0" w:evenHBand="0" w:firstRowFirstColumn="0" w:firstRowLastColumn="0" w:lastRowFirstColumn="0" w:lastRowLastColumn="0"/>
-                  <w:rPr>
-                    <w:rFonts w:eastAsia="Times New Roman" w:cs="Segoe UI" w:asciiTheme="minorHAnsi" w:hAnsiTheme="minorHAnsi"/>
-                    <w:b w:val="0"/>
-                    <w:bCs w:val="0"/>
-                    <w:color w:val="242424"/>
-                    <w:sz w:val="22"/>
-                    <w:szCs w:val="22"/>
+                  <w:rPr>
                     <w:lang w:val="en-US" w:eastAsia="en-US"/>
                   </w:rPr>
                 </w:pPr>
                 <w:proofErr w:type="spellStart"/>
                 <w:r>
                   <w:rPr>
-                    <w:rFonts w:eastAsia="Times New Roman" w:cs="Segoe UI" w:asciiTheme="minorHAnsi" w:hAnsiTheme="minorHAnsi"/>
-                    <w:b w:val="0"/>
-                    <w:bCs w:val="0"/>
-                    <w:color w:val="242424"/>
-                    <w:sz w:val="22"/>
-                    <w:szCs w:val="22"/>
                     <w:lang w:val="en-US" w:eastAsia="en-US"/>
                   </w:rPr>
                   <w:t>VATAmount_VATClauseLine</w:t>
@@ -3135,47 +2386,42 @@
         </w:sdt>
       </w:tr>
     </w:tbl>
-    <w:p/>
-    <w:p/>
-    <w:p/>
-    <w:p/>
+    <w:p>
+      <w:pPr>
+        <w:spacing w:after="0" w:line="240" w:lineRule="auto"/>
+      </w:pPr>
+    </w:p>
     <w:tbl>
       <w:tblPr>
-        <w:tblW w:w="10498" w:type="dxa"/>
-        <w:tblCellMar>
-          <w:left w:w="0" w:type="dxa"/>
-          <w:right w:w="0" w:type="dxa"/>
-        </w:tblCellMar>
-        <w:tblLook w:val="0000" w:firstRow="0" w:lastRow="0" w:firstColumn="0" w:lastColumn="0" w:noHBand="0" w:noVBand="0"/>
+        <w:tblStyle w:val="BCBlockTable"/>
+        <w:tblW w:w="5000" w:type="pct"/>
+        <w:tblLook w:val="0620" w:firstRow="1" w:lastRow="0" w:firstColumn="0" w:lastColumn="0" w:noHBand="1" w:noVBand="1"/>
         <w:tblCaption w:val="Notes Block"/>
+        <w:tblDescription w:val="Layout table. Used for positioning, not for tabular data."/>
       </w:tblPr>
       <w:tblGrid>
-        <w:gridCol w:w="10498"/>
+        <w:gridCol w:w="15426"/>
       </w:tblGrid>
       <w:tr>
         <w:trPr>
+          <w:cnfStyle w:val="100000000000" w:firstRow="1" w:lastRow="0" w:firstColumn="0" w:lastColumn="0" w:oddVBand="0" w:evenVBand="0" w:oddHBand="0" w:evenHBand="0" w:firstRowFirstColumn="0" w:firstRowLastColumn="0" w:lastRowFirstColumn="0" w:lastRowLastColumn="0"/>
+          <w:cantSplit/>
           <w:trHeight w:val="389"/>
         </w:trPr>
         <w:tc>
           <w:tcPr>
-            <w:tcW w:w="10485" w:type="dxa"/>
+            <w:tcW w:w="5000" w:type="pct"/>
           </w:tcPr>
           <w:p>
             <w:pPr>
-              <w:spacing w:after="0" w:line="240" w:lineRule="auto"/>
+              <w:pStyle w:val="NoSpacing"/>
               <w:rPr>
-                <w:rFonts w:eastAsia="Segoe UI"/>
-                <w:i/>
-                <w:iCs/>
                 <w:lang w:val="en-US" w:eastAsia="en-US"/>
               </w:rPr>
             </w:pPr>
             <w:sdt>
               <w:sdtPr>
                 <w:rPr>
-                  <w:rFonts w:eastAsia="Segoe UI"/>
-                  <w:i/>
-                  <w:iCs/>
                   <w:lang w:val="en-US" w:eastAsia="en-US"/>
                 </w:rPr>
                 <w:alias w:val="Disclaimer_Lbl"/>
@@ -3184,17 +2430,15 @@
                 <w:placeholder>
                   <w:docPart w:val="DefaultPlaceholder_-1854013440"/>
                 </w:placeholder>
+                <w:dataBinding w:prefixMappings="xmlns:ns0='urn:microsoft-dynamics-nav/reports/Standard_Sales_Invoice/1306/'" w:xpath="/ns0:NavWordReportXmlPart[1]/ns0:Header[1]/ns0:Disclaimer_Lbl[1]" w:storeItemID="{00000000-0000-0000-0000-000000000000}"/>
                 <w15:color w:val="808080"/>
                 <w:text/>
-                <w:dataBinding w:prefixMappings="xmlns:ns0='urn:microsoft-dynamics-nav/reports/Standard_Sales_Invoice/1306/'" w:xpath="/ns0:NavWordReportXmlPart[1]/ns0:Header[1]/ns0:Disclaimer_Lbl[1]"/>
               </w:sdtPr>
+              <w:sdtEndPr/>
               <w:sdtContent>
                 <w:proofErr w:type="spellStart"/>
                 <w:r>
                   <w:rPr>
-                    <w:rFonts w:eastAsia="Segoe UI"/>
-                    <w:i/>
-                    <w:iCs/>
                     <w:lang w:val="en-US" w:eastAsia="en-US"/>
                   </w:rPr>
                   <w:t>Disclaimer_Lbl</w:t>
@@ -3207,20 +2451,16 @@
       </w:tr>
       <w:tr>
         <w:trPr>
+          <w:cantSplit/>
           <w:trHeight w:val="389"/>
         </w:trPr>
         <w:tc>
           <w:tcPr>
-            <w:tcW w:w="10485" w:type="dxa"/>
+            <w:tcW w:w="5000" w:type="pct"/>
           </w:tcPr>
           <w:sdt>
             <w:sdtPr>
               <w:rPr>
-                <w:rFonts w:eastAsia="Segoe UI"/>
-                <w:i/>
-                <w:iCs/>
-                <w:sz w:val="22"/>
-                <w:szCs w:val="28"/>
                 <w:lang w:val="en-US" w:eastAsia="en-US"/>
               </w:rPr>
               <w:alias w:val="PaymentServiceText_Url"/>
@@ -3230,27 +2470,18 @@
               <w15:color w:val="808080"/>
               <w:text/>
             </w:sdtPr>
+            <w:sdtEndPr/>
             <w:sdtContent>
               <w:p>
                 <w:pPr>
-                  <w:spacing w:after="0" w:line="240" w:lineRule="auto"/>
-                  <w:rPr>
-                    <w:rFonts w:eastAsia="Segoe UI"/>
-                    <w:i/>
-                    <w:iCs/>
-                    <w:sz w:val="22"/>
-                    <w:szCs w:val="28"/>
+                  <w:pStyle w:val="NoSpacing"/>
+                  <w:rPr>
                     <w:lang w:val="en-US" w:eastAsia="en-US"/>
                   </w:rPr>
                 </w:pPr>
                 <w:proofErr w:type="spellStart"/>
                 <w:r>
                   <w:rPr>
-                    <w:rFonts w:eastAsia="Segoe UI"/>
-                    <w:i/>
-                    <w:iCs/>
-                    <w:sz w:val="22"/>
-                    <w:szCs w:val="28"/>
                     <w:lang w:val="en-US" w:eastAsia="en-US"/>
                   </w:rPr>
                   <w:t>PaymentServiceText_Url</w:t>
@@ -3263,20 +2494,16 @@
       </w:tr>
       <w:tr>
         <w:trPr>
+          <w:cantSplit/>
           <w:trHeight w:val="389"/>
         </w:trPr>
         <w:tc>
           <w:tcPr>
-            <w:tcW w:w="10485" w:type="dxa"/>
+            <w:tcW w:w="5000" w:type="pct"/>
           </w:tcPr>
           <w:sdt>
             <w:sdtPr>
               <w:rPr>
-                <w:rFonts w:eastAsia="Segoe UI"/>
-                <w:i/>
-                <w:iCs/>
-                <w:sz w:val="22"/>
-                <w:szCs w:val="28"/>
                 <w:lang w:val="da-DK" w:eastAsia="en-US"/>
               </w:rPr>
               <w:alias w:val="WorkDescriptionLine"/>
@@ -3286,32 +2513,21 @@
               <w15:color w:val="808080"/>
               <w:text/>
             </w:sdtPr>
+            <w:sdtEndPr/>
             <w:sdtContent>
               <w:p>
                 <w:pPr>
-                  <w:spacing w:after="0" w:line="240" w:lineRule="auto"/>
-                  <w:rPr>
-                    <w:rFonts w:eastAsia="Segoe UI"/>
-                    <w:i/>
-                    <w:iCs/>
-                    <w:sz w:val="22"/>
-                    <w:szCs w:val="28"/>
+                  <w:pStyle w:val="NoSpacing"/>
+                  <w:rPr>
                     <w:lang w:val="da-DK" w:eastAsia="en-US"/>
                   </w:rPr>
                 </w:pPr>
-                <w:proofErr w:type="spellStart"/>
                 <w:r>
                   <w:rPr>
-                    <w:rFonts w:eastAsia="Segoe UI"/>
-                    <w:i/>
-                    <w:iCs/>
-                    <w:sz w:val="22"/>
-                    <w:szCs w:val="28"/>
                     <w:lang w:val="da-DK" w:eastAsia="en-US"/>
                   </w:rPr>
                   <w:t>WorkDescriptionLine</w:t>
                 </w:r>
-                <w:proofErr w:type="spellEnd"/>
               </w:p>
             </w:sdtContent>
           </w:sdt>
@@ -3329,6 +2545,10 @@
 </w:document>
 </file>
 
+<file path=word/numbering.xml><?xml version="1.0" encoding="utf-8"?>
+<w:numbering xmlns:wpc="http://schemas.microsoft.com/office/word/2010/wordprocessingCanvas" xmlns:cx="http://schemas.microsoft.com/office/drawing/2014/chartex" xmlns:cx1="http://schemas.microsoft.com/office/drawing/2015/9/8/chartex" xmlns:cx2="http://schemas.microsoft.com/office/drawing/2015/10/21/chartex" xmlns:cx3="http://schemas.microsoft.com/office/drawing/2016/5/9/chartex" xmlns:cx4="http://schemas.microsoft.com/office/drawing/2016/5/10/chartex" xmlns:cx5="http://schemas.microsoft.com/office/drawing/2016/5/11/chartex" xmlns:cx6="http://schemas.microsoft.com/office/drawing/2016/5/12/chartex" xmlns:cx7="http://schemas.microsoft.com/office/drawing/2016/5/13/chartex" xmlns:cx8="http://schemas.microsoft.com/office/drawing/2016/5/14/chartex" xmlns:mc="http://schemas.openxmlformats.org/markup-compatibility/2006" xmlns:aink="http://schemas.microsoft.com/office/drawing/2016/ink" xmlns:am3d="http://schemas.microsoft.com/office/drawing/2017/model3d" xmlns:o="urn:schemas-microsoft-com:office:office" xmlns:oel="http://schemas.microsoft.com/office/2019/extlst" xmlns:r="http://schemas.openxmlformats.org/officeDocument/2006/relationships" xmlns:m="http://schemas.openxmlformats.org/officeDocument/2006/math" xmlns:v="urn:schemas-microsoft-com:vml" xmlns:wp14="http://schemas.microsoft.com/office/word/2010/wordprocessingDrawing" xmlns:wp="http://schemas.openxmlformats.org/drawingml/2006/wordprocessingDrawing" xmlns:w10="urn:schemas-microsoft-com:office:word" xmlns:w="http://schemas.openxmlformats.org/wordprocessingml/2006/main" xmlns:w14="http://schemas.microsoft.com/office/word/2010/wordml" xmlns:w15="http://schemas.microsoft.com/office/word/2012/wordml" xmlns:w16cei="http://schemas.microsoft.com/office/word/2026/wordml/cei" xmlns:w16cex="http://schemas.microsoft.com/office/word/2018/wordml/cex" xmlns:w16cid="http://schemas.microsoft.com/office/word/2016/wordml/cid" xmlns:w16="http://schemas.microsoft.com/office/word/2018/wordml" xmlns:w16du="http://schemas.microsoft.com/office/word/2023/wordml/word16du" xmlns:w16sdtdh="http://schemas.microsoft.com/office/word/2020/wordml/sdtdatahash" xmlns:w16sdtfl="http://schemas.microsoft.com/office/word/2024/wordml/sdtformatlock" xmlns:w16se="http://schemas.microsoft.com/office/word/2015/wordml/symex" xmlns:wpg="http://schemas.microsoft.com/office/word/2010/wordprocessingGroup" xmlns:wpi="http://schemas.microsoft.com/office/word/2010/wordprocessingInk" xmlns:wne="http://schemas.microsoft.com/office/word/2006/wordml" xmlns:wps="http://schemas.microsoft.com/office/word/2010/wordprocessingShape" mc:Ignorable="w14 w15 w16se w16cid w16 w16cex w16sdtdh w16sdtfl w16du wp14"/>
+</file>
+
 <file path=word/styles.xml><?xml version="1.0" encoding="utf-8"?>
 <w:styles xmlns:mc="http://schemas.openxmlformats.org/markup-compatibility/2006" xmlns:r="http://schemas.openxmlformats.org/officeDocument/2006/relationships" xmlns:w="http://schemas.openxmlformats.org/wordprocessingml/2006/main" xmlns:w14="http://schemas.microsoft.com/office/word/2010/wordml" xmlns:w15="http://schemas.microsoft.com/office/word/2012/wordml" xmlns:w16cex="http://schemas.microsoft.com/office/word/2018/wordml/cex" xmlns:w16cid="http://schemas.microsoft.com/office/word/2016/wordml/cid" xmlns:w16="http://schemas.microsoft.com/office/word/2018/wordml" xmlns:w16du="http://schemas.microsoft.com/office/word/2023/wordml/word16du" xmlns:w16sdtdh="http://schemas.microsoft.com/office/word/2020/wordml/sdtdatahash" xmlns:w16sdtfl="http://schemas.microsoft.com/office/word/2024/wordml/sdtformatlock" xmlns:w16se="http://schemas.microsoft.com/office/word/2015/wordml/symex" mc:Ignorable="w14 w15 w16se w16cid w16 w16cex w16sdtdh w16sdtfl w16du">
   <w:docDefaults>
@@ -3338,7 +2558,7 @@
         <w:kern w:val="2"/>
         <w:sz w:val="24"/>
         <w:szCs w:val="24"/>
-        <w:lang w:val="en-DK" w:eastAsia="en-DK" w:bidi="ar-SA"/>
+        <w:lang w:bidi="ar-SA"/>
         <w14:ligatures w14:val="standardContextual"/>
       </w:rPr>
     </w:rPrDefault>
@@ -4143,11 +3363,237 @@
       </w:tcPr>
     </w:tblStylePr>
   </w:style>
+  <w:style w:type="paragraph" w:styleId="NoSpacing">
+    <w:name w:val="No Spacing"/>
+    <w:uiPriority w:val="1"/>
+    <w:qFormat/>
+    <w:rsid w:val="00416FC2"/>
+    <w:pPr>
+      <w:spacing w:after="0" w:line="240" w:lineRule="auto"/>
+    </w:pPr>
+    <w:rPr>
+      <w:rFonts w:eastAsiaTheme="minorHAnsi"/>
+      <w:color w:val="000000" w:themeColor="text1"/>
+    </w:rPr>
+  </w:style>
+  <w:style w:type="paragraph" w:customStyle="1" w:styleId="BCNumber">
+    <w:name w:val="BC Number"/>
+    <w:basedOn w:val="NoSpacing"/>
+    <w:next w:val="Normal"/>
+    <w:uiPriority w:val="2"/>
+    <w:qFormat/>
+    <w:rPr>
+      <w14:numSpacing w14:val="tabular"/>
+    </w:rPr>
+  </w:style>
+  <w:style w:type="paragraph" w:customStyle="1" w:styleId="BCLabel">
+    <w:name w:val="BC Label"/>
+    <w:basedOn w:val="NoSpacing"/>
+    <w:next w:val="Normal"/>
+    <w:uiPriority w:val="2"/>
+    <w:qFormat/>
+    <w:pPr>
+      <w:keepNext/>
+    </w:pPr>
+    <w:rPr>
+      <w:rFonts w:asciiTheme="majorHAnsi" w:eastAsiaTheme="majorEastAsia" w:hAnsiTheme="majorHAnsi" w:cstheme="majorBidi"/>
+    </w:rPr>
+  </w:style>
+  <w:style w:type="paragraph" w:customStyle="1" w:styleId="BCLabelNumber">
+    <w:name w:val="BC Label Number"/>
+    <w:basedOn w:val="BCLabel"/>
+    <w:next w:val="Normal"/>
+    <w:uiPriority w:val="2"/>
+    <w:qFormat/>
+    <w:rPr>
+      <w14:numSpacing w14:val="tabular"/>
+    </w:rPr>
+  </w:style>
+  <w:style w:type="table" w:customStyle="1" w:styleId="BCBlockTable">
+    <w:name w:val="BC Block Table"/>
+    <w:basedOn w:val="TableNormal"/>
+    <w:uiPriority w:val="99"/>
+    <w:qFormat/>
+    <w:pPr>
+      <w:spacing w:after="0" w:line="240" w:lineRule="auto"/>
+    </w:pPr>
+    <w:tblPr>
+      <w:tblStyleRowBandSize w:val="1"/>
+      <w:tblStyleColBandSize w:val="1"/>
+      <w:tblCellMar>
+        <w:left w:w="0" w:type="dxa"/>
+        <w:right w:w="0" w:type="dxa"/>
+      </w:tblCellMar>
+    </w:tblPr>
+    <w:tblStylePr w:type="firstRow">
+      <w:rPr>
+        <w:rFonts w:asciiTheme="majorHAnsi" w:hAnsiTheme="majorHAnsi" w:cstheme="majorBidi"/>
+      </w:rPr>
+      <w:tblPr/>
+      <w:tcPr>
+        <w:vAlign w:val="top"/>
+      </w:tcPr>
+    </w:tblStylePr>
+  </w:style>
+  <w:style w:type="table" w:customStyle="1" w:styleId="BCDataTable">
+    <w:name w:val="BC Data Table"/>
+    <w:basedOn w:val="TableNormal"/>
+    <w:uiPriority w:val="99"/>
+    <w:qFormat/>
+    <w:pPr>
+      <w:spacing w:after="0" w:line="240" w:lineRule="auto"/>
+    </w:pPr>
+    <w:tblPr>
+      <w:tblStyleRowBandSize w:val="1"/>
+      <w:tblStyleColBandSize w:val="1"/>
+      <w:tblCellMar>
+        <w:left w:w="115" w:type="dxa"/>
+        <w:right w:w="115" w:type="dxa"/>
+      </w:tblCellMar>
+    </w:tblPr>
+    <w:tcPr>
+      <w:vAlign w:val="center"/>
+    </w:tcPr>
+    <w:tblStylePr w:type="firstRow">
+      <w:pPr>
+        <w:spacing w:before="160" w:after="80"/>
+      </w:pPr>
+      <w:rPr>
+        <w:rFonts w:asciiTheme="majorHAnsi" w:hAnsiTheme="majorHAnsi" w:cstheme="majorBidi"/>
+      </w:rPr>
+      <w:tblPr/>
+      <w:tcPr>
+        <w:tcBorders>
+          <w:bottom w:val="single" w:sz="4" w:space="0" w:color="000000" w:themeColor="text1"/>
+        </w:tcBorders>
+        <w:vAlign w:val="top"/>
+      </w:tcPr>
+    </w:tblStylePr>
+    <w:tblStylePr w:type="lastRow">
+      <w:tblPr/>
+      <w:tcPr>
+        <w:tcBorders>
+          <w:bottom w:val="single" w:sz="4" w:space="0" w:color="E8E8E8" w:themeColor="background2"/>
+        </w:tcBorders>
+      </w:tcPr>
+    </w:tblStylePr>
+    <w:tblStylePr w:type="band1Horz">
+      <w:tblPr/>
+      <w:tcPr>
+        <w:shd w:val="clear" w:color="auto" w:fill="auto"/>
+      </w:tcPr>
+    </w:tblStylePr>
+    <w:tblStylePr w:type="band2Horz">
+      <w:tblPr/>
+      <w:tcPr>
+        <w:shd w:val="clear" w:color="auto" w:fill="FAE2D5" w:themeFill="accent2" w:themeFillTint="33"/>
+      </w:tcPr>
+    </w:tblStylePr>
+  </w:style>
+  <w:style w:type="table" w:customStyle="1" w:styleId="BCTotalsTable">
+    <w:name w:val="BC Totals Table"/>
+    <w:basedOn w:val="TableNormal"/>
+    <w:uiPriority w:val="99"/>
+    <w:qFormat/>
+    <w:pPr>
+      <w:spacing w:after="0" w:line="240" w:lineRule="auto"/>
+    </w:pPr>
+    <w:tblPr>
+      <w:tblStyleRowBandSize w:val="1"/>
+      <w:tblStyleColBandSize w:val="1"/>
+      <w:tblCellMar>
+        <w:left w:w="115" w:type="dxa"/>
+        <w:right w:w="115" w:type="dxa"/>
+      </w:tblCellMar>
+    </w:tblPr>
+    <w:tcPr>
+      <w:vAlign w:val="center"/>
+    </w:tcPr>
+    <w:tblStylePr w:type="lastRow">
+      <w:rPr>
+        <w:rFonts w:asciiTheme="majorHAnsi" w:hAnsiTheme="majorHAnsi" w:cstheme="majorBidi"/>
+      </w:rPr>
+      <w:tblPr/>
+      <w:tcPr>
+        <w:tcBorders>
+          <w:top w:val="single" w:sz="4" w:space="0" w:color="000000" w:themeColor="text1"/>
+          <w:bottom w:val="single" w:sz="8" w:space="0" w:color="000000" w:themeColor="text1"/>
+        </w:tcBorders>
+      </w:tcPr>
+    </w:tblStylePr>
+  </w:style>
+  <w:style w:type="table" w:customStyle="1" w:styleId="BCCalculationTable">
+    <w:name w:val="BC Calculation Table"/>
+    <w:basedOn w:val="TableNormal"/>
+    <w:uiPriority w:val="99"/>
+    <w:qFormat/>
+    <w:pPr>
+      <w:spacing w:after="0" w:line="240" w:lineRule="auto"/>
+    </w:pPr>
+    <w:tblPr>
+      <w:tblStyleRowBandSize w:val="1"/>
+      <w:tblStyleColBandSize w:val="1"/>
+      <w:tblCellMar>
+        <w:top w:w="58" w:type="dxa"/>
+        <w:left w:w="0" w:type="dxa"/>
+        <w:bottom w:w="58" w:type="dxa"/>
+        <w:right w:w="0" w:type="dxa"/>
+      </w:tblCellMar>
+    </w:tblPr>
+    <w:tcPr>
+      <w:vAlign w:val="center"/>
+    </w:tcPr>
+    <w:tblStylePr w:type="firstRow">
+      <w:rPr>
+        <w:rFonts w:asciiTheme="majorHAnsi" w:hAnsiTheme="majorHAnsi" w:cstheme="majorBidi"/>
+      </w:rPr>
+      <w:tblPr/>
+      <w:tcPr>
+        <w:vAlign w:val="bottom"/>
+      </w:tcPr>
+    </w:tblStylePr>
+    <w:tblStylePr w:type="lastRow">
+      <w:rPr>
+        <w:rFonts w:asciiTheme="majorHAnsi" w:hAnsiTheme="majorHAnsi" w:cstheme="majorBidi"/>
+      </w:rPr>
+      <w:tblPr/>
+      <w:tcPr>
+        <w:tcBorders>
+          <w:top w:val="single" w:sz="4" w:space="0" w:color="000000" w:themeColor="text1"/>
+        </w:tcBorders>
+      </w:tcPr>
+    </w:tblStylePr>
+  </w:style>
+  <w:style w:type="table" w:customStyle="1" w:styleId="BCSignatureTable">
+    <w:name w:val="BC Signature Table"/>
+    <w:basedOn w:val="TableNormal"/>
+    <w:uiPriority w:val="99"/>
+    <w:qFormat/>
+    <w:pPr>
+      <w:spacing w:after="0" w:line="240" w:lineRule="auto"/>
+    </w:pPr>
+    <w:tblPr>
+      <w:tblStyleRowBandSize w:val="1"/>
+      <w:tblStyleColBandSize w:val="1"/>
+      <w:tblCellMar>
+        <w:left w:w="0" w:type="dxa"/>
+        <w:right w:w="0" w:type="dxa"/>
+      </w:tblCellMar>
+    </w:tblPr>
+    <w:tblStylePr w:type="lastRow">
+      <w:tblPr/>
+      <w:tcPr>
+        <w:tcBorders>
+          <w:bottom w:val="single" w:sz="4" w:space="0" w:color="000000" w:themeColor="text1"/>
+        </w:tcBorders>
+      </w:tcPr>
+    </w:tblStylePr>
+  </w:style>
 </w:styles>
 </file>
 
 <file path=word/glossary/document.xml><?xml version="1.0" encoding="utf-8"?>
-<w:glossaryDocument xmlns:wpc="http://schemas.microsoft.com/office/word/2010/wordprocessingCanvas" xmlns:cx="http://schemas.microsoft.com/office/drawing/2014/chartex" xmlns:cx1="http://schemas.microsoft.com/office/drawing/2015/9/8/chartex" xmlns:cx2="http://schemas.microsoft.com/office/drawing/2015/10/21/chartex" xmlns:cx3="http://schemas.microsoft.com/office/drawing/2016/5/9/chartex" xmlns:cx4="http://schemas.microsoft.com/office/drawing/2016/5/10/chartex" xmlns:cx5="http://schemas.microsoft.com/office/drawing/2016/5/11/chartex" xmlns:cx6="http://schemas.microsoft.com/office/drawing/2016/5/12/chartex" xmlns:cx7="http://schemas.microsoft.com/office/drawing/2016/5/13/chartex" xmlns:cx8="http://schemas.microsoft.com/office/drawing/2016/5/14/chartex" xmlns:mc="http://schemas.openxmlformats.org/markup-compatibility/2006" xmlns:aink="http://schemas.microsoft.com/office/drawing/2016/ink" xmlns:am3d="http://schemas.microsoft.com/office/drawing/2017/model3d" xmlns:o="urn:schemas-microsoft-com:office:office" xmlns:oel="http://schemas.microsoft.com/office/2019/extlst" xmlns:r="http://schemas.openxmlformats.org/officeDocument/2006/relationships" xmlns:m="http://schemas.openxmlformats.org/officeDocument/2006/math" xmlns:v="urn:schemas-microsoft-com:vml" xmlns:wp14="http://schemas.microsoft.com/office/word/2010/wordprocessingDrawing" xmlns:wp="http://schemas.openxmlformats.org/drawingml/2006/wordprocessingDrawing" xmlns:w10="urn:schemas-microsoft-com:office:word" xmlns:w="http://schemas.openxmlformats.org/wordprocessingml/2006/main" xmlns:w14="http://schemas.microsoft.com/office/word/2010/wordml" xmlns:w15="http://schemas.microsoft.com/office/word/2012/wordml" xmlns:w16cex="http://schemas.microsoft.com/office/word/2018/wordml/cex" xmlns:w16cid="http://schemas.microsoft.com/office/word/2016/wordml/cid" xmlns:w16="http://schemas.microsoft.com/office/word/2018/wordml" xmlns:w16du="http://schemas.microsoft.com/office/word/2023/wordml/word16du" xmlns:w16sdtdh="http://schemas.microsoft.com/office/word/2020/wordml/sdtdatahash" xmlns:w16sdtfl="http://schemas.microsoft.com/office/word/2024/wordml/sdtformatlock" xmlns:w16se="http://schemas.microsoft.com/office/word/2015/wordml/symex" xmlns:wpg="http://schemas.microsoft.com/office/word/2010/wordprocessingGroup" xmlns:wpi="http://schemas.microsoft.com/office/word/2010/wordprocessingInk" xmlns:wne="http://schemas.microsoft.com/office/word/2006/wordml" xmlns:wps="http://schemas.microsoft.com/office/word/2010/wordprocessingShape" mc:Ignorable="w14 w15 w16se w16cid w16 w16cex w16sdtdh w16sdtfl w16du wp14">
+<w:glossaryDocument xmlns:wpc="http://schemas.microsoft.com/office/word/2010/wordprocessingCanvas" xmlns:cx="http://schemas.microsoft.com/office/drawing/2014/chartex" xmlns:cx1="http://schemas.microsoft.com/office/drawing/2015/9/8/chartex" xmlns:cx2="http://schemas.microsoft.com/office/drawing/2015/10/21/chartex" xmlns:cx3="http://schemas.microsoft.com/office/drawing/2016/5/9/chartex" xmlns:cx4="http://schemas.microsoft.com/office/drawing/2016/5/10/chartex" xmlns:cx5="http://schemas.microsoft.com/office/drawing/2016/5/11/chartex" xmlns:cx6="http://schemas.microsoft.com/office/drawing/2016/5/12/chartex" xmlns:cx7="http://schemas.microsoft.com/office/drawing/2016/5/13/chartex" xmlns:cx8="http://schemas.microsoft.com/office/drawing/2016/5/14/chartex" xmlns:mc="http://schemas.openxmlformats.org/markup-compatibility/2006" xmlns:aink="http://schemas.microsoft.com/office/drawing/2016/ink" xmlns:am3d="http://schemas.microsoft.com/office/drawing/2017/model3d" xmlns:o="urn:schemas-microsoft-com:office:office" xmlns:oel="http://schemas.microsoft.com/office/2019/extlst" xmlns:r="http://schemas.openxmlformats.org/officeDocument/2006/relationships" xmlns:m="http://schemas.openxmlformats.org/officeDocument/2006/math" xmlns:v="urn:schemas-microsoft-com:vml" xmlns:wp14="http://schemas.microsoft.com/office/word/2010/wordprocessingDrawing" xmlns:wp="http://schemas.openxmlformats.org/drawingml/2006/wordprocessingDrawing" xmlns:w10="urn:schemas-microsoft-com:office:word" xmlns:w="http://schemas.openxmlformats.org/wordprocessingml/2006/main" xmlns:w14="http://schemas.microsoft.com/office/word/2010/wordml" xmlns:w15="http://schemas.microsoft.com/office/word/2012/wordml" xmlns:w16cei="http://schemas.microsoft.com/office/word/2026/wordml/cei" xmlns:w16cex="http://schemas.microsoft.com/office/word/2018/wordml/cex" xmlns:w16cid="http://schemas.microsoft.com/office/word/2016/wordml/cid" xmlns:w16="http://schemas.microsoft.com/office/word/2018/wordml" xmlns:w16du="http://schemas.microsoft.com/office/word/2023/wordml/word16du" xmlns:w16sdtdh="http://schemas.microsoft.com/office/word/2020/wordml/sdtdatahash" xmlns:w16sdtfl="http://schemas.microsoft.com/office/word/2024/wordml/sdtformatlock" xmlns:w16se="http://schemas.microsoft.com/office/word/2015/wordml/symex" xmlns:wpg="http://schemas.microsoft.com/office/word/2010/wordprocessingGroup" xmlns:wpi="http://schemas.microsoft.com/office/word/2010/wordprocessingInk" xmlns:wne="http://schemas.microsoft.com/office/word/2006/wordml" xmlns:wps="http://schemas.microsoft.com/office/word/2010/wordprocessingShape" mc:Ignorable="w14 w15 w16se w16cid w16 w16cex w16sdtdh w16sdtfl w16du wp14">
   <w:docParts>
     <w:docPart>
       <w:docPartPr>
@@ -4291,6 +3737,64 @@
         </w:p>
       </w:docPartBody>
     </w:docPart>
+    <w:docPart>
+      <w:docPartPr>
+        <w:name w:val="0F9F082E92834850BE77CFF71C86F39C"/>
+        <w:category>
+          <w:name w:val="General"/>
+          <w:gallery w:val="placeholder"/>
+        </w:category>
+        <w:types>
+          <w:type w:val="bbPlcHdr"/>
+        </w:types>
+        <w:behaviors>
+          <w:behavior w:val="content"/>
+        </w:behaviors>
+        <w:guid w:val="{AC7ABE72-9F73-45F2-AE67-F4BD4AC91446}"/>
+      </w:docPartPr>
+      <w:docPartBody>
+        <w:p>
+          <w:pPr>
+            <w:pStyle w:val="0F9F082E92834850BE77CFF71C86F39C"/>
+          </w:pPr>
+          <w:r>
+            <w:rPr>
+              <w:rStyle w:val="PlaceholderText"/>
+            </w:rPr>
+            <w:t>Click or tap here to enter text.</w:t>
+          </w:r>
+        </w:p>
+      </w:docPartBody>
+    </w:docPart>
+    <w:docPart>
+      <w:docPartPr>
+        <w:name w:val="D4CDF6197D5843518AA06D0C5FE471FE"/>
+        <w:category>
+          <w:name w:val="General"/>
+          <w:gallery w:val="placeholder"/>
+        </w:category>
+        <w:types>
+          <w:type w:val="bbPlcHdr"/>
+        </w:types>
+        <w:behaviors>
+          <w:behavior w:val="content"/>
+        </w:behaviors>
+        <w:guid w:val="{65EDA60C-1849-40EC-9289-570312E9702D}"/>
+      </w:docPartPr>
+      <w:docPartBody>
+        <w:p>
+          <w:pPr>
+            <w:pStyle w:val="D4CDF6197D5843518AA06D0C5FE471FE"/>
+          </w:pPr>
+          <w:r>
+            <w:rPr>
+              <w:rStyle w:val="PlaceholderText"/>
+            </w:rPr>
+            <w:t>Click or tap here to enter text.</w:t>
+          </w:r>
+        </w:p>
+      </w:docPartBody>
+    </w:docPart>
   </w:docParts>
 </w:glossaryDocument>
 </file>
@@ -4298,7 +3802,6 @@
 <file path=word/glossary/fontTable.xml><?xml version="1.0" encoding="utf-8"?>
 <w:fonts xmlns:mc="http://schemas.openxmlformats.org/markup-compatibility/2006" xmlns:r="http://schemas.openxmlformats.org/officeDocument/2006/relationships" xmlns:w="http://schemas.openxmlformats.org/wordprocessingml/2006/main" xmlns:w14="http://schemas.microsoft.com/office/word/2010/wordml" xmlns:w15="http://schemas.microsoft.com/office/word/2012/wordml" xmlns:w16cex="http://schemas.microsoft.com/office/word/2018/wordml/cex" xmlns:w16cid="http://schemas.microsoft.com/office/word/2016/wordml/cid" xmlns:w16="http://schemas.microsoft.com/office/word/2018/wordml" xmlns:w16du="http://schemas.microsoft.com/office/word/2023/wordml/word16du" xmlns:w16sdtdh="http://schemas.microsoft.com/office/word/2020/wordml/sdtdatahash" xmlns:w16sdtfl="http://schemas.microsoft.com/office/word/2024/wordml/sdtformatlock" xmlns:w16se="http://schemas.microsoft.com/office/word/2015/wordml/symex" mc:Ignorable="w14 w15 w16se w16cid w16 w16cex w16sdtdh w16sdtfl w16du">
   <w:font w:name="Aptos">
-    <w:panose1 w:val="020B0004020202020204"/>
     <w:charset w:val="00"/>
     <w:family w:val="swiss"/>
     <w:pitch w:val="variable"/>
@@ -4312,7 +3815,6 @@
     <w:sig w:usb0="E0002EFF" w:usb1="C000785B" w:usb2="00000009" w:usb3="00000000" w:csb0="000001FF" w:csb1="00000000"/>
   </w:font>
   <w:font w:name="Aptos Display">
-    <w:panose1 w:val="020B0004020202020204"/>
     <w:charset w:val="00"/>
     <w:family w:val="swiss"/>
     <w:pitch w:val="variable"/>
@@ -4331,13 +3833,6 @@
     <w:family w:val="swiss"/>
     <w:pitch w:val="variable"/>
     <w:sig w:usb0="E4002EFF" w:usb1="C000E47F" w:usb2="00000009" w:usb3="00000000" w:csb0="000001FF" w:csb1="00000000"/>
-  </w:font>
-  <w:font w:name="Arial">
-    <w:panose1 w:val="020B0604020202020204"/>
-    <w:charset w:val="00"/>
-    <w:family w:val="swiss"/>
-    <w:pitch w:val="variable"/>
-    <w:sig w:usb0="E0002EFF" w:usb1="C000785B" w:usb2="00000009" w:usb3="00000000" w:csb0="000001FF" w:csb1="00000000"/>
   </w:font>
 </w:fonts>
 </file>
@@ -4359,8 +3854,14 @@
   <w:rsids>
     <w:rsidRoot w:val="00042826"/>
     <w:rsid w:val="00042826"/>
+    <w:rsid w:val="002D66E6"/>
+    <w:rsid w:val="0038055C"/>
+    <w:rsid w:val="0050085B"/>
+    <w:rsid w:val="008E7FCD"/>
+    <w:rsid w:val="00AC45DF"/>
     <w:rsid w:val="00AD2F0E"/>
     <w:rsid w:val="00CE2DFA"/>
+    <w:rsid w:val="00E5711F"/>
   </w:rsids>
   <m:mathPr>
     <m:mathFont m:val="Cambria Math"/>
@@ -4375,7 +3876,7 @@
     <m:intLim m:val="subSup"/>
     <m:naryLim m:val="undOvr"/>
   </m:mathPr>
-  <w:themeFontLang w:val="en-DK"/>
+  <w:themeFontLang/>
   <w:clrSchemeMapping w:bg1="light1" w:t1="dark1" w:bg2="light2" w:t2="dark2" w:accent1="accent1" w:accent2="accent2" w:accent3="accent3" w:accent4="accent4" w:accent5="accent5" w:accent6="accent6" w:hyperlink="hyperlink" w:followedHyperlink="followedHyperlink"/>
   <w:decimalSymbol w:val="."/>
   <w:listSeparator w:val=","/>
@@ -4392,7 +3893,7 @@
         <w:kern w:val="2"/>
         <w:sz w:val="24"/>
         <w:szCs w:val="24"/>
-        <w:lang w:val="en-DK" w:eastAsia="en-DK" w:bidi="ar-SA"/>
+        <w:lang w:bidi="ar-SA"/>
         <w14:ligatures w14:val="standardContextual"/>
       </w:rPr>
     </w:rPrDefault>
@@ -4816,7 +4317,7 @@
     <w:basedOn w:val="DefaultParagraphFont"/>
     <w:uiPriority w:val="99"/>
     <w:semiHidden/>
-    <w:rsid w:val="00042826"/>
+    <w:rsid w:val="0038055C"/>
     <w:rPr>
       <w:color w:val="666666"/>
     </w:rPr>
@@ -4836,6 +4337,14 @@
   <w:style w:type="paragraph" w:customStyle="1" w:styleId="0013D710346D46BE89D6EE8549FF096A">
     <w:name w:val="0013D710346D46BE89D6EE8549FF096A"/>
     <w:rsid w:val="00042826"/>
+  </w:style>
+  <w:style w:type="paragraph" w:customStyle="1" w:styleId="0F9F082E92834850BE77CFF71C86F39C">
+    <w:name w:val="0F9F082E92834850BE77CFF71C86F39C"/>
+    <w:rsid w:val="0038055C"/>
+  </w:style>
+  <w:style w:type="paragraph" w:customStyle="1" w:styleId="D4CDF6197D5843518AA06D0C5FE471FE">
+    <w:name w:val="D4CDF6197D5843518AA06D0C5FE471FE"/>
+    <w:rsid w:val="0038055C"/>
   </w:style>
 </w:styles>
 </file>
@@ -5164,7 +4673,7 @@
 
 <file path=word/webextensions/taskpanes.xml><?xml version="1.0" encoding="utf-8"?>
 <wetp:taskpanes xmlns:wetp="http://schemas.microsoft.com/office/webextensions/taskpanes/2010/11">
-  <wetp:taskpane dockstate="right" visibility="0" width="554" row="7">
+  <wetp:taskpane dockstate="right" visibility="0" width="350" row="1">
     <wetp:webextensionref xmlns:r="http://schemas.openxmlformats.org/officeDocument/2006/relationships" r:id="rId1"/>
   </wetp:taskpane>
 </wetp:taskpanes>
@@ -6676,4 +6185,10 @@
     <ds:schemaRef ds:uri="urn:microsoft-dynamics-businesscentral/internal/extended/reports/Standard_Sales_Invoice/1306/"/>
   </ds:schemaRefs>
 </ds:datastoreItem>
+</file>
+
+<file path=docMetadata/LabelInfo.xml><?xml version="1.0" encoding="utf-8"?>
+<clbl:labelList xmlns:clbl="http://schemas.microsoft.com/office/2020/mipLabelMetadata">
+  <clbl:label id="{f42aa342-8706-4288-bd11-ebb85995028c}" enabled="1" method="Standard" siteId="{72f988bf-86f1-41af-91ab-2d7cd011db47}" removed="0"/>
+</clbl:labelList>
 </file>
</xml_diff>